<commit_message>
add user tests 13 passing, update docs and README
</commit_message>
<xml_diff>
--- a/test_plan_phase1.docx
+++ b/test_plan_phase1.docx
@@ -103,8 +103,8 @@
         <w:gridCol w:w="2494"/>
         <w:gridCol w:w="567"/>
         <w:gridCol w:w="1474"/>
-        <w:gridCol w:w="1075"/>
-        <w:gridCol w:w="3460"/>
+        <w:gridCol w:w="907"/>
+        <w:gridCol w:w="3628"/>
       </w:tblGrid>
       <w:tr>
         <w:trPr>
@@ -178,7 +178,7 @@
         </w:tc>
         <w:tc>
           <w:tcPr>
-            <w:tcW w:w="1075" w:type="dxa"/>
+            <w:tcW w:w="907" w:type="dxa"/>
           </w:tcPr>
           <w:p>
             <w:pPr>
@@ -200,7 +200,7 @@
         </w:tc>
         <w:tc>
           <w:tcPr>
-            <w:tcW w:w="3460" w:type="dxa"/>
+            <w:tcW w:w="3628" w:type="dxa"/>
           </w:tcPr>
           <w:p>
             <w:pPr>
@@ -265,7 +265,7 @@
                 <w:sz w:val="24"/>
                 <w:noProof/>
               </w:rPr>
-              <w:t>10</w:t>
+              <w:t>12</w:t>
             </w:r>
           </w:p>
         </w:tc>
@@ -287,13 +287,13 @@
                 <w:sz w:val="24"/>
                 <w:noProof/>
               </w:rPr>
-              <w:t>1.1 - 1.10</w:t>
-            </w:r>
-          </w:p>
-        </w:tc>
-        <w:tc>
-          <w:tcPr>
-            <w:tcW w:w="1075" w:type="dxa"/>
+              <w:t>TC-1.1 - TC-1.12</w:t>
+            </w:r>
+          </w:p>
+        </w:tc>
+        <w:tc>
+          <w:tcPr>
+            <w:tcW w:w="907" w:type="dxa"/>
           </w:tcPr>
           <w:p>
             <w:pPr>
@@ -315,23 +315,23 @@
         </w:tc>
         <w:tc>
           <w:tcPr>
-            <w:tcW w:w="3460" w:type="dxa"/>
-          </w:tcPr>
-          <w:p>
-            <w:pPr>
-              <w:spacing w:before="0" w:after="0" w:line="240" w:lineRule="auto"/>
-              <w:ind w:left="0" w:firstLine="0"/>
-              <w:suppressAutoHyphens/>
-            </w:pPr>
-            <w:r>
-              <w:rPr>
-                <w:rFonts w:ascii="Calibri" w:hAnsi="Calibri"/>
-                <w:b w:val="0"/>
-                <w:i w:val="0"/>
-                <w:sz w:val="24"/>
-                <w:noProof/>
-              </w:rPr>
-              <w:t>Unique constraints, RBAC, 42 CFR Part 2, State machine, Optimistic locking</w:t>
+            <w:tcW w:w="3628" w:type="dxa"/>
+          </w:tcPr>
+          <w:p>
+            <w:pPr>
+              <w:spacing w:before="0" w:after="0" w:line="240" w:lineRule="auto"/>
+              <w:ind w:left="0" w:firstLine="0"/>
+              <w:suppressAutoHyphens/>
+            </w:pPr>
+            <w:r>
+              <w:rPr>
+                <w:rFonts w:ascii="Calibri" w:hAnsi="Calibri"/>
+                <w:b w:val="0"/>
+                <w:i w:val="0"/>
+                <w:sz w:val="24"/>
+                <w:noProof/>
+              </w:rPr>
+              <w:t>Unique constraints, RBAC, 42 CFR Part 2, State machine, Soft delete, Mandatory fields</w:t>
             </w:r>
           </w:p>
         </w:tc>
@@ -380,7 +380,7 @@
                 <w:sz w:val="24"/>
                 <w:noProof/>
               </w:rPr>
-              <w:t>12</w:t>
+              <w:t>13</w:t>
             </w:r>
           </w:p>
         </w:tc>
@@ -402,51 +402,51 @@
                 <w:sz w:val="24"/>
                 <w:noProof/>
               </w:rPr>
-              <w:t>2.1 - 2.12</w:t>
-            </w:r>
-          </w:p>
-        </w:tc>
-        <w:tc>
-          <w:tcPr>
-            <w:tcW w:w="1075" w:type="dxa"/>
-          </w:tcPr>
-          <w:p>
-            <w:pPr>
-              <w:spacing w:before="0" w:after="0" w:line="240" w:lineRule="auto"/>
-              <w:ind w:left="0" w:firstLine="0"/>
-              <w:suppressAutoHyphens/>
-            </w:pPr>
-            <w:r>
-              <w:rPr>
-                <w:rFonts w:ascii="Calibri" w:hAnsi="Calibri"/>
-                <w:b w:val="0"/>
-                <w:i w:val="0"/>
-                <w:sz w:val="24"/>
-                <w:noProof/>
-              </w:rPr>
-              <w:t>API, DB, Business Rules</w:t>
-            </w:r>
-          </w:p>
-        </w:tc>
-        <w:tc>
-          <w:tcPr>
-            <w:tcW w:w="3460" w:type="dxa"/>
-          </w:tcPr>
-          <w:p>
-            <w:pPr>
-              <w:spacing w:before="0" w:after="0" w:line="240" w:lineRule="auto"/>
-              <w:ind w:left="0" w:firstLine="0"/>
-              <w:suppressAutoHyphens/>
-            </w:pPr>
-            <w:r>
-              <w:rPr>
-                <w:rFonts w:ascii="Calibri" w:hAnsi="Calibri"/>
-                <w:b w:val="0"/>
-                <w:i w:val="0"/>
-                <w:sz w:val="24"/>
-                <w:noProof/>
-              </w:rPr>
-              <w:t>Unique constraints, RBAC, State machine, Optimistic locking</w:t>
+              <w:t>TC-2.1 - TC-2.13</w:t>
+            </w:r>
+          </w:p>
+        </w:tc>
+        <w:tc>
+          <w:tcPr>
+            <w:tcW w:w="907" w:type="dxa"/>
+          </w:tcPr>
+          <w:p>
+            <w:pPr>
+              <w:spacing w:before="0" w:after="0" w:line="240" w:lineRule="auto"/>
+              <w:ind w:left="0" w:firstLine="0"/>
+              <w:suppressAutoHyphens/>
+            </w:pPr>
+            <w:r>
+              <w:rPr>
+                <w:rFonts w:ascii="Calibri" w:hAnsi="Calibri"/>
+                <w:b w:val="0"/>
+                <w:i w:val="0"/>
+                <w:sz w:val="24"/>
+                <w:noProof/>
+              </w:rPr>
+              <w:t>API, Business Rules</w:t>
+            </w:r>
+          </w:p>
+        </w:tc>
+        <w:tc>
+          <w:tcPr>
+            <w:tcW w:w="3628" w:type="dxa"/>
+          </w:tcPr>
+          <w:p>
+            <w:pPr>
+              <w:spacing w:before="0" w:after="0" w:line="240" w:lineRule="auto"/>
+              <w:ind w:left="0" w:firstLine="0"/>
+              <w:suppressAutoHyphens/>
+            </w:pPr>
+            <w:r>
+              <w:rPr>
+                <w:rFonts w:ascii="Calibri" w:hAnsi="Calibri"/>
+                <w:b w:val="0"/>
+                <w:i w:val="0"/>
+                <w:sz w:val="24"/>
+                <w:noProof/>
+              </w:rPr>
+              <w:t>Unique constraints, RBAC, Auth, Account lockout, State machine, Audit log, Mandatory fields</w:t>
             </w:r>
           </w:p>
         </w:tc>
@@ -523,7 +523,7 @@
         </w:tc>
         <w:tc>
           <w:tcPr>
-            <w:tcW w:w="1075" w:type="dxa"/>
+            <w:tcW w:w="907" w:type="dxa"/>
           </w:tcPr>
           <w:p>
             <w:pPr>
@@ -545,7 +545,7 @@
         </w:tc>
         <w:tc>
           <w:tcPr>
-            <w:tcW w:w="3460" w:type="dxa"/>
+            <w:tcW w:w="3628" w:type="dxa"/>
           </w:tcPr>
           <w:p>
             <w:pPr>
@@ -638,7 +638,7 @@
         </w:tc>
         <w:tc>
           <w:tcPr>
-            <w:tcW w:w="1075" w:type="dxa"/>
+            <w:tcW w:w="907" w:type="dxa"/>
           </w:tcPr>
           <w:p>
             <w:pPr>
@@ -660,7 +660,7 @@
         </w:tc>
         <w:tc>
           <w:tcPr>
-            <w:tcW w:w="3460" w:type="dxa"/>
+            <w:tcW w:w="3628" w:type="dxa"/>
           </w:tcPr>
           <w:p>
             <w:pPr>
@@ -753,7 +753,7 @@
         </w:tc>
         <w:tc>
           <w:tcPr>
-            <w:tcW w:w="1075" w:type="dxa"/>
+            <w:tcW w:w="907" w:type="dxa"/>
           </w:tcPr>
           <w:p>
             <w:pPr>
@@ -775,7 +775,7 @@
         </w:tc>
         <w:tc>
           <w:tcPr>
-            <w:tcW w:w="3460" w:type="dxa"/>
+            <w:tcW w:w="3628" w:type="dxa"/>
           </w:tcPr>
           <w:p>
             <w:pPr>
@@ -868,7 +868,7 @@
         </w:tc>
         <w:tc>
           <w:tcPr>
-            <w:tcW w:w="1075" w:type="dxa"/>
+            <w:tcW w:w="907" w:type="dxa"/>
           </w:tcPr>
           <w:p>
             <w:pPr>
@@ -890,7 +890,7 @@
         </w:tc>
         <w:tc>
           <w:tcPr>
-            <w:tcW w:w="3460" w:type="dxa"/>
+            <w:tcW w:w="3628" w:type="dxa"/>
           </w:tcPr>
           <w:p>
             <w:pPr>
@@ -983,7 +983,7 @@
         </w:tc>
         <w:tc>
           <w:tcPr>
-            <w:tcW w:w="1075" w:type="dxa"/>
+            <w:tcW w:w="907" w:type="dxa"/>
           </w:tcPr>
           <w:p>
             <w:pPr>
@@ -1005,7 +1005,7 @@
         </w:tc>
         <w:tc>
           <w:tcPr>
-            <w:tcW w:w="3460" w:type="dxa"/>
+            <w:tcW w:w="3628" w:type="dxa"/>
           </w:tcPr>
           <w:p>
             <w:pPr>
@@ -1098,7 +1098,7 @@
         </w:tc>
         <w:tc>
           <w:tcPr>
-            <w:tcW w:w="1075" w:type="dxa"/>
+            <w:tcW w:w="907" w:type="dxa"/>
           </w:tcPr>
           <w:p>
             <w:pPr>
@@ -1120,7 +1120,7 @@
         </w:tc>
         <w:tc>
           <w:tcPr>
-            <w:tcW w:w="3460" w:type="dxa"/>
+            <w:tcW w:w="3628" w:type="dxa"/>
           </w:tcPr>
           <w:p>
             <w:pPr>
@@ -1213,7 +1213,7 @@
         </w:tc>
         <w:tc>
           <w:tcPr>
-            <w:tcW w:w="1075" w:type="dxa"/>
+            <w:tcW w:w="907" w:type="dxa"/>
           </w:tcPr>
           <w:p>
             <w:pPr>
@@ -1235,7 +1235,7 @@
         </w:tc>
         <w:tc>
           <w:tcPr>
-            <w:tcW w:w="3460" w:type="dxa"/>
+            <w:tcW w:w="3628" w:type="dxa"/>
           </w:tcPr>
           <w:p>
             <w:pPr>
@@ -1328,7 +1328,7 @@
         </w:tc>
         <w:tc>
           <w:tcPr>
-            <w:tcW w:w="1075" w:type="dxa"/>
+            <w:tcW w:w="907" w:type="dxa"/>
           </w:tcPr>
           <w:p>
             <w:pPr>
@@ -1350,7 +1350,7 @@
         </w:tc>
         <w:tc>
           <w:tcPr>
-            <w:tcW w:w="3460" w:type="dxa"/>
+            <w:tcW w:w="3628" w:type="dxa"/>
           </w:tcPr>
           <w:p>
             <w:pPr>
@@ -1415,7 +1415,7 @@
                 <w:sz w:val="24"/>
                 <w:noProof/>
               </w:rPr>
-              <w:t>90</w:t>
+              <w:t>93</w:t>
             </w:r>
           </w:p>
         </w:tc>
@@ -1437,25 +1437,25 @@
                 <w:sz w:val="24"/>
                 <w:noProof/>
               </w:rPr>
-              <w:t>57 entity REQ_IDs</w:t>
-            </w:r>
-          </w:p>
-        </w:tc>
-        <w:tc>
-          <w:tcPr>
-            <w:tcW w:w="1075" w:type="dxa"/>
-          </w:tcPr>
-          <w:p>
-            <w:pPr>
-              <w:spacing w:before="0" w:after="0" w:line="240" w:lineRule="auto"/>
-              <w:ind w:left="0" w:firstLine="0"/>
-              <w:suppressAutoHyphens/>
-            </w:pPr>
-          </w:p>
-        </w:tc>
-        <w:tc>
-          <w:tcPr>
-            <w:tcW w:w="3460" w:type="dxa"/>
+              <w:t>60 entity TCs</w:t>
+            </w:r>
+          </w:p>
+        </w:tc>
+        <w:tc>
+          <w:tcPr>
+            <w:tcW w:w="907" w:type="dxa"/>
+          </w:tcPr>
+          <w:p>
+            <w:pPr>
+              <w:spacing w:before="0" w:after="0" w:line="240" w:lineRule="auto"/>
+              <w:ind w:left="0" w:firstLine="0"/>
+              <w:suppressAutoHyphens/>
+            </w:pPr>
+          </w:p>
+        </w:tc>
+        <w:tc>
+          <w:tcPr>
+            <w:tcW w:w="3628" w:type="dxa"/>
           </w:tcPr>
           <w:p>
             <w:pPr>
@@ -1500,7 +1500,7 @@
           <w:sz w:val="26"/>
           <w:noProof/>
         </w:rPr>
-        <w:t>2.1 test_participant.py - Participant (10 tests)</w:t>
+        <w:t>2.1 test_participant.py - Participant (12 tests)</w:t>
       </w:r>
     </w:p>
     <w:tbl>
@@ -1518,10 +1518,10 @@
         </w:tblBorders>
       </w:tblPr>
       <w:tblGrid>
-        <w:gridCol w:w="2570"/>
-        <w:gridCol w:w="302"/>
-        <w:gridCol w:w="706"/>
-        <w:gridCol w:w="5493"/>
+        <w:gridCol w:w="2671"/>
+        <w:gridCol w:w="322"/>
+        <w:gridCol w:w="645"/>
+        <w:gridCol w:w="5433"/>
       </w:tblGrid>
       <w:tr>
         <w:trPr>
@@ -1529,7 +1529,7 @@
         </w:trPr>
         <w:tc>
           <w:tcPr>
-            <w:tcW w:w="2570" w:type="dxa"/>
+            <w:tcW w:w="2671" w:type="dxa"/>
           </w:tcPr>
           <w:p>
             <w:pPr>
@@ -1551,7 +1551,7 @@
         </w:tc>
         <w:tc>
           <w:tcPr>
-            <w:tcW w:w="302" w:type="dxa"/>
+            <w:tcW w:w="322" w:type="dxa"/>
           </w:tcPr>
           <w:p>
             <w:pPr>
@@ -1567,13 +1567,13 @@
                 <w:sz w:val="24"/>
                 <w:noProof/>
               </w:rPr>
-              <w:t>REQ_ID</w:t>
-            </w:r>
-          </w:p>
-        </w:tc>
-        <w:tc>
-          <w:tcPr>
-            <w:tcW w:w="706" w:type="dxa"/>
+              <w:t>TC</w:t>
+            </w:r>
+          </w:p>
+        </w:tc>
+        <w:tc>
+          <w:tcPr>
+            <w:tcW w:w="645" w:type="dxa"/>
           </w:tcPr>
           <w:p>
             <w:pPr>
@@ -1595,7 +1595,7 @@
         </w:tc>
         <w:tc>
           <w:tcPr>
-            <w:tcW w:w="5493" w:type="dxa"/>
+            <w:tcW w:w="5433" w:type="dxa"/>
           </w:tcPr>
           <w:p>
             <w:pPr>
@@ -1622,51 +1622,51 @@
         </w:trPr>
         <w:tc>
           <w:tcPr>
-            <w:tcW w:w="2570" w:type="dxa"/>
-          </w:tcPr>
-          <w:p>
-            <w:pPr>
-              <w:spacing w:before="0" w:after="0" w:line="240" w:lineRule="auto"/>
-              <w:ind w:left="0" w:firstLine="0"/>
-              <w:suppressAutoHyphens/>
-            </w:pPr>
-            <w:r>
-              <w:rPr>
-                <w:rFonts w:ascii="Calibri" w:hAnsi="Calibri"/>
-                <w:b w:val="0"/>
-                <w:i w:val="0"/>
-                <w:sz w:val="24"/>
-                <w:noProof/>
-              </w:rPr>
-              <w:t>test_1_1_unique_medicaid_id_per_tenant</w:t>
-            </w:r>
-          </w:p>
-        </w:tc>
-        <w:tc>
-          <w:tcPr>
-            <w:tcW w:w="302" w:type="dxa"/>
-          </w:tcPr>
-          <w:p>
-            <w:pPr>
-              <w:spacing w:before="0" w:after="0" w:line="240" w:lineRule="auto"/>
-              <w:ind w:left="0" w:firstLine="0"/>
-              <w:suppressAutoHyphens/>
-            </w:pPr>
-            <w:r>
-              <w:rPr>
-                <w:rFonts w:ascii="Calibri" w:hAnsi="Calibri"/>
-                <w:b w:val="0"/>
-                <w:i w:val="0"/>
-                <w:sz w:val="24"/>
-                <w:noProof/>
-              </w:rPr>
-              <w:t>1.1</w:t>
-            </w:r>
-          </w:p>
-        </w:tc>
-        <w:tc>
-          <w:tcPr>
-            <w:tcW w:w="706" w:type="dxa"/>
+            <w:tcW w:w="2671" w:type="dxa"/>
+          </w:tcPr>
+          <w:p>
+            <w:pPr>
+              <w:spacing w:before="0" w:after="0" w:line="240" w:lineRule="auto"/>
+              <w:ind w:left="0" w:firstLine="0"/>
+              <w:suppressAutoHyphens/>
+            </w:pPr>
+            <w:r>
+              <w:rPr>
+                <w:rFonts w:ascii="Calibri" w:hAnsi="Calibri"/>
+                <w:b w:val="0"/>
+                <w:i w:val="0"/>
+                <w:sz w:val="24"/>
+                <w:noProof/>
+              </w:rPr>
+              <w:t>test_tc_1_1_positive_participant_creation_by_program_administrator</w:t>
+            </w:r>
+          </w:p>
+        </w:tc>
+        <w:tc>
+          <w:tcPr>
+            <w:tcW w:w="322" w:type="dxa"/>
+          </w:tcPr>
+          <w:p>
+            <w:pPr>
+              <w:spacing w:before="0" w:after="0" w:line="240" w:lineRule="auto"/>
+              <w:ind w:left="0" w:firstLine="0"/>
+              <w:suppressAutoHyphens/>
+            </w:pPr>
+            <w:r>
+              <w:rPr>
+                <w:rFonts w:ascii="Calibri" w:hAnsi="Calibri"/>
+                <w:b w:val="0"/>
+                <w:i w:val="0"/>
+                <w:sz w:val="24"/>
+                <w:noProof/>
+              </w:rPr>
+              <w:t>TC-1.1</w:t>
+            </w:r>
+          </w:p>
+        </w:tc>
+        <w:tc>
+          <w:tcPr>
+            <w:tcW w:w="645" w:type="dxa"/>
           </w:tcPr>
           <w:p>
             <w:pPr>
@@ -1688,23 +1688,23 @@
         </w:tc>
         <w:tc>
           <w:tcPr>
-            <w:tcW w:w="5493" w:type="dxa"/>
-          </w:tcPr>
-          <w:p>
-            <w:pPr>
-              <w:spacing w:before="0" w:after="0" w:line="240" w:lineRule="auto"/>
-              <w:ind w:left="0" w:firstLine="0"/>
-              <w:suppressAutoHyphens/>
-            </w:pPr>
-            <w:r>
-              <w:rPr>
-                <w:rFonts w:ascii="Calibri" w:hAnsi="Calibri"/>
-                <w:b w:val="0"/>
-                <w:i w:val="0"/>
-                <w:sz w:val="24"/>
-                <w:noProof/>
-              </w:rPr>
-              <w:t>POST with duplicate medicaid_id in same tenant returns 409 and PARTICIPANT_DUPLICATE_MEDICAID_ID</w:t>
+            <w:tcW w:w="5433" w:type="dxa"/>
+          </w:tcPr>
+          <w:p>
+            <w:pPr>
+              <w:spacing w:before="0" w:after="0" w:line="240" w:lineRule="auto"/>
+              <w:ind w:left="0" w:firstLine="0"/>
+              <w:suppressAutoHyphens/>
+            </w:pPr>
+            <w:r>
+              <w:rPr>
+                <w:rFonts w:ascii="Calibri" w:hAnsi="Calibri"/>
+                <w:b w:val="0"/>
+                <w:i w:val="0"/>
+                <w:sz w:val="24"/>
+                <w:noProof/>
+              </w:rPr>
+              <w:t>POST /participants by program_administrator returns 201 with all required fields and program_status active</w:t>
             </w:r>
           </w:p>
         </w:tc>
@@ -1715,51 +1715,51 @@
         </w:trPr>
         <w:tc>
           <w:tcPr>
-            <w:tcW w:w="2570" w:type="dxa"/>
-          </w:tcPr>
-          <w:p>
-            <w:pPr>
-              <w:spacing w:before="0" w:after="0" w:line="240" w:lineRule="auto"/>
-              <w:ind w:left="0" w:firstLine="0"/>
-              <w:suppressAutoHyphens/>
-            </w:pPr>
-            <w:r>
-              <w:rPr>
-                <w:rFonts w:ascii="Calibri" w:hAnsi="Calibri"/>
-                <w:b w:val="0"/>
-                <w:i w:val="0"/>
-                <w:sz w:val="24"/>
-                <w:noProof/>
-              </w:rPr>
-              <w:t>test_1_2_rbac_write_restricted_to_staff_roles</w:t>
-            </w:r>
-          </w:p>
-        </w:tc>
-        <w:tc>
-          <w:tcPr>
-            <w:tcW w:w="302" w:type="dxa"/>
-          </w:tcPr>
-          <w:p>
-            <w:pPr>
-              <w:spacing w:before="0" w:after="0" w:line="240" w:lineRule="auto"/>
-              <w:ind w:left="0" w:firstLine="0"/>
-              <w:suppressAutoHyphens/>
-            </w:pPr>
-            <w:r>
-              <w:rPr>
-                <w:rFonts w:ascii="Calibri" w:hAnsi="Calibri"/>
-                <w:b w:val="0"/>
-                <w:i w:val="0"/>
-                <w:sz w:val="24"/>
-                <w:noProof/>
-              </w:rPr>
-              <w:t>1.2</w:t>
-            </w:r>
-          </w:p>
-        </w:tc>
-        <w:tc>
-          <w:tcPr>
-            <w:tcW w:w="706" w:type="dxa"/>
+            <w:tcW w:w="2671" w:type="dxa"/>
+          </w:tcPr>
+          <w:p>
+            <w:pPr>
+              <w:spacing w:before="0" w:after="0" w:line="240" w:lineRule="auto"/>
+              <w:ind w:left="0" w:firstLine="0"/>
+              <w:suppressAutoHyphens/>
+            </w:pPr>
+            <w:r>
+              <w:rPr>
+                <w:rFonts w:ascii="Calibri" w:hAnsi="Calibri"/>
+                <w:b w:val="0"/>
+                <w:i w:val="0"/>
+                <w:sz w:val="24"/>
+                <w:noProof/>
+              </w:rPr>
+              <w:t>test_tc_1_2_positive_login_valid_credentials</w:t>
+            </w:r>
+          </w:p>
+        </w:tc>
+        <w:tc>
+          <w:tcPr>
+            <w:tcW w:w="322" w:type="dxa"/>
+          </w:tcPr>
+          <w:p>
+            <w:pPr>
+              <w:spacing w:before="0" w:after="0" w:line="240" w:lineRule="auto"/>
+              <w:ind w:left="0" w:firstLine="0"/>
+              <w:suppressAutoHyphens/>
+            </w:pPr>
+            <w:r>
+              <w:rPr>
+                <w:rFonts w:ascii="Calibri" w:hAnsi="Calibri"/>
+                <w:b w:val="0"/>
+                <w:i w:val="0"/>
+                <w:sz w:val="24"/>
+                <w:noProof/>
+              </w:rPr>
+              <w:t>TC-1.2</w:t>
+            </w:r>
+          </w:p>
+        </w:tc>
+        <w:tc>
+          <w:tcPr>
+            <w:tcW w:w="645" w:type="dxa"/>
           </w:tcPr>
           <w:p>
             <w:pPr>
@@ -1781,23 +1781,23 @@
         </w:tc>
         <w:tc>
           <w:tcPr>
-            <w:tcW w:w="5493" w:type="dxa"/>
-          </w:tcPr>
-          <w:p>
-            <w:pPr>
-              <w:spacing w:before="0" w:after="0" w:line="240" w:lineRule="auto"/>
-              <w:ind w:left="0" w:firstLine="0"/>
-              <w:suppressAutoHyphens/>
-            </w:pPr>
-            <w:r>
-              <w:rPr>
-                <w:rFonts w:ascii="Calibri" w:hAnsi="Calibri"/>
-                <w:b w:val="0"/>
-                <w:i w:val="0"/>
-                <w:sz w:val="24"/>
-                <w:noProof/>
-              </w:rPr>
-              <w:t>POST or PATCH from physician or participant_family role returns 403; authorized staff roles succeed</w:t>
+            <w:tcW w:w="5433" w:type="dxa"/>
+          </w:tcPr>
+          <w:p>
+            <w:pPr>
+              <w:spacing w:before="0" w:after="0" w:line="240" w:lineRule="auto"/>
+              <w:ind w:left="0" w:firstLine="0"/>
+              <w:suppressAutoHyphens/>
+            </w:pPr>
+            <w:r>
+              <w:rPr>
+                <w:rFonts w:ascii="Calibri" w:hAnsi="Calibri"/>
+                <w:b w:val="0"/>
+                <w:i w:val="0"/>
+                <w:sz w:val="24"/>
+                <w:noProof/>
+              </w:rPr>
+              <w:t>POST /login with valid user_id and correct password returns 200 with status ok</w:t>
             </w:r>
           </w:p>
         </w:tc>
@@ -1808,51 +1808,51 @@
         </w:trPr>
         <w:tc>
           <w:tcPr>
-            <w:tcW w:w="2570" w:type="dxa"/>
-          </w:tcPr>
-          <w:p>
-            <w:pPr>
-              <w:spacing w:before="0" w:after="0" w:line="240" w:lineRule="auto"/>
-              <w:ind w:left="0" w:firstLine="0"/>
-              <w:suppressAutoHyphens/>
-            </w:pPr>
-            <w:r>
-              <w:rPr>
-                <w:rFonts w:ascii="Calibri" w:hAnsi="Calibri"/>
-                <w:b w:val="0"/>
-                <w:i w:val="0"/>
-                <w:sz w:val="24"/>
-                <w:noProof/>
-              </w:rPr>
-              <w:t>test_1_3_42cfr_part2_sud_record_access_gate</w:t>
-            </w:r>
-          </w:p>
-        </w:tc>
-        <w:tc>
-          <w:tcPr>
-            <w:tcW w:w="302" w:type="dxa"/>
-          </w:tcPr>
-          <w:p>
-            <w:pPr>
-              <w:spacing w:before="0" w:after="0" w:line="240" w:lineRule="auto"/>
-              <w:ind w:left="0" w:firstLine="0"/>
-              <w:suppressAutoHyphens/>
-            </w:pPr>
-            <w:r>
-              <w:rPr>
-                <w:rFonts w:ascii="Calibri" w:hAnsi="Calibri"/>
-                <w:b w:val="0"/>
-                <w:i w:val="0"/>
-                <w:sz w:val="24"/>
-                <w:noProof/>
-              </w:rPr>
-              <w:t>1.3</w:t>
-            </w:r>
-          </w:p>
-        </w:tc>
-        <w:tc>
-          <w:tcPr>
-            <w:tcW w:w="706" w:type="dxa"/>
+            <w:tcW w:w="2671" w:type="dxa"/>
+          </w:tcPr>
+          <w:p>
+            <w:pPr>
+              <w:spacing w:before="0" w:after="0" w:line="240" w:lineRule="auto"/>
+              <w:ind w:left="0" w:firstLine="0"/>
+              <w:suppressAutoHyphens/>
+            </w:pPr>
+            <w:r>
+              <w:rPr>
+                <w:rFonts w:ascii="Calibri" w:hAnsi="Calibri"/>
+                <w:b w:val="0"/>
+                <w:i w:val="0"/>
+                <w:sz w:val="24"/>
+                <w:noProof/>
+              </w:rPr>
+              <w:t>test_tc_1_3_negative_login_wrong_password_returns_401</w:t>
+            </w:r>
+          </w:p>
+        </w:tc>
+        <w:tc>
+          <w:tcPr>
+            <w:tcW w:w="322" w:type="dxa"/>
+          </w:tcPr>
+          <w:p>
+            <w:pPr>
+              <w:spacing w:before="0" w:after="0" w:line="240" w:lineRule="auto"/>
+              <w:ind w:left="0" w:firstLine="0"/>
+              <w:suppressAutoHyphens/>
+            </w:pPr>
+            <w:r>
+              <w:rPr>
+                <w:rFonts w:ascii="Calibri" w:hAnsi="Calibri"/>
+                <w:b w:val="0"/>
+                <w:i w:val="0"/>
+                <w:sz w:val="24"/>
+                <w:noProof/>
+              </w:rPr>
+              <w:t>TC-1.3</w:t>
+            </w:r>
+          </w:p>
+        </w:tc>
+        <w:tc>
+          <w:tcPr>
+            <w:tcW w:w="645" w:type="dxa"/>
           </w:tcPr>
           <w:p>
             <w:pPr>
@@ -1874,23 +1874,23 @@
         </w:tc>
         <w:tc>
           <w:tcPr>
-            <w:tcW w:w="5493" w:type="dxa"/>
-          </w:tcPr>
-          <w:p>
-            <w:pPr>
-              <w:spacing w:before="0" w:after="0" w:line="240" w:lineRule="auto"/>
-              <w:ind w:left="0" w:firstLine="0"/>
-              <w:suppressAutoHyphens/>
-            </w:pPr>
-            <w:r>
-              <w:rPr>
-                <w:rFonts w:ascii="Calibri" w:hAnsi="Calibri"/>
-                <w:b w:val="0"/>
-                <w:i w:val="0"/>
-                <w:sz w:val="24"/>
-                <w:noProof/>
-              </w:rPr>
-              <w:t>GET on is_sud_record=true Participant from non-privileged role returns 403 with no record disclosure</w:t>
+            <w:tcW w:w="5433" w:type="dxa"/>
+          </w:tcPr>
+          <w:p>
+            <w:pPr>
+              <w:spacing w:before="0" w:after="0" w:line="240" w:lineRule="auto"/>
+              <w:ind w:left="0" w:firstLine="0"/>
+              <w:suppressAutoHyphens/>
+            </w:pPr>
+            <w:r>
+              <w:rPr>
+                <w:rFonts w:ascii="Calibri" w:hAnsi="Calibri"/>
+                <w:b w:val="0"/>
+                <w:i w:val="0"/>
+                <w:sz w:val="24"/>
+                <w:noProof/>
+              </w:rPr>
+              <w:t>POST /login with wrong non-empty password returns 401; error message does not reveal which credential was wrong</w:t>
             </w:r>
           </w:p>
         </w:tc>
@@ -1901,89 +1901,89 @@
         </w:trPr>
         <w:tc>
           <w:tcPr>
-            <w:tcW w:w="2570" w:type="dxa"/>
-          </w:tcPr>
-          <w:p>
-            <w:pPr>
-              <w:spacing w:before="0" w:after="0" w:line="240" w:lineRule="auto"/>
-              <w:ind w:left="0" w:firstLine="0"/>
-              <w:suppressAutoHyphens/>
-            </w:pPr>
-            <w:r>
-              <w:rPr>
-                <w:rFonts w:ascii="Calibri" w:hAnsi="Calibri"/>
-                <w:b w:val="0"/>
-                <w:i w:val="0"/>
-                <w:sz w:val="24"/>
-                <w:noProof/>
-              </w:rPr>
-              <w:t>test_1_4_audit_log_on_phi_read_and_write</w:t>
-            </w:r>
-          </w:p>
-        </w:tc>
-        <w:tc>
-          <w:tcPr>
-            <w:tcW w:w="302" w:type="dxa"/>
-          </w:tcPr>
-          <w:p>
-            <w:pPr>
-              <w:spacing w:before="0" w:after="0" w:line="240" w:lineRule="auto"/>
-              <w:ind w:left="0" w:firstLine="0"/>
-              <w:suppressAutoHyphens/>
-            </w:pPr>
-            <w:r>
-              <w:rPr>
-                <w:rFonts w:ascii="Calibri" w:hAnsi="Calibri"/>
-                <w:b w:val="0"/>
-                <w:i w:val="0"/>
-                <w:sz w:val="24"/>
-                <w:noProof/>
-              </w:rPr>
-              <w:t>1.4</w:t>
-            </w:r>
-          </w:p>
-        </w:tc>
-        <w:tc>
-          <w:tcPr>
-            <w:tcW w:w="706" w:type="dxa"/>
-          </w:tcPr>
-          <w:p>
-            <w:pPr>
-              <w:spacing w:before="0" w:after="0" w:line="240" w:lineRule="auto"/>
-              <w:ind w:left="0" w:firstLine="0"/>
-              <w:suppressAutoHyphens/>
-            </w:pPr>
-            <w:r>
-              <w:rPr>
-                <w:rFonts w:ascii="Calibri" w:hAnsi="Calibri"/>
-                <w:b w:val="0"/>
-                <w:i w:val="0"/>
-                <w:sz w:val="24"/>
-                <w:noProof/>
-              </w:rPr>
-              <w:t>Business Rules</w:t>
-            </w:r>
-          </w:p>
-        </w:tc>
-        <w:tc>
-          <w:tcPr>
-            <w:tcW w:w="5493" w:type="dxa"/>
-          </w:tcPr>
-          <w:p>
-            <w:pPr>
-              <w:spacing w:before="0" w:after="0" w:line="240" w:lineRule="auto"/>
-              <w:ind w:left="0" w:firstLine="0"/>
-              <w:suppressAutoHyphens/>
-            </w:pPr>
-            <w:r>
-              <w:rPr>
-                <w:rFonts w:ascii="Calibri" w:hAnsi="Calibri"/>
-                <w:b w:val="0"/>
-                <w:i w:val="0"/>
-                <w:sz w:val="24"/>
-                <w:noProof/>
-              </w:rPr>
-              <w:t>Participant write produces audit event with all Section 2.6.1 fields non-null and no PHI values in payload</w:t>
+            <w:tcW w:w="2671" w:type="dxa"/>
+          </w:tcPr>
+          <w:p>
+            <w:pPr>
+              <w:spacing w:before="0" w:after="0" w:line="240" w:lineRule="auto"/>
+              <w:ind w:left="0" w:firstLine="0"/>
+              <w:suppressAutoHyphens/>
+            </w:pPr>
+            <w:r>
+              <w:rPr>
+                <w:rFonts w:ascii="Calibri" w:hAnsi="Calibri"/>
+                <w:b w:val="0"/>
+                <w:i w:val="0"/>
+                <w:sz w:val="24"/>
+                <w:noProof/>
+              </w:rPr>
+              <w:t>test_tc_1_4_duplicate_medicaid_id_returns_409</w:t>
+            </w:r>
+          </w:p>
+        </w:tc>
+        <w:tc>
+          <w:tcPr>
+            <w:tcW w:w="322" w:type="dxa"/>
+          </w:tcPr>
+          <w:p>
+            <w:pPr>
+              <w:spacing w:before="0" w:after="0" w:line="240" w:lineRule="auto"/>
+              <w:ind w:left="0" w:firstLine="0"/>
+              <w:suppressAutoHyphens/>
+            </w:pPr>
+            <w:r>
+              <w:rPr>
+                <w:rFonts w:ascii="Calibri" w:hAnsi="Calibri"/>
+                <w:b w:val="0"/>
+                <w:i w:val="0"/>
+                <w:sz w:val="24"/>
+                <w:noProof/>
+              </w:rPr>
+              <w:t>TC-1.4</w:t>
+            </w:r>
+          </w:p>
+        </w:tc>
+        <w:tc>
+          <w:tcPr>
+            <w:tcW w:w="645" w:type="dxa"/>
+          </w:tcPr>
+          <w:p>
+            <w:pPr>
+              <w:spacing w:before="0" w:after="0" w:line="240" w:lineRule="auto"/>
+              <w:ind w:left="0" w:firstLine="0"/>
+              <w:suppressAutoHyphens/>
+            </w:pPr>
+            <w:r>
+              <w:rPr>
+                <w:rFonts w:ascii="Calibri" w:hAnsi="Calibri"/>
+                <w:b w:val="0"/>
+                <w:i w:val="0"/>
+                <w:sz w:val="24"/>
+                <w:noProof/>
+              </w:rPr>
+              <w:t>API</w:t>
+            </w:r>
+          </w:p>
+        </w:tc>
+        <w:tc>
+          <w:tcPr>
+            <w:tcW w:w="5433" w:type="dxa"/>
+          </w:tcPr>
+          <w:p>
+            <w:pPr>
+              <w:spacing w:before="0" w:after="0" w:line="240" w:lineRule="auto"/>
+              <w:ind w:left="0" w:firstLine="0"/>
+              <w:suppressAutoHyphens/>
+            </w:pPr>
+            <w:r>
+              <w:rPr>
+                <w:rFonts w:ascii="Calibri" w:hAnsi="Calibri"/>
+                <w:b w:val="0"/>
+                <w:i w:val="0"/>
+                <w:sz w:val="24"/>
+                <w:noProof/>
+              </w:rPr>
+              <w:t>POST with duplicate medicaid_id in same tenant returns 409 PARTICIPANT_DUPLICATE_MEDICAID_ID</w:t>
             </w:r>
           </w:p>
         </w:tc>
@@ -1994,89 +1994,89 @@
         </w:trPr>
         <w:tc>
           <w:tcPr>
-            <w:tcW w:w="2570" w:type="dxa"/>
-          </w:tcPr>
-          <w:p>
-            <w:pPr>
-              <w:spacing w:before="0" w:after="0" w:line="240" w:lineRule="auto"/>
-              <w:ind w:left="0" w:firstLine="0"/>
-              <w:suppressAutoHyphens/>
-            </w:pPr>
-            <w:r>
-              <w:rPr>
-                <w:rFonts w:ascii="Calibri" w:hAnsi="Calibri"/>
-                <w:b w:val="0"/>
-                <w:i w:val="0"/>
-                <w:sz w:val="24"/>
-                <w:noProof/>
-              </w:rPr>
-              <w:t>test_1_5_program_status_state_machine_transitions</w:t>
-            </w:r>
-          </w:p>
-        </w:tc>
-        <w:tc>
-          <w:tcPr>
-            <w:tcW w:w="302" w:type="dxa"/>
-          </w:tcPr>
-          <w:p>
-            <w:pPr>
-              <w:spacing w:before="0" w:after="0" w:line="240" w:lineRule="auto"/>
-              <w:ind w:left="0" w:firstLine="0"/>
-              <w:suppressAutoHyphens/>
-            </w:pPr>
-            <w:r>
-              <w:rPr>
-                <w:rFonts w:ascii="Calibri" w:hAnsi="Calibri"/>
-                <w:b w:val="0"/>
-                <w:i w:val="0"/>
-                <w:sz w:val="24"/>
-                <w:noProof/>
-              </w:rPr>
-              <w:t>1.5</w:t>
-            </w:r>
-          </w:p>
-        </w:tc>
-        <w:tc>
-          <w:tcPr>
-            <w:tcW w:w="706" w:type="dxa"/>
-          </w:tcPr>
-          <w:p>
-            <w:pPr>
-              <w:spacing w:before="0" w:after="0" w:line="240" w:lineRule="auto"/>
-              <w:ind w:left="0" w:firstLine="0"/>
-              <w:suppressAutoHyphens/>
-            </w:pPr>
-            <w:r>
-              <w:rPr>
-                <w:rFonts w:ascii="Calibri" w:hAnsi="Calibri"/>
-                <w:b w:val="0"/>
-                <w:i w:val="0"/>
-                <w:sz w:val="24"/>
-                <w:noProof/>
-              </w:rPr>
-              <w:t>Business Rules</w:t>
-            </w:r>
-          </w:p>
-        </w:tc>
-        <w:tc>
-          <w:tcPr>
-            <w:tcW w:w="5493" w:type="dxa"/>
-          </w:tcPr>
-          <w:p>
-            <w:pPr>
-              <w:spacing w:before="0" w:after="0" w:line="240" w:lineRule="auto"/>
-              <w:ind w:left="0" w:firstLine="0"/>
-              <w:suppressAutoHyphens/>
-            </w:pPr>
-            <w:r>
-              <w:rPr>
-                <w:rFonts w:ascii="Calibri" w:hAnsi="Calibri"/>
-                <w:b w:val="0"/>
-                <w:i w:val="0"/>
-                <w:sz w:val="24"/>
-                <w:noProof/>
-              </w:rPr>
-              <w:t>Disallowed program_status transition returns 422; each allowed transition returns 200 with updated status</w:t>
+            <w:tcW w:w="2671" w:type="dxa"/>
+          </w:tcPr>
+          <w:p>
+            <w:pPr>
+              <w:spacing w:before="0" w:after="0" w:line="240" w:lineRule="auto"/>
+              <w:ind w:left="0" w:firstLine="0"/>
+              <w:suppressAutoHyphens/>
+            </w:pPr>
+            <w:r>
+              <w:rPr>
+                <w:rFonts w:ascii="Calibri" w:hAnsi="Calibri"/>
+                <w:b w:val="0"/>
+                <w:i w:val="0"/>
+                <w:sz w:val="24"/>
+                <w:noProof/>
+              </w:rPr>
+              <w:t>test_tc_1_5_sud_record_billing_specialist_returns_403_no_disclosure</w:t>
+            </w:r>
+          </w:p>
+        </w:tc>
+        <w:tc>
+          <w:tcPr>
+            <w:tcW w:w="322" w:type="dxa"/>
+          </w:tcPr>
+          <w:p>
+            <w:pPr>
+              <w:spacing w:before="0" w:after="0" w:line="240" w:lineRule="auto"/>
+              <w:ind w:left="0" w:firstLine="0"/>
+              <w:suppressAutoHyphens/>
+            </w:pPr>
+            <w:r>
+              <w:rPr>
+                <w:rFonts w:ascii="Calibri" w:hAnsi="Calibri"/>
+                <w:b w:val="0"/>
+                <w:i w:val="0"/>
+                <w:sz w:val="24"/>
+                <w:noProof/>
+              </w:rPr>
+              <w:t>TC-1.5</w:t>
+            </w:r>
+          </w:p>
+        </w:tc>
+        <w:tc>
+          <w:tcPr>
+            <w:tcW w:w="645" w:type="dxa"/>
+          </w:tcPr>
+          <w:p>
+            <w:pPr>
+              <w:spacing w:before="0" w:after="0" w:line="240" w:lineRule="auto"/>
+              <w:ind w:left="0" w:firstLine="0"/>
+              <w:suppressAutoHyphens/>
+            </w:pPr>
+            <w:r>
+              <w:rPr>
+                <w:rFonts w:ascii="Calibri" w:hAnsi="Calibri"/>
+                <w:b w:val="0"/>
+                <w:i w:val="0"/>
+                <w:sz w:val="24"/>
+                <w:noProof/>
+              </w:rPr>
+              <w:t>API</w:t>
+            </w:r>
+          </w:p>
+        </w:tc>
+        <w:tc>
+          <w:tcPr>
+            <w:tcW w:w="5433" w:type="dxa"/>
+          </w:tcPr>
+          <w:p>
+            <w:pPr>
+              <w:spacing w:before="0" w:after="0" w:line="240" w:lineRule="auto"/>
+              <w:ind w:left="0" w:firstLine="0"/>
+              <w:suppressAutoHyphens/>
+            </w:pPr>
+            <w:r>
+              <w:rPr>
+                <w:rFonts w:ascii="Calibri" w:hAnsi="Calibri"/>
+                <w:b w:val="0"/>
+                <w:i w:val="0"/>
+                <w:sz w:val="24"/>
+                <w:noProof/>
+              </w:rPr>
+              <w:t>GET on is_sud_record=true by billing_specialist returns 403 SUD_ACCESS_DENIED with no participant data in response</w:t>
             </w:r>
           </w:p>
         </w:tc>
@@ -2087,51 +2087,51 @@
         </w:trPr>
         <w:tc>
           <w:tcPr>
-            <w:tcW w:w="2570" w:type="dxa"/>
-          </w:tcPr>
-          <w:p>
-            <w:pPr>
-              <w:spacing w:before="0" w:after="0" w:line="240" w:lineRule="auto"/>
-              <w:ind w:left="0" w:firstLine="0"/>
-              <w:suppressAutoHyphens/>
-            </w:pPr>
-            <w:r>
-              <w:rPr>
-                <w:rFonts w:ascii="Calibri" w:hAnsi="Calibri"/>
-                <w:b w:val="0"/>
-                <w:i w:val="0"/>
-                <w:sz w:val="24"/>
-                <w:noProof/>
-              </w:rPr>
-              <w:t>test_1_6_enrollment_date_required_and_discharge_date_auto_set</w:t>
-            </w:r>
-          </w:p>
-        </w:tc>
-        <w:tc>
-          <w:tcPr>
-            <w:tcW w:w="302" w:type="dxa"/>
-          </w:tcPr>
-          <w:p>
-            <w:pPr>
-              <w:spacing w:before="0" w:after="0" w:line="240" w:lineRule="auto"/>
-              <w:ind w:left="0" w:firstLine="0"/>
-              <w:suppressAutoHyphens/>
-            </w:pPr>
-            <w:r>
-              <w:rPr>
-                <w:rFonts w:ascii="Calibri" w:hAnsi="Calibri"/>
-                <w:b w:val="0"/>
-                <w:i w:val="0"/>
-                <w:sz w:val="24"/>
-                <w:noProof/>
-              </w:rPr>
-              <w:t>1.6</w:t>
-            </w:r>
-          </w:p>
-        </w:tc>
-        <w:tc>
-          <w:tcPr>
-            <w:tcW w:w="706" w:type="dxa"/>
+            <w:tcW w:w="2671" w:type="dxa"/>
+          </w:tcPr>
+          <w:p>
+            <w:pPr>
+              <w:spacing w:before="0" w:after="0" w:line="240" w:lineRule="auto"/>
+              <w:ind w:left="0" w:firstLine="0"/>
+              <w:suppressAutoHyphens/>
+            </w:pPr>
+            <w:r>
+              <w:rPr>
+                <w:rFonts w:ascii="Calibri" w:hAnsi="Calibri"/>
+                <w:b w:val="0"/>
+                <w:i w:val="0"/>
+                <w:sz w:val="24"/>
+                <w:noProof/>
+              </w:rPr>
+              <w:t>test_tc_1_6_audit_log_phi_operation_mandatory_fields_no_phi_values</w:t>
+            </w:r>
+          </w:p>
+        </w:tc>
+        <w:tc>
+          <w:tcPr>
+            <w:tcW w:w="322" w:type="dxa"/>
+          </w:tcPr>
+          <w:p>
+            <w:pPr>
+              <w:spacing w:before="0" w:after="0" w:line="240" w:lineRule="auto"/>
+              <w:ind w:left="0" w:firstLine="0"/>
+              <w:suppressAutoHyphens/>
+            </w:pPr>
+            <w:r>
+              <w:rPr>
+                <w:rFonts w:ascii="Calibri" w:hAnsi="Calibri"/>
+                <w:b w:val="0"/>
+                <w:i w:val="0"/>
+                <w:sz w:val="24"/>
+                <w:noProof/>
+              </w:rPr>
+              <w:t>TC-1.6</w:t>
+            </w:r>
+          </w:p>
+        </w:tc>
+        <w:tc>
+          <w:tcPr>
+            <w:tcW w:w="645" w:type="dxa"/>
           </w:tcPr>
           <w:p>
             <w:pPr>
@@ -2153,23 +2153,23 @@
         </w:tc>
         <w:tc>
           <w:tcPr>
-            <w:tcW w:w="5493" w:type="dxa"/>
-          </w:tcPr>
-          <w:p>
-            <w:pPr>
-              <w:spacing w:before="0" w:after="0" w:line="240" w:lineRule="auto"/>
-              <w:ind w:left="0" w:firstLine="0"/>
-              <w:suppressAutoHyphens/>
-            </w:pPr>
-            <w:r>
-              <w:rPr>
-                <w:rFonts w:ascii="Calibri" w:hAnsi="Calibri"/>
-                <w:b w:val="0"/>
-                <w:i w:val="0"/>
-                <w:sz w:val="24"/>
-                <w:noProof/>
-              </w:rPr>
-              <w:t>POST without enrollment_date returns 400; PATCH to discharged auto-populates discharge_date if not supplied</w:t>
+            <w:tcW w:w="5433" w:type="dxa"/>
+          </w:tcPr>
+          <w:p>
+            <w:pPr>
+              <w:spacing w:before="0" w:after="0" w:line="240" w:lineRule="auto"/>
+              <w:ind w:left="0" w:firstLine="0"/>
+              <w:suppressAutoHyphens/>
+            </w:pPr>
+            <w:r>
+              <w:rPr>
+                <w:rFonts w:ascii="Calibri" w:hAnsi="Calibri"/>
+                <w:b w:val="0"/>
+                <w:i w:val="0"/>
+                <w:sz w:val="24"/>
+                <w:noProof/>
+              </w:rPr>
+              <w:t>PHI_WRITE audit event after participant creation has all 11 mandatory fields non-null and no PHI values in data_affected</w:t>
             </w:r>
           </w:p>
         </w:tc>
@@ -2180,89 +2180,89 @@
         </w:trPr>
         <w:tc>
           <w:tcPr>
-            <w:tcW w:w="2570" w:type="dxa"/>
-          </w:tcPr>
-          <w:p>
-            <w:pPr>
-              <w:spacing w:before="0" w:after="0" w:line="240" w:lineRule="auto"/>
-              <w:ind w:left="0" w:firstLine="0"/>
-              <w:suppressAutoHyphens/>
-            </w:pPr>
-            <w:r>
-              <w:rPr>
-                <w:rFonts w:ascii="Calibri" w:hAnsi="Calibri"/>
-                <w:b w:val="0"/>
-                <w:i w:val="0"/>
-                <w:sz w:val="24"/>
-                <w:noProof/>
-              </w:rPr>
-              <w:t>test_1_7_mandatory_fields_on_participant_creation</w:t>
-            </w:r>
-          </w:p>
-        </w:tc>
-        <w:tc>
-          <w:tcPr>
-            <w:tcW w:w="302" w:type="dxa"/>
-          </w:tcPr>
-          <w:p>
-            <w:pPr>
-              <w:spacing w:before="0" w:after="0" w:line="240" w:lineRule="auto"/>
-              <w:ind w:left="0" w:firstLine="0"/>
-              <w:suppressAutoHyphens/>
-            </w:pPr>
-            <w:r>
-              <w:rPr>
-                <w:rFonts w:ascii="Calibri" w:hAnsi="Calibri"/>
-                <w:b w:val="0"/>
-                <w:i w:val="0"/>
-                <w:sz w:val="24"/>
-                <w:noProof/>
-              </w:rPr>
-              <w:t>1.7</w:t>
-            </w:r>
-          </w:p>
-        </w:tc>
-        <w:tc>
-          <w:tcPr>
-            <w:tcW w:w="706" w:type="dxa"/>
-          </w:tcPr>
-          <w:p>
-            <w:pPr>
-              <w:spacing w:before="0" w:after="0" w:line="240" w:lineRule="auto"/>
-              <w:ind w:left="0" w:firstLine="0"/>
-              <w:suppressAutoHyphens/>
-            </w:pPr>
-            <w:r>
-              <w:rPr>
-                <w:rFonts w:ascii="Calibri" w:hAnsi="Calibri"/>
-                <w:b w:val="0"/>
-                <w:i w:val="0"/>
-                <w:sz w:val="24"/>
-                <w:noProof/>
-              </w:rPr>
-              <w:t>API</w:t>
-            </w:r>
-          </w:p>
-        </w:tc>
-        <w:tc>
-          <w:tcPr>
-            <w:tcW w:w="5493" w:type="dxa"/>
-          </w:tcPr>
-          <w:p>
-            <w:pPr>
-              <w:spacing w:before="0" w:after="0" w:line="240" w:lineRule="auto"/>
-              <w:ind w:left="0" w:firstLine="0"/>
-              <w:suppressAutoHyphens/>
-            </w:pPr>
-            <w:r>
-              <w:rPr>
-                <w:rFonts w:ascii="Calibri" w:hAnsi="Calibri"/>
-                <w:b w:val="0"/>
-                <w:i w:val="0"/>
-                <w:sz w:val="24"/>
-                <w:noProof/>
-              </w:rPr>
-              <w:t>POST missing any mandatory field returns 400 identifying the absent field by name</w:t>
+            <w:tcW w:w="2671" w:type="dxa"/>
+          </w:tcPr>
+          <w:p>
+            <w:pPr>
+              <w:spacing w:before="0" w:after="0" w:line="240" w:lineRule="auto"/>
+              <w:ind w:left="0" w:firstLine="0"/>
+              <w:suppressAutoHyphens/>
+            </w:pPr>
+            <w:r>
+              <w:rPr>
+                <w:rFonts w:ascii="Calibri" w:hAnsi="Calibri"/>
+                <w:b w:val="0"/>
+                <w:i w:val="0"/>
+                <w:sz w:val="24"/>
+                <w:noProof/>
+              </w:rPr>
+              <w:t>test_tc_1_7_state_machine_active_to_on_leave_returns_200</w:t>
+            </w:r>
+          </w:p>
+        </w:tc>
+        <w:tc>
+          <w:tcPr>
+            <w:tcW w:w="322" w:type="dxa"/>
+          </w:tcPr>
+          <w:p>
+            <w:pPr>
+              <w:spacing w:before="0" w:after="0" w:line="240" w:lineRule="auto"/>
+              <w:ind w:left="0" w:firstLine="0"/>
+              <w:suppressAutoHyphens/>
+            </w:pPr>
+            <w:r>
+              <w:rPr>
+                <w:rFonts w:ascii="Calibri" w:hAnsi="Calibri"/>
+                <w:b w:val="0"/>
+                <w:i w:val="0"/>
+                <w:sz w:val="24"/>
+                <w:noProof/>
+              </w:rPr>
+              <w:t>TC-1.7</w:t>
+            </w:r>
+          </w:p>
+        </w:tc>
+        <w:tc>
+          <w:tcPr>
+            <w:tcW w:w="645" w:type="dxa"/>
+          </w:tcPr>
+          <w:p>
+            <w:pPr>
+              <w:spacing w:before="0" w:after="0" w:line="240" w:lineRule="auto"/>
+              <w:ind w:left="0" w:firstLine="0"/>
+              <w:suppressAutoHyphens/>
+            </w:pPr>
+            <w:r>
+              <w:rPr>
+                <w:rFonts w:ascii="Calibri" w:hAnsi="Calibri"/>
+                <w:b w:val="0"/>
+                <w:i w:val="0"/>
+                <w:sz w:val="24"/>
+                <w:noProof/>
+              </w:rPr>
+              <w:t>Business Rules</w:t>
+            </w:r>
+          </w:p>
+        </w:tc>
+        <w:tc>
+          <w:tcPr>
+            <w:tcW w:w="5433" w:type="dxa"/>
+          </w:tcPr>
+          <w:p>
+            <w:pPr>
+              <w:spacing w:before="0" w:after="0" w:line="240" w:lineRule="auto"/>
+              <w:ind w:left="0" w:firstLine="0"/>
+              <w:suppressAutoHyphens/>
+            </w:pPr>
+            <w:r>
+              <w:rPr>
+                <w:rFonts w:ascii="Calibri" w:hAnsi="Calibri"/>
+                <w:b w:val="0"/>
+                <w:i w:val="0"/>
+                <w:sz w:val="24"/>
+                <w:noProof/>
+              </w:rPr>
+              <w:t>PATCH program_status from active to on_leave returns 200 with updated status persisted in DB</w:t>
             </w:r>
           </w:p>
         </w:tc>
@@ -2273,89 +2273,89 @@
         </w:trPr>
         <w:tc>
           <w:tcPr>
-            <w:tcW w:w="2570" w:type="dxa"/>
-          </w:tcPr>
-          <w:p>
-            <w:pPr>
-              <w:spacing w:before="0" w:after="0" w:line="240" w:lineRule="auto"/>
-              <w:ind w:left="0" w:firstLine="0"/>
-              <w:suppressAutoHyphens/>
-            </w:pPr>
-            <w:r>
-              <w:rPr>
-                <w:rFonts w:ascii="Calibri" w:hAnsi="Calibri"/>
-                <w:b w:val="0"/>
-                <w:i w:val="0"/>
-                <w:sz w:val="24"/>
-                <w:noProof/>
-              </w:rPr>
-              <w:t>test_1_8_soft_delete_no_hard_delete</w:t>
-            </w:r>
-          </w:p>
-        </w:tc>
-        <w:tc>
-          <w:tcPr>
-            <w:tcW w:w="302" w:type="dxa"/>
-          </w:tcPr>
-          <w:p>
-            <w:pPr>
-              <w:spacing w:before="0" w:after="0" w:line="240" w:lineRule="auto"/>
-              <w:ind w:left="0" w:firstLine="0"/>
-              <w:suppressAutoHyphens/>
-            </w:pPr>
-            <w:r>
-              <w:rPr>
-                <w:rFonts w:ascii="Calibri" w:hAnsi="Calibri"/>
-                <w:b w:val="0"/>
-                <w:i w:val="0"/>
-                <w:sz w:val="24"/>
-                <w:noProof/>
-              </w:rPr>
-              <w:t>1.8</w:t>
-            </w:r>
-          </w:p>
-        </w:tc>
-        <w:tc>
-          <w:tcPr>
-            <w:tcW w:w="706" w:type="dxa"/>
-          </w:tcPr>
-          <w:p>
-            <w:pPr>
-              <w:spacing w:before="0" w:after="0" w:line="240" w:lineRule="auto"/>
-              <w:ind w:left="0" w:firstLine="0"/>
-              <w:suppressAutoHyphens/>
-            </w:pPr>
-            <w:r>
-              <w:rPr>
-                <w:rFonts w:ascii="Calibri" w:hAnsi="Calibri"/>
-                <w:b w:val="0"/>
-                <w:i w:val="0"/>
-                <w:sz w:val="24"/>
-                <w:noProof/>
-              </w:rPr>
-              <w:t>API</w:t>
-            </w:r>
-          </w:p>
-        </w:tc>
-        <w:tc>
-          <w:tcPr>
-            <w:tcW w:w="5493" w:type="dxa"/>
-          </w:tcPr>
-          <w:p>
-            <w:pPr>
-              <w:spacing w:before="0" w:after="0" w:line="240" w:lineRule="auto"/>
-              <w:ind w:left="0" w:firstLine="0"/>
-              <w:suppressAutoHyphens/>
-            </w:pPr>
-            <w:r>
-              <w:rPr>
-                <w:rFonts w:ascii="Calibri" w:hAnsi="Calibri"/>
-                <w:b w:val="0"/>
-                <w:i w:val="0"/>
-                <w:sz w:val="24"/>
-                <w:noProof/>
-              </w:rPr>
-              <w:t>DELETE returns 200 and sets is_deleted=true; physical row removal attempt returns 405</w:t>
+            <w:tcW w:w="2671" w:type="dxa"/>
+          </w:tcPr>
+          <w:p>
+            <w:pPr>
+              <w:spacing w:before="0" w:after="0" w:line="240" w:lineRule="auto"/>
+              <w:ind w:left="0" w:firstLine="0"/>
+              <w:suppressAutoHyphens/>
+            </w:pPr>
+            <w:r>
+              <w:rPr>
+                <w:rFonts w:ascii="Calibri" w:hAnsi="Calibri"/>
+                <w:b w:val="0"/>
+                <w:i w:val="0"/>
+                <w:sz w:val="24"/>
+                <w:noProof/>
+              </w:rPr>
+              <w:t>test_tc_1_8_state_machine_deceased_to_active_returns_422</w:t>
+            </w:r>
+          </w:p>
+        </w:tc>
+        <w:tc>
+          <w:tcPr>
+            <w:tcW w:w="322" w:type="dxa"/>
+          </w:tcPr>
+          <w:p>
+            <w:pPr>
+              <w:spacing w:before="0" w:after="0" w:line="240" w:lineRule="auto"/>
+              <w:ind w:left="0" w:firstLine="0"/>
+              <w:suppressAutoHyphens/>
+            </w:pPr>
+            <w:r>
+              <w:rPr>
+                <w:rFonts w:ascii="Calibri" w:hAnsi="Calibri"/>
+                <w:b w:val="0"/>
+                <w:i w:val="0"/>
+                <w:sz w:val="24"/>
+                <w:noProof/>
+              </w:rPr>
+              <w:t>TC-1.8</w:t>
+            </w:r>
+          </w:p>
+        </w:tc>
+        <w:tc>
+          <w:tcPr>
+            <w:tcW w:w="645" w:type="dxa"/>
+          </w:tcPr>
+          <w:p>
+            <w:pPr>
+              <w:spacing w:before="0" w:after="0" w:line="240" w:lineRule="auto"/>
+              <w:ind w:left="0" w:firstLine="0"/>
+              <w:suppressAutoHyphens/>
+            </w:pPr>
+            <w:r>
+              <w:rPr>
+                <w:rFonts w:ascii="Calibri" w:hAnsi="Calibri"/>
+                <w:b w:val="0"/>
+                <w:i w:val="0"/>
+                <w:sz w:val="24"/>
+                <w:noProof/>
+              </w:rPr>
+              <w:t>Business Rules</w:t>
+            </w:r>
+          </w:p>
+        </w:tc>
+        <w:tc>
+          <w:tcPr>
+            <w:tcW w:w="5433" w:type="dxa"/>
+          </w:tcPr>
+          <w:p>
+            <w:pPr>
+              <w:spacing w:before="0" w:after="0" w:line="240" w:lineRule="auto"/>
+              <w:ind w:left="0" w:firstLine="0"/>
+              <w:suppressAutoHyphens/>
+            </w:pPr>
+            <w:r>
+              <w:rPr>
+                <w:rFonts w:ascii="Calibri" w:hAnsi="Calibri"/>
+                <w:b w:val="0"/>
+                <w:i w:val="0"/>
+                <w:sz w:val="24"/>
+                <w:noProof/>
+              </w:rPr>
+              <w:t>PATCH program_status from deceased to active returns 422 with TRANSITION error code; DB status unchanged</w:t>
             </w:r>
           </w:p>
         </w:tc>
@@ -2366,51 +2366,51 @@
         </w:trPr>
         <w:tc>
           <w:tcPr>
-            <w:tcW w:w="2570" w:type="dxa"/>
-          </w:tcPr>
-          <w:p>
-            <w:pPr>
-              <w:spacing w:before="0" w:after="0" w:line="240" w:lineRule="auto"/>
-              <w:ind w:left="0" w:firstLine="0"/>
-              <w:suppressAutoHyphens/>
-            </w:pPr>
-            <w:r>
-              <w:rPr>
-                <w:rFonts w:ascii="Calibri" w:hAnsi="Calibri"/>
-                <w:b w:val="0"/>
-                <w:i w:val="0"/>
-                <w:sz w:val="24"/>
-                <w:noProof/>
-              </w:rPr>
-              <w:t>test_1_9_is_deleted_excluded_from_standard_queries</w:t>
-            </w:r>
-          </w:p>
-        </w:tc>
-        <w:tc>
-          <w:tcPr>
-            <w:tcW w:w="302" w:type="dxa"/>
-          </w:tcPr>
-          <w:p>
-            <w:pPr>
-              <w:spacing w:before="0" w:after="0" w:line="240" w:lineRule="auto"/>
-              <w:ind w:left="0" w:firstLine="0"/>
-              <w:suppressAutoHyphens/>
-            </w:pPr>
-            <w:r>
-              <w:rPr>
-                <w:rFonts w:ascii="Calibri" w:hAnsi="Calibri"/>
-                <w:b w:val="0"/>
-                <w:i w:val="0"/>
-                <w:sz w:val="24"/>
-                <w:noProof/>
-              </w:rPr>
-              <w:t>1.9</w:t>
-            </w:r>
-          </w:p>
-        </w:tc>
-        <w:tc>
-          <w:tcPr>
-            <w:tcW w:w="706" w:type="dxa"/>
+            <w:tcW w:w="2671" w:type="dxa"/>
+          </w:tcPr>
+          <w:p>
+            <w:pPr>
+              <w:spacing w:before="0" w:after="0" w:line="240" w:lineRule="auto"/>
+              <w:ind w:left="0" w:firstLine="0"/>
+              <w:suppressAutoHyphens/>
+            </w:pPr>
+            <w:r>
+              <w:rPr>
+                <w:rFonts w:ascii="Calibri" w:hAnsi="Calibri"/>
+                <w:b w:val="0"/>
+                <w:i w:val="0"/>
+                <w:sz w:val="24"/>
+                <w:noProof/>
+              </w:rPr>
+              <w:t>test_tc_1_9_soft_delete_returns_200_is_deleted_true</w:t>
+            </w:r>
+          </w:p>
+        </w:tc>
+        <w:tc>
+          <w:tcPr>
+            <w:tcW w:w="322" w:type="dxa"/>
+          </w:tcPr>
+          <w:p>
+            <w:pPr>
+              <w:spacing w:before="0" w:after="0" w:line="240" w:lineRule="auto"/>
+              <w:ind w:left="0" w:firstLine="0"/>
+              <w:suppressAutoHyphens/>
+            </w:pPr>
+            <w:r>
+              <w:rPr>
+                <w:rFonts w:ascii="Calibri" w:hAnsi="Calibri"/>
+                <w:b w:val="0"/>
+                <w:i w:val="0"/>
+                <w:sz w:val="24"/>
+                <w:noProof/>
+              </w:rPr>
+              <w:t>TC-1.9</w:t>
+            </w:r>
+          </w:p>
+        </w:tc>
+        <w:tc>
+          <w:tcPr>
+            <w:tcW w:w="645" w:type="dxa"/>
           </w:tcPr>
           <w:p>
             <w:pPr>
@@ -2432,23 +2432,23 @@
         </w:tc>
         <w:tc>
           <w:tcPr>
-            <w:tcW w:w="5493" w:type="dxa"/>
-          </w:tcPr>
-          <w:p>
-            <w:pPr>
-              <w:spacing w:before="0" w:after="0" w:line="240" w:lineRule="auto"/>
-              <w:ind w:left="0" w:firstLine="0"/>
-              <w:suppressAutoHyphens/>
-            </w:pPr>
-            <w:r>
-              <w:rPr>
-                <w:rFonts w:ascii="Calibri" w:hAnsi="Calibri"/>
-                <w:b w:val="0"/>
-                <w:i w:val="0"/>
-                <w:sz w:val="24"/>
-                <w:noProof/>
-              </w:rPr>
-              <w:t>GET /participants list excludes is_deleted=true records; compliance_officer audit endpoint returns them</w:t>
+            <w:tcW w:w="5433" w:type="dxa"/>
+          </w:tcPr>
+          <w:p>
+            <w:pPr>
+              <w:spacing w:before="0" w:after="0" w:line="240" w:lineRule="auto"/>
+              <w:ind w:left="0" w:firstLine="0"/>
+              <w:suppressAutoHyphens/>
+            </w:pPr>
+            <w:r>
+              <w:rPr>
+                <w:rFonts w:ascii="Calibri" w:hAnsi="Calibri"/>
+                <w:b w:val="0"/>
+                <w:i w:val="0"/>
+                <w:sz w:val="24"/>
+                <w:noProof/>
+              </w:rPr>
+              <w:t>DELETE returns 200 with is_deleted=true; subsequent GET by care_coordinator returns 404; row persists in DB</w:t>
             </w:r>
           </w:p>
         </w:tc>
@@ -2459,89 +2459,275 @@
         </w:trPr>
         <w:tc>
           <w:tcPr>
-            <w:tcW w:w="2570" w:type="dxa"/>
-          </w:tcPr>
-          <w:p>
-            <w:pPr>
-              <w:spacing w:before="0" w:after="0" w:line="240" w:lineRule="auto"/>
-              <w:ind w:left="0" w:firstLine="0"/>
-              <w:suppressAutoHyphens/>
-            </w:pPr>
-            <w:r>
-              <w:rPr>
-                <w:rFonts w:ascii="Calibri" w:hAnsi="Calibri"/>
-                <w:b w:val="0"/>
-                <w:i w:val="0"/>
-                <w:sz w:val="24"/>
-                <w:noProof/>
-              </w:rPr>
-              <w:t>test_1_10_optimistic_locking_version_conflict_returns_409</w:t>
-            </w:r>
-          </w:p>
-        </w:tc>
-        <w:tc>
-          <w:tcPr>
-            <w:tcW w:w="302" w:type="dxa"/>
-          </w:tcPr>
-          <w:p>
-            <w:pPr>
-              <w:spacing w:before="0" w:after="0" w:line="240" w:lineRule="auto"/>
-              <w:ind w:left="0" w:firstLine="0"/>
-              <w:suppressAutoHyphens/>
-            </w:pPr>
-            <w:r>
-              <w:rPr>
-                <w:rFonts w:ascii="Calibri" w:hAnsi="Calibri"/>
-                <w:b w:val="0"/>
-                <w:i w:val="0"/>
-                <w:sz w:val="24"/>
-                <w:noProof/>
-              </w:rPr>
-              <w:t>1.10</w:t>
-            </w:r>
-          </w:p>
-        </w:tc>
-        <w:tc>
-          <w:tcPr>
-            <w:tcW w:w="706" w:type="dxa"/>
-          </w:tcPr>
-          <w:p>
-            <w:pPr>
-              <w:spacing w:before="0" w:after="0" w:line="240" w:lineRule="auto"/>
-              <w:ind w:left="0" w:firstLine="0"/>
-              <w:suppressAutoHyphens/>
-            </w:pPr>
-            <w:r>
-              <w:rPr>
-                <w:rFonts w:ascii="Calibri" w:hAnsi="Calibri"/>
-                <w:b w:val="0"/>
-                <w:i w:val="0"/>
-                <w:sz w:val="24"/>
-                <w:noProof/>
-              </w:rPr>
-              <w:t>Business Rules</w:t>
-            </w:r>
-          </w:p>
-        </w:tc>
-        <w:tc>
-          <w:tcPr>
-            <w:tcW w:w="5493" w:type="dxa"/>
-          </w:tcPr>
-          <w:p>
-            <w:pPr>
-              <w:spacing w:before="0" w:after="0" w:line="240" w:lineRule="auto"/>
-              <w:ind w:left="0" w:firstLine="0"/>
-              <w:suppressAutoHyphens/>
-            </w:pPr>
-            <w:r>
-              <w:rPr>
-                <w:rFonts w:ascii="Calibri" w:hAnsi="Calibri"/>
-                <w:b w:val="0"/>
-                <w:i w:val="0"/>
-                <w:sz w:val="24"/>
-                <w:noProof/>
-              </w:rPr>
-              <w:t>PATCH with stale version returns 409 PARTICIPANT_VERSION_CONFLICT; correct version returns 200 with version n+1</w:t>
+            <w:tcW w:w="2671" w:type="dxa"/>
+          </w:tcPr>
+          <w:p>
+            <w:pPr>
+              <w:spacing w:before="0" w:after="0" w:line="240" w:lineRule="auto"/>
+              <w:ind w:left="0" w:firstLine="0"/>
+              <w:suppressAutoHyphens/>
+            </w:pPr>
+            <w:r>
+              <w:rPr>
+                <w:rFonts w:ascii="Calibri" w:hAnsi="Calibri"/>
+                <w:b w:val="0"/>
+                <w:i w:val="0"/>
+                <w:sz w:val="24"/>
+                <w:noProof/>
+              </w:rPr>
+              <w:t>test_tc_1_10_hard_delete_attempt_returns_405_record_persists</w:t>
+            </w:r>
+          </w:p>
+        </w:tc>
+        <w:tc>
+          <w:tcPr>
+            <w:tcW w:w="322" w:type="dxa"/>
+          </w:tcPr>
+          <w:p>
+            <w:pPr>
+              <w:spacing w:before="0" w:after="0" w:line="240" w:lineRule="auto"/>
+              <w:ind w:left="0" w:firstLine="0"/>
+              <w:suppressAutoHyphens/>
+            </w:pPr>
+            <w:r>
+              <w:rPr>
+                <w:rFonts w:ascii="Calibri" w:hAnsi="Calibri"/>
+                <w:b w:val="0"/>
+                <w:i w:val="0"/>
+                <w:sz w:val="24"/>
+                <w:noProof/>
+              </w:rPr>
+              <w:t>TC-1.10</w:t>
+            </w:r>
+          </w:p>
+        </w:tc>
+        <w:tc>
+          <w:tcPr>
+            <w:tcW w:w="645" w:type="dxa"/>
+          </w:tcPr>
+          <w:p>
+            <w:pPr>
+              <w:spacing w:before="0" w:after="0" w:line="240" w:lineRule="auto"/>
+              <w:ind w:left="0" w:firstLine="0"/>
+              <w:suppressAutoHyphens/>
+            </w:pPr>
+            <w:r>
+              <w:rPr>
+                <w:rFonts w:ascii="Calibri" w:hAnsi="Calibri"/>
+                <w:b w:val="0"/>
+                <w:i w:val="0"/>
+                <w:sz w:val="24"/>
+                <w:noProof/>
+              </w:rPr>
+              <w:t>API</w:t>
+            </w:r>
+          </w:p>
+        </w:tc>
+        <w:tc>
+          <w:tcPr>
+            <w:tcW w:w="5433" w:type="dxa"/>
+          </w:tcPr>
+          <w:p>
+            <w:pPr>
+              <w:spacing w:before="0" w:after="0" w:line="240" w:lineRule="auto"/>
+              <w:ind w:left="0" w:firstLine="0"/>
+              <w:suppressAutoHyphens/>
+            </w:pPr>
+            <w:r>
+              <w:rPr>
+                <w:rFonts w:ascii="Calibri" w:hAnsi="Calibri"/>
+                <w:b w:val="0"/>
+                <w:i w:val="0"/>
+                <w:sz w:val="24"/>
+                <w:noProof/>
+              </w:rPr>
+              <w:t>DELETE /hard returns 405 HARD_DELETE_NOT_PERMITTED; record remains retrievable and row persists in DB</w:t>
+            </w:r>
+          </w:p>
+        </w:tc>
+      </w:tr>
+      <w:tr>
+        <w:trPr>
+          <w:cantSplit w:val="true"/>
+        </w:trPr>
+        <w:tc>
+          <w:tcPr>
+            <w:tcW w:w="2671" w:type="dxa"/>
+          </w:tcPr>
+          <w:p>
+            <w:pPr>
+              <w:spacing w:before="0" w:after="0" w:line="240" w:lineRule="auto"/>
+              <w:ind w:left="0" w:firstLine="0"/>
+              <w:suppressAutoHyphens/>
+            </w:pPr>
+            <w:r>
+              <w:rPr>
+                <w:rFonts w:ascii="Calibri" w:hAnsi="Calibri"/>
+                <w:b w:val="0"/>
+                <w:i w:val="0"/>
+                <w:sz w:val="24"/>
+                <w:noProof/>
+              </w:rPr>
+              <w:t>test_tc_1_11_missing_first_name_returns_400_with_field_name</w:t>
+            </w:r>
+          </w:p>
+        </w:tc>
+        <w:tc>
+          <w:tcPr>
+            <w:tcW w:w="322" w:type="dxa"/>
+          </w:tcPr>
+          <w:p>
+            <w:pPr>
+              <w:spacing w:before="0" w:after="0" w:line="240" w:lineRule="auto"/>
+              <w:ind w:left="0" w:firstLine="0"/>
+              <w:suppressAutoHyphens/>
+            </w:pPr>
+            <w:r>
+              <w:rPr>
+                <w:rFonts w:ascii="Calibri" w:hAnsi="Calibri"/>
+                <w:b w:val="0"/>
+                <w:i w:val="0"/>
+                <w:sz w:val="24"/>
+                <w:noProof/>
+              </w:rPr>
+              <w:t>TC-1.11</w:t>
+            </w:r>
+          </w:p>
+        </w:tc>
+        <w:tc>
+          <w:tcPr>
+            <w:tcW w:w="645" w:type="dxa"/>
+          </w:tcPr>
+          <w:p>
+            <w:pPr>
+              <w:spacing w:before="0" w:after="0" w:line="240" w:lineRule="auto"/>
+              <w:ind w:left="0" w:firstLine="0"/>
+              <w:suppressAutoHyphens/>
+            </w:pPr>
+            <w:r>
+              <w:rPr>
+                <w:rFonts w:ascii="Calibri" w:hAnsi="Calibri"/>
+                <w:b w:val="0"/>
+                <w:i w:val="0"/>
+                <w:sz w:val="24"/>
+                <w:noProof/>
+              </w:rPr>
+              <w:t>API</w:t>
+            </w:r>
+          </w:p>
+        </w:tc>
+        <w:tc>
+          <w:tcPr>
+            <w:tcW w:w="5433" w:type="dxa"/>
+          </w:tcPr>
+          <w:p>
+            <w:pPr>
+              <w:spacing w:before="0" w:after="0" w:line="240" w:lineRule="auto"/>
+              <w:ind w:left="0" w:firstLine="0"/>
+              <w:suppressAutoHyphens/>
+            </w:pPr>
+            <w:r>
+              <w:rPr>
+                <w:rFonts w:ascii="Calibri" w:hAnsi="Calibri"/>
+                <w:b w:val="0"/>
+                <w:i w:val="0"/>
+                <w:sz w:val="24"/>
+                <w:noProof/>
+              </w:rPr>
+              <w:t>POST without first_name returns 400 or 422 identifying first_name in the error; no participant row created</w:t>
+            </w:r>
+          </w:p>
+        </w:tc>
+      </w:tr>
+      <w:tr>
+        <w:trPr>
+          <w:cantSplit w:val="true"/>
+        </w:trPr>
+        <w:tc>
+          <w:tcPr>
+            <w:tcW w:w="2671" w:type="dxa"/>
+          </w:tcPr>
+          <w:p>
+            <w:pPr>
+              <w:spacing w:before="0" w:after="0" w:line="240" w:lineRule="auto"/>
+              <w:ind w:left="0" w:firstLine="0"/>
+              <w:suppressAutoHyphens/>
+            </w:pPr>
+            <w:r>
+              <w:rPr>
+                <w:rFonts w:ascii="Calibri" w:hAnsi="Calibri"/>
+                <w:b w:val="0"/>
+                <w:i w:val="0"/>
+                <w:sz w:val="24"/>
+                <w:noProof/>
+              </w:rPr>
+              <w:t>test_tc_1_12_missing_enrollment_date_returns_400_with_field_name</w:t>
+            </w:r>
+          </w:p>
+        </w:tc>
+        <w:tc>
+          <w:tcPr>
+            <w:tcW w:w="322" w:type="dxa"/>
+          </w:tcPr>
+          <w:p>
+            <w:pPr>
+              <w:spacing w:before="0" w:after="0" w:line="240" w:lineRule="auto"/>
+              <w:ind w:left="0" w:firstLine="0"/>
+              <w:suppressAutoHyphens/>
+            </w:pPr>
+            <w:r>
+              <w:rPr>
+                <w:rFonts w:ascii="Calibri" w:hAnsi="Calibri"/>
+                <w:b w:val="0"/>
+                <w:i w:val="0"/>
+                <w:sz w:val="24"/>
+                <w:noProof/>
+              </w:rPr>
+              <w:t>TC-1.12</w:t>
+            </w:r>
+          </w:p>
+        </w:tc>
+        <w:tc>
+          <w:tcPr>
+            <w:tcW w:w="645" w:type="dxa"/>
+          </w:tcPr>
+          <w:p>
+            <w:pPr>
+              <w:spacing w:before="0" w:after="0" w:line="240" w:lineRule="auto"/>
+              <w:ind w:left="0" w:firstLine="0"/>
+              <w:suppressAutoHyphens/>
+            </w:pPr>
+            <w:r>
+              <w:rPr>
+                <w:rFonts w:ascii="Calibri" w:hAnsi="Calibri"/>
+                <w:b w:val="0"/>
+                <w:i w:val="0"/>
+                <w:sz w:val="24"/>
+                <w:noProof/>
+              </w:rPr>
+              <w:t>API</w:t>
+            </w:r>
+          </w:p>
+        </w:tc>
+        <w:tc>
+          <w:tcPr>
+            <w:tcW w:w="5433" w:type="dxa"/>
+          </w:tcPr>
+          <w:p>
+            <w:pPr>
+              <w:spacing w:before="0" w:after="0" w:line="240" w:lineRule="auto"/>
+              <w:ind w:left="0" w:firstLine="0"/>
+              <w:suppressAutoHyphens/>
+            </w:pPr>
+            <w:r>
+              <w:rPr>
+                <w:rFonts w:ascii="Calibri" w:hAnsi="Calibri"/>
+                <w:b w:val="0"/>
+                <w:i w:val="0"/>
+                <w:sz w:val="24"/>
+                <w:noProof/>
+              </w:rPr>
+              <w:t>POST without enrollment_date returns 400 identifying enrollment_date in the error; no participant row created</w:t>
             </w:r>
           </w:p>
         </w:tc>
@@ -2562,7 +2748,7 @@
           <w:sz w:val="26"/>
           <w:noProof/>
         </w:rPr>
-        <w:t>2.2 test_user.py - User (12 tests)</w:t>
+        <w:t>2.2 test_user.py - User (13 tests)</w:t>
       </w:r>
     </w:p>
     <w:tbl>
@@ -2580,10 +2766,10 @@
         </w:tblBorders>
       </w:tblPr>
       <w:tblGrid>
-        <w:gridCol w:w="2279"/>
-        <w:gridCol w:w="279"/>
-        <w:gridCol w:w="651"/>
-        <w:gridCol w:w="5861"/>
+        <w:gridCol w:w="2411"/>
+        <w:gridCol w:w="286"/>
+        <w:gridCol w:w="572"/>
+        <w:gridCol w:w="5802"/>
       </w:tblGrid>
       <w:tr>
         <w:trPr>
@@ -2591,7 +2777,7 @@
         </w:trPr>
         <w:tc>
           <w:tcPr>
-            <w:tcW w:w="2279" w:type="dxa"/>
+            <w:tcW w:w="2411" w:type="dxa"/>
           </w:tcPr>
           <w:p>
             <w:pPr>
@@ -2613,7 +2799,7 @@
         </w:tc>
         <w:tc>
           <w:tcPr>
-            <w:tcW w:w="279" w:type="dxa"/>
+            <w:tcW w:w="286" w:type="dxa"/>
           </w:tcPr>
           <w:p>
             <w:pPr>
@@ -2629,13 +2815,13 @@
                 <w:sz w:val="24"/>
                 <w:noProof/>
               </w:rPr>
-              <w:t>REQ_ID</w:t>
-            </w:r>
-          </w:p>
-        </w:tc>
-        <w:tc>
-          <w:tcPr>
-            <w:tcW w:w="651" w:type="dxa"/>
+              <w:t>TC</w:t>
+            </w:r>
+          </w:p>
+        </w:tc>
+        <w:tc>
+          <w:tcPr>
+            <w:tcW w:w="572" w:type="dxa"/>
           </w:tcPr>
           <w:p>
             <w:pPr>
@@ -2657,7 +2843,7 @@
         </w:tc>
         <w:tc>
           <w:tcPr>
-            <w:tcW w:w="5861" w:type="dxa"/>
+            <w:tcW w:w="5802" w:type="dxa"/>
           </w:tcPr>
           <w:p>
             <w:pPr>
@@ -2684,51 +2870,51 @@
         </w:trPr>
         <w:tc>
           <w:tcPr>
-            <w:tcW w:w="2279" w:type="dxa"/>
-          </w:tcPr>
-          <w:p>
-            <w:pPr>
-              <w:spacing w:before="0" w:after="0" w:line="240" w:lineRule="auto"/>
-              <w:ind w:left="0" w:firstLine="0"/>
-              <w:suppressAutoHyphens/>
-            </w:pPr>
-            <w:r>
-              <w:rPr>
-                <w:rFonts w:ascii="Calibri" w:hAnsi="Calibri"/>
-                <w:b w:val="0"/>
-                <w:i w:val="0"/>
-                <w:sz w:val="24"/>
-                <w:noProof/>
-              </w:rPr>
-              <w:t>test_2_1_unique_email_per_tenant</w:t>
-            </w:r>
-          </w:p>
-        </w:tc>
-        <w:tc>
-          <w:tcPr>
-            <w:tcW w:w="279" w:type="dxa"/>
-          </w:tcPr>
-          <w:p>
-            <w:pPr>
-              <w:spacing w:before="0" w:after="0" w:line="240" w:lineRule="auto"/>
-              <w:ind w:left="0" w:firstLine="0"/>
-              <w:suppressAutoHyphens/>
-            </w:pPr>
-            <w:r>
-              <w:rPr>
-                <w:rFonts w:ascii="Calibri" w:hAnsi="Calibri"/>
-                <w:b w:val="0"/>
-                <w:i w:val="0"/>
-                <w:sz w:val="24"/>
-                <w:noProof/>
-              </w:rPr>
-              <w:t>2.1</w:t>
-            </w:r>
-          </w:p>
-        </w:tc>
-        <w:tc>
-          <w:tcPr>
-            <w:tcW w:w="651" w:type="dxa"/>
+            <w:tcW w:w="2411" w:type="dxa"/>
+          </w:tcPr>
+          <w:p>
+            <w:pPr>
+              <w:spacing w:before="0" w:after="0" w:line="240" w:lineRule="auto"/>
+              <w:ind w:left="0" w:firstLine="0"/>
+              <w:suppressAutoHyphens/>
+            </w:pPr>
+            <w:r>
+              <w:rPr>
+                <w:rFonts w:ascii="Calibri" w:hAnsi="Calibri"/>
+                <w:b w:val="0"/>
+                <w:i w:val="0"/>
+                <w:sz w:val="24"/>
+                <w:noProof/>
+              </w:rPr>
+              <w:t>test_tc_2_1_positive_user_creation_by_program_administrator</w:t>
+            </w:r>
+          </w:p>
+        </w:tc>
+        <w:tc>
+          <w:tcPr>
+            <w:tcW w:w="286" w:type="dxa"/>
+          </w:tcPr>
+          <w:p>
+            <w:pPr>
+              <w:spacing w:before="0" w:after="0" w:line="240" w:lineRule="auto"/>
+              <w:ind w:left="0" w:firstLine="0"/>
+              <w:suppressAutoHyphens/>
+            </w:pPr>
+            <w:r>
+              <w:rPr>
+                <w:rFonts w:ascii="Calibri" w:hAnsi="Calibri"/>
+                <w:b w:val="0"/>
+                <w:i w:val="0"/>
+                <w:sz w:val="24"/>
+                <w:noProof/>
+              </w:rPr>
+              <w:t>TC-2.1</w:t>
+            </w:r>
+          </w:p>
+        </w:tc>
+        <w:tc>
+          <w:tcPr>
+            <w:tcW w:w="572" w:type="dxa"/>
           </w:tcPr>
           <w:p>
             <w:pPr>
@@ -2750,23 +2936,23 @@
         </w:tc>
         <w:tc>
           <w:tcPr>
-            <w:tcW w:w="5861" w:type="dxa"/>
-          </w:tcPr>
-          <w:p>
-            <w:pPr>
-              <w:spacing w:before="0" w:after="0" w:line="240" w:lineRule="auto"/>
-              <w:ind w:left="0" w:firstLine="0"/>
-              <w:suppressAutoHyphens/>
-            </w:pPr>
-            <w:r>
-              <w:rPr>
-                <w:rFonts w:ascii="Calibri" w:hAnsi="Calibri"/>
-                <w:b w:val="0"/>
-                <w:i w:val="0"/>
-                <w:sz w:val="24"/>
-                <w:noProof/>
-              </w:rPr>
-              <w:t>POST with email already in same tenant returns 409 USER_DUPLICATE_EMAIL; same email in other tenant returns 201</w:t>
+            <w:tcW w:w="5802" w:type="dxa"/>
+          </w:tcPr>
+          <w:p>
+            <w:pPr>
+              <w:spacing w:before="0" w:after="0" w:line="240" w:lineRule="auto"/>
+              <w:ind w:left="0" w:firstLine="0"/>
+              <w:suppressAutoHyphens/>
+            </w:pPr>
+            <w:r>
+              <w:rPr>
+                <w:rFonts w:ascii="Calibri" w:hAnsi="Calibri"/>
+                <w:b w:val="0"/>
+                <w:i w:val="0"/>
+                <w:sz w:val="24"/>
+                <w:noProof/>
+              </w:rPr>
+              <w:t>POST /users by program_administrator returns 201 with all required fields and status active</w:t>
             </w:r>
           </w:p>
         </w:tc>
@@ -2777,89 +2963,89 @@
         </w:trPr>
         <w:tc>
           <w:tcPr>
-            <w:tcW w:w="2279" w:type="dxa"/>
-          </w:tcPr>
-          <w:p>
-            <w:pPr>
-              <w:spacing w:before="0" w:after="0" w:line="240" w:lineRule="auto"/>
-              <w:ind w:left="0" w:firstLine="0"/>
-              <w:suppressAutoHyphens/>
-            </w:pPr>
-            <w:r>
-              <w:rPr>
-                <w:rFonts w:ascii="Calibri" w:hAnsi="Calibri"/>
-                <w:b w:val="0"/>
-                <w:i w:val="0"/>
-                <w:sz w:val="24"/>
-                <w:noProof/>
-              </w:rPr>
-              <w:t>test_2_2_unique_user_id_globally</w:t>
-            </w:r>
-          </w:p>
-        </w:tc>
-        <w:tc>
-          <w:tcPr>
-            <w:tcW w:w="279" w:type="dxa"/>
-          </w:tcPr>
-          <w:p>
-            <w:pPr>
-              <w:spacing w:before="0" w:after="0" w:line="240" w:lineRule="auto"/>
-              <w:ind w:left="0" w:firstLine="0"/>
-              <w:suppressAutoHyphens/>
-            </w:pPr>
-            <w:r>
-              <w:rPr>
-                <w:rFonts w:ascii="Calibri" w:hAnsi="Calibri"/>
-                <w:b w:val="0"/>
-                <w:i w:val="0"/>
-                <w:sz w:val="24"/>
-                <w:noProof/>
-              </w:rPr>
-              <w:t>2.2</w:t>
-            </w:r>
-          </w:p>
-        </w:tc>
-        <w:tc>
-          <w:tcPr>
-            <w:tcW w:w="651" w:type="dxa"/>
-          </w:tcPr>
-          <w:p>
-            <w:pPr>
-              <w:spacing w:before="0" w:after="0" w:line="240" w:lineRule="auto"/>
-              <w:ind w:left="0" w:firstLine="0"/>
-              <w:suppressAutoHyphens/>
-            </w:pPr>
-            <w:r>
-              <w:rPr>
-                <w:rFonts w:ascii="Calibri" w:hAnsi="Calibri"/>
-                <w:b w:val="0"/>
-                <w:i w:val="0"/>
-                <w:sz w:val="24"/>
-                <w:noProof/>
-              </w:rPr>
-              <w:t>DB</w:t>
-            </w:r>
-          </w:p>
-        </w:tc>
-        <w:tc>
-          <w:tcPr>
-            <w:tcW w:w="5861" w:type="dxa"/>
-          </w:tcPr>
-          <w:p>
-            <w:pPr>
-              <w:spacing w:before="0" w:after="0" w:line="240" w:lineRule="auto"/>
-              <w:ind w:left="0" w:firstLine="0"/>
-              <w:suppressAutoHyphens/>
-            </w:pPr>
-            <w:r>
-              <w:rPr>
-                <w:rFonts w:ascii="Calibri" w:hAnsi="Calibri"/>
-                <w:b w:val="0"/>
-                <w:i w:val="0"/>
-                <w:sz w:val="24"/>
-                <w:noProof/>
-              </w:rPr>
-              <w:t>UNIQUE index on user_id confirmed via PRAGMA; no two rows share user_id across tenants</w:t>
+            <w:tcW w:w="2411" w:type="dxa"/>
+          </w:tcPr>
+          <w:p>
+            <w:pPr>
+              <w:spacing w:before="0" w:after="0" w:line="240" w:lineRule="auto"/>
+              <w:ind w:left="0" w:firstLine="0"/>
+              <w:suppressAutoHyphens/>
+            </w:pPr>
+            <w:r>
+              <w:rPr>
+                <w:rFonts w:ascii="Calibri" w:hAnsi="Calibri"/>
+                <w:b w:val="0"/>
+                <w:i w:val="0"/>
+                <w:sz w:val="24"/>
+                <w:noProof/>
+              </w:rPr>
+              <w:t>test_tc_2_2_user_creation_by_unauthorized_role_returns_403</w:t>
+            </w:r>
+          </w:p>
+        </w:tc>
+        <w:tc>
+          <w:tcPr>
+            <w:tcW w:w="286" w:type="dxa"/>
+          </w:tcPr>
+          <w:p>
+            <w:pPr>
+              <w:spacing w:before="0" w:after="0" w:line="240" w:lineRule="auto"/>
+              <w:ind w:left="0" w:firstLine="0"/>
+              <w:suppressAutoHyphens/>
+            </w:pPr>
+            <w:r>
+              <w:rPr>
+                <w:rFonts w:ascii="Calibri" w:hAnsi="Calibri"/>
+                <w:b w:val="0"/>
+                <w:i w:val="0"/>
+                <w:sz w:val="24"/>
+                <w:noProof/>
+              </w:rPr>
+              <w:t>TC-2.2</w:t>
+            </w:r>
+          </w:p>
+        </w:tc>
+        <w:tc>
+          <w:tcPr>
+            <w:tcW w:w="572" w:type="dxa"/>
+          </w:tcPr>
+          <w:p>
+            <w:pPr>
+              <w:spacing w:before="0" w:after="0" w:line="240" w:lineRule="auto"/>
+              <w:ind w:left="0" w:firstLine="0"/>
+              <w:suppressAutoHyphens/>
+            </w:pPr>
+            <w:r>
+              <w:rPr>
+                <w:rFonts w:ascii="Calibri" w:hAnsi="Calibri"/>
+                <w:b w:val="0"/>
+                <w:i w:val="0"/>
+                <w:sz w:val="24"/>
+                <w:noProof/>
+              </w:rPr>
+              <w:t>API</w:t>
+            </w:r>
+          </w:p>
+        </w:tc>
+        <w:tc>
+          <w:tcPr>
+            <w:tcW w:w="5802" w:type="dxa"/>
+          </w:tcPr>
+          <w:p>
+            <w:pPr>
+              <w:spacing w:before="0" w:after="0" w:line="240" w:lineRule="auto"/>
+              <w:ind w:left="0" w:firstLine="0"/>
+              <w:suppressAutoHyphens/>
+            </w:pPr>
+            <w:r>
+              <w:rPr>
+                <w:rFonts w:ascii="Calibri" w:hAnsi="Calibri"/>
+                <w:b w:val="0"/>
+                <w:i w:val="0"/>
+                <w:sz w:val="24"/>
+                <w:noProof/>
+              </w:rPr>
+              <w:t>POST /users by care_coordinator returns 403; no user row created in DB</w:t>
             </w:r>
           </w:p>
         </w:tc>
@@ -2870,89 +3056,89 @@
         </w:trPr>
         <w:tc>
           <w:tcPr>
-            <w:tcW w:w="2279" w:type="dxa"/>
-          </w:tcPr>
-          <w:p>
-            <w:pPr>
-              <w:spacing w:before="0" w:after="0" w:line="240" w:lineRule="auto"/>
-              <w:ind w:left="0" w:firstLine="0"/>
-              <w:suppressAutoHyphens/>
-            </w:pPr>
-            <w:r>
-              <w:rPr>
-                <w:rFonts w:ascii="Calibri" w:hAnsi="Calibri"/>
-                <w:b w:val="0"/>
-                <w:i w:val="0"/>
-                <w:sz w:val="24"/>
-                <w:noProof/>
-              </w:rPr>
-              <w:t>test_2_3_rbac_evaluation_order_tenant_status_role</w:t>
-            </w:r>
-          </w:p>
-        </w:tc>
-        <w:tc>
-          <w:tcPr>
-            <w:tcW w:w="279" w:type="dxa"/>
-          </w:tcPr>
-          <w:p>
-            <w:pPr>
-              <w:spacing w:before="0" w:after="0" w:line="240" w:lineRule="auto"/>
-              <w:ind w:left="0" w:firstLine="0"/>
-              <w:suppressAutoHyphens/>
-            </w:pPr>
-            <w:r>
-              <w:rPr>
-                <w:rFonts w:ascii="Calibri" w:hAnsi="Calibri"/>
-                <w:b w:val="0"/>
-                <w:i w:val="0"/>
-                <w:sz w:val="24"/>
-                <w:noProof/>
-              </w:rPr>
-              <w:t>2.3</w:t>
-            </w:r>
-          </w:p>
-        </w:tc>
-        <w:tc>
-          <w:tcPr>
-            <w:tcW w:w="651" w:type="dxa"/>
-          </w:tcPr>
-          <w:p>
-            <w:pPr>
-              <w:spacing w:before="0" w:after="0" w:line="240" w:lineRule="auto"/>
-              <w:ind w:left="0" w:firstLine="0"/>
-              <w:suppressAutoHyphens/>
-            </w:pPr>
-            <w:r>
-              <w:rPr>
-                <w:rFonts w:ascii="Calibri" w:hAnsi="Calibri"/>
-                <w:b w:val="0"/>
-                <w:i w:val="0"/>
-                <w:sz w:val="24"/>
-                <w:noProof/>
-              </w:rPr>
-              <w:t>Business Rules</w:t>
-            </w:r>
-          </w:p>
-        </w:tc>
-        <w:tc>
-          <w:tcPr>
-            <w:tcW w:w="5861" w:type="dxa"/>
-          </w:tcPr>
-          <w:p>
-            <w:pPr>
-              <w:spacing w:before="0" w:after="0" w:line="240" w:lineRule="auto"/>
-              <w:ind w:left="0" w:firstLine="0"/>
-              <w:suppressAutoHyphens/>
-            </w:pPr>
-            <w:r>
-              <w:rPr>
-                <w:rFonts w:ascii="Calibri" w:hAnsi="Calibri"/>
-                <w:b w:val="0"/>
-                <w:i w:val="0"/>
-                <w:sz w:val="24"/>
-                <w:noProof/>
-              </w:rPr>
-              <w:t>Inactive user returns 403 before role is checked; mismatched tenant_id returns 403 before role is checked</w:t>
+            <w:tcW w:w="2411" w:type="dxa"/>
+          </w:tcPr>
+          <w:p>
+            <w:pPr>
+              <w:spacing w:before="0" w:after="0" w:line="240" w:lineRule="auto"/>
+              <w:ind w:left="0" w:firstLine="0"/>
+              <w:suppressAutoHyphens/>
+            </w:pPr>
+            <w:r>
+              <w:rPr>
+                <w:rFonts w:ascii="Calibri" w:hAnsi="Calibri"/>
+                <w:b w:val="0"/>
+                <w:i w:val="0"/>
+                <w:sz w:val="24"/>
+                <w:noProof/>
+              </w:rPr>
+              <w:t>test_tc_2_3_positive_login_valid_credentials_returns_200</w:t>
+            </w:r>
+          </w:p>
+        </w:tc>
+        <w:tc>
+          <w:tcPr>
+            <w:tcW w:w="286" w:type="dxa"/>
+          </w:tcPr>
+          <w:p>
+            <w:pPr>
+              <w:spacing w:before="0" w:after="0" w:line="240" w:lineRule="auto"/>
+              <w:ind w:left="0" w:firstLine="0"/>
+              <w:suppressAutoHyphens/>
+            </w:pPr>
+            <w:r>
+              <w:rPr>
+                <w:rFonts w:ascii="Calibri" w:hAnsi="Calibri"/>
+                <w:b w:val="0"/>
+                <w:i w:val="0"/>
+                <w:sz w:val="24"/>
+                <w:noProof/>
+              </w:rPr>
+              <w:t>TC-2.3</w:t>
+            </w:r>
+          </w:p>
+        </w:tc>
+        <w:tc>
+          <w:tcPr>
+            <w:tcW w:w="572" w:type="dxa"/>
+          </w:tcPr>
+          <w:p>
+            <w:pPr>
+              <w:spacing w:before="0" w:after="0" w:line="240" w:lineRule="auto"/>
+              <w:ind w:left="0" w:firstLine="0"/>
+              <w:suppressAutoHyphens/>
+            </w:pPr>
+            <w:r>
+              <w:rPr>
+                <w:rFonts w:ascii="Calibri" w:hAnsi="Calibri"/>
+                <w:b w:val="0"/>
+                <w:i w:val="0"/>
+                <w:sz w:val="24"/>
+                <w:noProof/>
+              </w:rPr>
+              <w:t>API</w:t>
+            </w:r>
+          </w:p>
+        </w:tc>
+        <w:tc>
+          <w:tcPr>
+            <w:tcW w:w="5802" w:type="dxa"/>
+          </w:tcPr>
+          <w:p>
+            <w:pPr>
+              <w:spacing w:before="0" w:after="0" w:line="240" w:lineRule="auto"/>
+              <w:ind w:left="0" w:firstLine="0"/>
+              <w:suppressAutoHyphens/>
+            </w:pPr>
+            <w:r>
+              <w:rPr>
+                <w:rFonts w:ascii="Calibri" w:hAnsi="Calibri"/>
+                <w:b w:val="0"/>
+                <w:i w:val="0"/>
+                <w:sz w:val="24"/>
+                <w:noProof/>
+              </w:rPr>
+              <w:t>POST /login with valid user_id and correct password returns 200 with status ok; last_login_at updated in DB</w:t>
             </w:r>
           </w:p>
         </w:tc>
@@ -2963,51 +3149,51 @@
         </w:trPr>
         <w:tc>
           <w:tcPr>
-            <w:tcW w:w="2279" w:type="dxa"/>
-          </w:tcPr>
-          <w:p>
-            <w:pPr>
-              <w:spacing w:before="0" w:after="0" w:line="240" w:lineRule="auto"/>
-              <w:ind w:left="0" w:firstLine="0"/>
-              <w:suppressAutoHyphens/>
-            </w:pPr>
-            <w:r>
-              <w:rPr>
-                <w:rFonts w:ascii="Calibri" w:hAnsi="Calibri"/>
-                <w:b w:val="0"/>
-                <w:i w:val="0"/>
-                <w:sz w:val="24"/>
-                <w:noProof/>
-              </w:rPr>
-              <w:t>test_2_4_mfa_required_for_phi_accessing_roles</w:t>
-            </w:r>
-          </w:p>
-        </w:tc>
-        <w:tc>
-          <w:tcPr>
-            <w:tcW w:w="279" w:type="dxa"/>
-          </w:tcPr>
-          <w:p>
-            <w:pPr>
-              <w:spacing w:before="0" w:after="0" w:line="240" w:lineRule="auto"/>
-              <w:ind w:left="0" w:firstLine="0"/>
-              <w:suppressAutoHyphens/>
-            </w:pPr>
-            <w:r>
-              <w:rPr>
-                <w:rFonts w:ascii="Calibri" w:hAnsi="Calibri"/>
-                <w:b w:val="0"/>
-                <w:i w:val="0"/>
-                <w:sz w:val="24"/>
-                <w:noProof/>
-              </w:rPr>
-              <w:t>2.4</w:t>
-            </w:r>
-          </w:p>
-        </w:tc>
-        <w:tc>
-          <w:tcPr>
-            <w:tcW w:w="651" w:type="dxa"/>
+            <w:tcW w:w="2411" w:type="dxa"/>
+          </w:tcPr>
+          <w:p>
+            <w:pPr>
+              <w:spacing w:before="0" w:after="0" w:line="240" w:lineRule="auto"/>
+              <w:ind w:left="0" w:firstLine="0"/>
+              <w:suppressAutoHyphens/>
+            </w:pPr>
+            <w:r>
+              <w:rPr>
+                <w:rFonts w:ascii="Calibri" w:hAnsi="Calibri"/>
+                <w:b w:val="0"/>
+                <w:i w:val="0"/>
+                <w:sz w:val="24"/>
+                <w:noProof/>
+              </w:rPr>
+              <w:t>test_tc_2_4_login_wrong_password_returns_401_no_credential_disclosure</w:t>
+            </w:r>
+          </w:p>
+        </w:tc>
+        <w:tc>
+          <w:tcPr>
+            <w:tcW w:w="286" w:type="dxa"/>
+          </w:tcPr>
+          <w:p>
+            <w:pPr>
+              <w:spacing w:before="0" w:after="0" w:line="240" w:lineRule="auto"/>
+              <w:ind w:left="0" w:firstLine="0"/>
+              <w:suppressAutoHyphens/>
+            </w:pPr>
+            <w:r>
+              <w:rPr>
+                <w:rFonts w:ascii="Calibri" w:hAnsi="Calibri"/>
+                <w:b w:val="0"/>
+                <w:i w:val="0"/>
+                <w:sz w:val="24"/>
+                <w:noProof/>
+              </w:rPr>
+              <w:t>TC-2.4</w:t>
+            </w:r>
+          </w:p>
+        </w:tc>
+        <w:tc>
+          <w:tcPr>
+            <w:tcW w:w="572" w:type="dxa"/>
           </w:tcPr>
           <w:p>
             <w:pPr>
@@ -3029,23 +3215,23 @@
         </w:tc>
         <w:tc>
           <w:tcPr>
-            <w:tcW w:w="5861" w:type="dxa"/>
-          </w:tcPr>
-          <w:p>
-            <w:pPr>
-              <w:spacing w:before="0" w:after="0" w:line="240" w:lineRule="auto"/>
-              <w:ind w:left="0" w:firstLine="0"/>
-              <w:suppressAutoHyphens/>
-            </w:pPr>
-            <w:r>
-              <w:rPr>
-                <w:rFonts w:ascii="Calibri" w:hAnsi="Calibri"/>
-                <w:b w:val="0"/>
-                <w:i w:val="0"/>
-                <w:sz w:val="24"/>
-                <w:noProof/>
-              </w:rPr>
-              <w:t>PHI module request from user with mfa_enabled=false returns 403 with MFA enrollment redirect</w:t>
+            <w:tcW w:w="5802" w:type="dxa"/>
+          </w:tcPr>
+          <w:p>
+            <w:pPr>
+              <w:spacing w:before="0" w:after="0" w:line="240" w:lineRule="auto"/>
+              <w:ind w:left="0" w:firstLine="0"/>
+              <w:suppressAutoHyphens/>
+            </w:pPr>
+            <w:r>
+              <w:rPr>
+                <w:rFonts w:ascii="Calibri" w:hAnsi="Calibri"/>
+                <w:b w:val="0"/>
+                <w:i w:val="0"/>
+                <w:sz w:val="24"/>
+                <w:noProof/>
+              </w:rPr>
+              <w:t>POST /login with wrong non-empty password returns 401; message does not reveal email, user_id, or password; failed_login_count incremented in DB</w:t>
             </w:r>
           </w:p>
         </w:tc>
@@ -3056,89 +3242,89 @@
         </w:trPr>
         <w:tc>
           <w:tcPr>
-            <w:tcW w:w="2279" w:type="dxa"/>
-          </w:tcPr>
-          <w:p>
-            <w:pPr>
-              <w:spacing w:before="0" w:after="0" w:line="240" w:lineRule="auto"/>
-              <w:ind w:left="0" w:firstLine="0"/>
-              <w:suppressAutoHyphens/>
-            </w:pPr>
-            <w:r>
-              <w:rPr>
-                <w:rFonts w:ascii="Calibri" w:hAnsi="Calibri"/>
-                <w:b w:val="0"/>
-                <w:i w:val="0"/>
-                <w:sz w:val="24"/>
-                <w:noProof/>
-              </w:rPr>
-              <w:t>test_2_5_account_locked_after_five_failed_logins</w:t>
-            </w:r>
-          </w:p>
-        </w:tc>
-        <w:tc>
-          <w:tcPr>
-            <w:tcW w:w="279" w:type="dxa"/>
-          </w:tcPr>
-          <w:p>
-            <w:pPr>
-              <w:spacing w:before="0" w:after="0" w:line="240" w:lineRule="auto"/>
-              <w:ind w:left="0" w:firstLine="0"/>
-              <w:suppressAutoHyphens/>
-            </w:pPr>
-            <w:r>
-              <w:rPr>
-                <w:rFonts w:ascii="Calibri" w:hAnsi="Calibri"/>
-                <w:b w:val="0"/>
-                <w:i w:val="0"/>
-                <w:sz w:val="24"/>
-                <w:noProof/>
-              </w:rPr>
-              <w:t>2.5</w:t>
-            </w:r>
-          </w:p>
-        </w:tc>
-        <w:tc>
-          <w:tcPr>
-            <w:tcW w:w="651" w:type="dxa"/>
-          </w:tcPr>
-          <w:p>
-            <w:pPr>
-              <w:spacing w:before="0" w:after="0" w:line="240" w:lineRule="auto"/>
-              <w:ind w:left="0" w:firstLine="0"/>
-              <w:suppressAutoHyphens/>
-            </w:pPr>
-            <w:r>
-              <w:rPr>
-                <w:rFonts w:ascii="Calibri" w:hAnsi="Calibri"/>
-                <w:b w:val="0"/>
-                <w:i w:val="0"/>
-                <w:sz w:val="24"/>
-                <w:noProof/>
-              </w:rPr>
-              <w:t>Business Rules</w:t>
-            </w:r>
-          </w:p>
-        </w:tc>
-        <w:tc>
-          <w:tcPr>
-            <w:tcW w:w="5861" w:type="dxa"/>
-          </w:tcPr>
-          <w:p>
-            <w:pPr>
-              <w:spacing w:before="0" w:after="0" w:line="240" w:lineRule="auto"/>
-              <w:ind w:left="0" w:firstLine="0"/>
-              <w:suppressAutoHyphens/>
-            </w:pPr>
-            <w:r>
-              <w:rPr>
-                <w:rFonts w:ascii="Calibri" w:hAnsi="Calibri"/>
-                <w:b w:val="0"/>
-                <w:i w:val="0"/>
-                <w:sz w:val="24"/>
-                <w:noProof/>
-              </w:rPr>
-              <w:t>Fifth failed login sets locked_until; valid login within window returns 401; post-expiry valid login returns 200</w:t>
+            <w:tcW w:w="2411" w:type="dxa"/>
+          </w:tcPr>
+          <w:p>
+            <w:pPr>
+              <w:spacing w:before="0" w:after="0" w:line="240" w:lineRule="auto"/>
+              <w:ind w:left="0" w:firstLine="0"/>
+              <w:suppressAutoHyphens/>
+            </w:pPr>
+            <w:r>
+              <w:rPr>
+                <w:rFonts w:ascii="Calibri" w:hAnsi="Calibri"/>
+                <w:b w:val="0"/>
+                <w:i w:val="0"/>
+                <w:sz w:val="24"/>
+                <w:noProof/>
+              </w:rPr>
+              <w:t>test_tc_2_5_duplicate_email_same_tenant_returns_409</w:t>
+            </w:r>
+          </w:p>
+        </w:tc>
+        <w:tc>
+          <w:tcPr>
+            <w:tcW w:w="286" w:type="dxa"/>
+          </w:tcPr>
+          <w:p>
+            <w:pPr>
+              <w:spacing w:before="0" w:after="0" w:line="240" w:lineRule="auto"/>
+              <w:ind w:left="0" w:firstLine="0"/>
+              <w:suppressAutoHyphens/>
+            </w:pPr>
+            <w:r>
+              <w:rPr>
+                <w:rFonts w:ascii="Calibri" w:hAnsi="Calibri"/>
+                <w:b w:val="0"/>
+                <w:i w:val="0"/>
+                <w:sz w:val="24"/>
+                <w:noProof/>
+              </w:rPr>
+              <w:t>TC-2.5</w:t>
+            </w:r>
+          </w:p>
+        </w:tc>
+        <w:tc>
+          <w:tcPr>
+            <w:tcW w:w="572" w:type="dxa"/>
+          </w:tcPr>
+          <w:p>
+            <w:pPr>
+              <w:spacing w:before="0" w:after="0" w:line="240" w:lineRule="auto"/>
+              <w:ind w:left="0" w:firstLine="0"/>
+              <w:suppressAutoHyphens/>
+            </w:pPr>
+            <w:r>
+              <w:rPr>
+                <w:rFonts w:ascii="Calibri" w:hAnsi="Calibri"/>
+                <w:b w:val="0"/>
+                <w:i w:val="0"/>
+                <w:sz w:val="24"/>
+                <w:noProof/>
+              </w:rPr>
+              <w:t>API</w:t>
+            </w:r>
+          </w:p>
+        </w:tc>
+        <w:tc>
+          <w:tcPr>
+            <w:tcW w:w="5802" w:type="dxa"/>
+          </w:tcPr>
+          <w:p>
+            <w:pPr>
+              <w:spacing w:before="0" w:after="0" w:line="240" w:lineRule="auto"/>
+              <w:ind w:left="0" w:firstLine="0"/>
+              <w:suppressAutoHyphens/>
+            </w:pPr>
+            <w:r>
+              <w:rPr>
+                <w:rFonts w:ascii="Calibri" w:hAnsi="Calibri"/>
+                <w:b w:val="0"/>
+                <w:i w:val="0"/>
+                <w:sz w:val="24"/>
+                <w:noProof/>
+              </w:rPr>
+              <w:t>POST with email already registered in same tenant returns 409 USER_DUPLICATE_EMAIL; exactly one row with that email in DB</w:t>
             </w:r>
           </w:p>
         </w:tc>
@@ -3149,89 +3335,89 @@
         </w:trPr>
         <w:tc>
           <w:tcPr>
-            <w:tcW w:w="2279" w:type="dxa"/>
-          </w:tcPr>
-          <w:p>
-            <w:pPr>
-              <w:spacing w:before="0" w:after="0" w:line="240" w:lineRule="auto"/>
-              <w:ind w:left="0" w:firstLine="0"/>
-              <w:suppressAutoHyphens/>
-            </w:pPr>
-            <w:r>
-              <w:rPr>
-                <w:rFonts w:ascii="Calibri" w:hAnsi="Calibri"/>
-                <w:b w:val="0"/>
-                <w:i w:val="0"/>
-                <w:sz w:val="24"/>
-                <w:noProof/>
-              </w:rPr>
-              <w:t>test_2_6_lockout_state_persists_in_database</w:t>
-            </w:r>
-          </w:p>
-        </w:tc>
-        <w:tc>
-          <w:tcPr>
-            <w:tcW w:w="279" w:type="dxa"/>
-          </w:tcPr>
-          <w:p>
-            <w:pPr>
-              <w:spacing w:before="0" w:after="0" w:line="240" w:lineRule="auto"/>
-              <w:ind w:left="0" w:firstLine="0"/>
-              <w:suppressAutoHyphens/>
-            </w:pPr>
-            <w:r>
-              <w:rPr>
-                <w:rFonts w:ascii="Calibri" w:hAnsi="Calibri"/>
-                <w:b w:val="0"/>
-                <w:i w:val="0"/>
-                <w:sz w:val="24"/>
-                <w:noProof/>
-              </w:rPr>
-              <w:t>2.6</w:t>
-            </w:r>
-          </w:p>
-        </w:tc>
-        <w:tc>
-          <w:tcPr>
-            <w:tcW w:w="651" w:type="dxa"/>
-          </w:tcPr>
-          <w:p>
-            <w:pPr>
-              <w:spacing w:before="0" w:after="0" w:line="240" w:lineRule="auto"/>
-              <w:ind w:left="0" w:firstLine="0"/>
-              <w:suppressAutoHyphens/>
-            </w:pPr>
-            <w:r>
-              <w:rPr>
-                <w:rFonts w:ascii="Calibri" w:hAnsi="Calibri"/>
-                <w:b w:val="0"/>
-                <w:i w:val="0"/>
-                <w:sz w:val="24"/>
-                <w:noProof/>
-              </w:rPr>
-              <w:t>Business Rules</w:t>
-            </w:r>
-          </w:p>
-        </w:tc>
-        <w:tc>
-          <w:tcPr>
-            <w:tcW w:w="5861" w:type="dxa"/>
-          </w:tcPr>
-          <w:p>
-            <w:pPr>
-              <w:spacing w:before="0" w:after="0" w:line="240" w:lineRule="auto"/>
-              <w:ind w:left="0" w:firstLine="0"/>
-              <w:suppressAutoHyphens/>
-            </w:pPr>
-            <w:r>
-              <w:rPr>
-                <w:rFonts w:ascii="Calibri" w:hAnsi="Calibri"/>
-                <w:b w:val="0"/>
-                <w:i w:val="0"/>
-                <w:sz w:val="24"/>
-                <w:noProof/>
-              </w:rPr>
-              <w:t>locked_until persisted in DB; login while locked_until is future returns 401; response omits locked_until value</w:t>
+            <w:tcW w:w="2411" w:type="dxa"/>
+          </w:tcPr>
+          <w:p>
+            <w:pPr>
+              <w:spacing w:before="0" w:after="0" w:line="240" w:lineRule="auto"/>
+              <w:ind w:left="0" w:firstLine="0"/>
+              <w:suppressAutoHyphens/>
+            </w:pPr>
+            <w:r>
+              <w:rPr>
+                <w:rFonts w:ascii="Calibri" w:hAnsi="Calibri"/>
+                <w:b w:val="0"/>
+                <w:i w:val="0"/>
+                <w:sz w:val="24"/>
+                <w:noProof/>
+              </w:rPr>
+              <w:t>test_tc_2_6_same_email_different_tenant_returns_201</w:t>
+            </w:r>
+          </w:p>
+        </w:tc>
+        <w:tc>
+          <w:tcPr>
+            <w:tcW w:w="286" w:type="dxa"/>
+          </w:tcPr>
+          <w:p>
+            <w:pPr>
+              <w:spacing w:before="0" w:after="0" w:line="240" w:lineRule="auto"/>
+              <w:ind w:left="0" w:firstLine="0"/>
+              <w:suppressAutoHyphens/>
+            </w:pPr>
+            <w:r>
+              <w:rPr>
+                <w:rFonts w:ascii="Calibri" w:hAnsi="Calibri"/>
+                <w:b w:val="0"/>
+                <w:i w:val="0"/>
+                <w:sz w:val="24"/>
+                <w:noProof/>
+              </w:rPr>
+              <w:t>TC-2.6</w:t>
+            </w:r>
+          </w:p>
+        </w:tc>
+        <w:tc>
+          <w:tcPr>
+            <w:tcW w:w="572" w:type="dxa"/>
+          </w:tcPr>
+          <w:p>
+            <w:pPr>
+              <w:spacing w:before="0" w:after="0" w:line="240" w:lineRule="auto"/>
+              <w:ind w:left="0" w:firstLine="0"/>
+              <w:suppressAutoHyphens/>
+            </w:pPr>
+            <w:r>
+              <w:rPr>
+                <w:rFonts w:ascii="Calibri" w:hAnsi="Calibri"/>
+                <w:b w:val="0"/>
+                <w:i w:val="0"/>
+                <w:sz w:val="24"/>
+                <w:noProof/>
+              </w:rPr>
+              <w:t>API</w:t>
+            </w:r>
+          </w:p>
+        </w:tc>
+        <w:tc>
+          <w:tcPr>
+            <w:tcW w:w="5802" w:type="dxa"/>
+          </w:tcPr>
+          <w:p>
+            <w:pPr>
+              <w:spacing w:before="0" w:after="0" w:line="240" w:lineRule="auto"/>
+              <w:ind w:left="0" w:firstLine="0"/>
+              <w:suppressAutoHyphens/>
+            </w:pPr>
+            <w:r>
+              <w:rPr>
+                <w:rFonts w:ascii="Calibri" w:hAnsi="Calibri"/>
+                <w:b w:val="0"/>
+                <w:i w:val="0"/>
+                <w:sz w:val="24"/>
+                <w:noProof/>
+              </w:rPr>
+              <w:t>POST with same email in different tenant returns 201; two rows with that email coexist across tenants in DB</w:t>
             </w:r>
           </w:p>
         </w:tc>
@@ -3242,51 +3428,51 @@
         </w:trPr>
         <w:tc>
           <w:tcPr>
-            <w:tcW w:w="2279" w:type="dxa"/>
-          </w:tcPr>
-          <w:p>
-            <w:pPr>
-              <w:spacing w:before="0" w:after="0" w:line="240" w:lineRule="auto"/>
-              <w:ind w:left="0" w:firstLine="0"/>
-              <w:suppressAutoHyphens/>
-            </w:pPr>
-            <w:r>
-              <w:rPr>
-                <w:rFonts w:ascii="Calibri" w:hAnsi="Calibri"/>
-                <w:b w:val="0"/>
-                <w:i w:val="0"/>
-                <w:sz w:val="24"/>
-                <w:noProof/>
-              </w:rPr>
-              <w:t>test_2_7_user_status_state_machine_transitions</w:t>
-            </w:r>
-          </w:p>
-        </w:tc>
-        <w:tc>
-          <w:tcPr>
-            <w:tcW w:w="279" w:type="dxa"/>
-          </w:tcPr>
-          <w:p>
-            <w:pPr>
-              <w:spacing w:before="0" w:after="0" w:line="240" w:lineRule="auto"/>
-              <w:ind w:left="0" w:firstLine="0"/>
-              <w:suppressAutoHyphens/>
-            </w:pPr>
-            <w:r>
-              <w:rPr>
-                <w:rFonts w:ascii="Calibri" w:hAnsi="Calibri"/>
-                <w:b w:val="0"/>
-                <w:i w:val="0"/>
-                <w:sz w:val="24"/>
-                <w:noProof/>
-              </w:rPr>
-              <w:t>2.7</w:t>
-            </w:r>
-          </w:p>
-        </w:tc>
-        <w:tc>
-          <w:tcPr>
-            <w:tcW w:w="651" w:type="dxa"/>
+            <w:tcW w:w="2411" w:type="dxa"/>
+          </w:tcPr>
+          <w:p>
+            <w:pPr>
+              <w:spacing w:before="0" w:after="0" w:line="240" w:lineRule="auto"/>
+              <w:ind w:left="0" w:firstLine="0"/>
+              <w:suppressAutoHyphens/>
+            </w:pPr>
+            <w:r>
+              <w:rPr>
+                <w:rFonts w:ascii="Calibri" w:hAnsi="Calibri"/>
+                <w:b w:val="0"/>
+                <w:i w:val="0"/>
+                <w:sz w:val="24"/>
+                <w:noProof/>
+              </w:rPr>
+              <w:t>test_tc_2_7_account_lockout_after_5_failed_logins</w:t>
+            </w:r>
+          </w:p>
+        </w:tc>
+        <w:tc>
+          <w:tcPr>
+            <w:tcW w:w="286" w:type="dxa"/>
+          </w:tcPr>
+          <w:p>
+            <w:pPr>
+              <w:spacing w:before="0" w:after="0" w:line="240" w:lineRule="auto"/>
+              <w:ind w:left="0" w:firstLine="0"/>
+              <w:suppressAutoHyphens/>
+            </w:pPr>
+            <w:r>
+              <w:rPr>
+                <w:rFonts w:ascii="Calibri" w:hAnsi="Calibri"/>
+                <w:b w:val="0"/>
+                <w:i w:val="0"/>
+                <w:sz w:val="24"/>
+                <w:noProof/>
+              </w:rPr>
+              <w:t>TC-2.7</w:t>
+            </w:r>
+          </w:p>
+        </w:tc>
+        <w:tc>
+          <w:tcPr>
+            <w:tcW w:w="572" w:type="dxa"/>
           </w:tcPr>
           <w:p>
             <w:pPr>
@@ -3308,23 +3494,23 @@
         </w:tc>
         <w:tc>
           <w:tcPr>
-            <w:tcW w:w="5861" w:type="dxa"/>
-          </w:tcPr>
-          <w:p>
-            <w:pPr>
-              <w:spacing w:before="0" w:after="0" w:line="240" w:lineRule="auto"/>
-              <w:ind w:left="0" w:firstLine="0"/>
-              <w:suppressAutoHyphens/>
-            </w:pPr>
-            <w:r>
-              <w:rPr>
-                <w:rFonts w:ascii="Calibri" w:hAnsi="Calibri"/>
-                <w:b w:val="0"/>
-                <w:i w:val="0"/>
-                <w:sz w:val="24"/>
-                <w:noProof/>
-              </w:rPr>
-              <w:t>Disallowed status transition returns 422; DELETE returns 405; transition to inactive sets deactivated_at</w:t>
+            <w:tcW w:w="5802" w:type="dxa"/>
+          </w:tcPr>
+          <w:p>
+            <w:pPr>
+              <w:spacing w:before="0" w:after="0" w:line="240" w:lineRule="auto"/>
+              <w:ind w:left="0" w:firstLine="0"/>
+              <w:suppressAutoHyphens/>
+            </w:pPr>
+            <w:r>
+              <w:rPr>
+                <w:rFonts w:ascii="Calibri" w:hAnsi="Calibri"/>
+                <w:b w:val="0"/>
+                <w:i w:val="0"/>
+                <w:sz w:val="24"/>
+                <w:noProof/>
+              </w:rPr>
+              <w:t>5 consecutive wrong-password logins lock the account; 6th attempt returns 401 ACCOUNT_LOCKED; locked_until set in DB</w:t>
             </w:r>
           </w:p>
         </w:tc>
@@ -3335,51 +3521,51 @@
         </w:trPr>
         <w:tc>
           <w:tcPr>
-            <w:tcW w:w="2279" w:type="dxa"/>
-          </w:tcPr>
-          <w:p>
-            <w:pPr>
-              <w:spacing w:before="0" w:after="0" w:line="240" w:lineRule="auto"/>
-              <w:ind w:left="0" w:firstLine="0"/>
-              <w:suppressAutoHyphens/>
-            </w:pPr>
-            <w:r>
-              <w:rPr>
-                <w:rFonts w:ascii="Calibri" w:hAnsi="Calibri"/>
-                <w:b w:val="0"/>
-                <w:i w:val="0"/>
-                <w:sz w:val="24"/>
-                <w:noProof/>
-              </w:rPr>
-              <w:t>test_2_8_audit_log_on_auth_events_and_user_changes</w:t>
-            </w:r>
-          </w:p>
-        </w:tc>
-        <w:tc>
-          <w:tcPr>
-            <w:tcW w:w="279" w:type="dxa"/>
-          </w:tcPr>
-          <w:p>
-            <w:pPr>
-              <w:spacing w:before="0" w:after="0" w:line="240" w:lineRule="auto"/>
-              <w:ind w:left="0" w:firstLine="0"/>
-              <w:suppressAutoHyphens/>
-            </w:pPr>
-            <w:r>
-              <w:rPr>
-                <w:rFonts w:ascii="Calibri" w:hAnsi="Calibri"/>
-                <w:b w:val="0"/>
-                <w:i w:val="0"/>
-                <w:sz w:val="24"/>
-                <w:noProof/>
-              </w:rPr>
-              <w:t>2.8</w:t>
-            </w:r>
-          </w:p>
-        </w:tc>
-        <w:tc>
-          <w:tcPr>
-            <w:tcW w:w="651" w:type="dxa"/>
+            <w:tcW w:w="2411" w:type="dxa"/>
+          </w:tcPr>
+          <w:p>
+            <w:pPr>
+              <w:spacing w:before="0" w:after="0" w:line="240" w:lineRule="auto"/>
+              <w:ind w:left="0" w:firstLine="0"/>
+              <w:suppressAutoHyphens/>
+            </w:pPr>
+            <w:r>
+              <w:rPr>
+                <w:rFonts w:ascii="Calibri" w:hAnsi="Calibri"/>
+                <w:b w:val="0"/>
+                <w:i w:val="0"/>
+                <w:sz w:val="24"/>
+                <w:noProof/>
+              </w:rPr>
+              <w:t>test_tc_2_8_locked_user_login_returns_401_account_locked</w:t>
+            </w:r>
+          </w:p>
+        </w:tc>
+        <w:tc>
+          <w:tcPr>
+            <w:tcW w:w="286" w:type="dxa"/>
+          </w:tcPr>
+          <w:p>
+            <w:pPr>
+              <w:spacing w:before="0" w:after="0" w:line="240" w:lineRule="auto"/>
+              <w:ind w:left="0" w:firstLine="0"/>
+              <w:suppressAutoHyphens/>
+            </w:pPr>
+            <w:r>
+              <w:rPr>
+                <w:rFonts w:ascii="Calibri" w:hAnsi="Calibri"/>
+                <w:b w:val="0"/>
+                <w:i w:val="0"/>
+                <w:sz w:val="24"/>
+                <w:noProof/>
+              </w:rPr>
+              <w:t>TC-2.8</w:t>
+            </w:r>
+          </w:p>
+        </w:tc>
+        <w:tc>
+          <w:tcPr>
+            <w:tcW w:w="572" w:type="dxa"/>
           </w:tcPr>
           <w:p>
             <w:pPr>
@@ -3401,23 +3587,23 @@
         </w:tc>
         <w:tc>
           <w:tcPr>
-            <w:tcW w:w="5861" w:type="dxa"/>
-          </w:tcPr>
-          <w:p>
-            <w:pPr>
-              <w:spacing w:before="0" w:after="0" w:line="240" w:lineRule="auto"/>
-              <w:ind w:left="0" w:firstLine="0"/>
-              <w:suppressAutoHyphens/>
-            </w:pPr>
-            <w:r>
-              <w:rPr>
-                <w:rFonts w:ascii="Calibri" w:hAnsi="Calibri"/>
-                <w:b w:val="0"/>
-                <w:i w:val="0"/>
-                <w:sz w:val="24"/>
-                <w:noProof/>
-              </w:rPr>
-              <w:t>Login produces AUTH_SUCCESS or AUTH_FAILURE event; User role change produces PHI_WRITE listing field names only</w:t>
+            <w:tcW w:w="5802" w:type="dxa"/>
+          </w:tcPr>
+          <w:p>
+            <w:pPr>
+              <w:spacing w:before="0" w:after="0" w:line="240" w:lineRule="auto"/>
+              <w:ind w:left="0" w:firstLine="0"/>
+              <w:suppressAutoHyphens/>
+            </w:pPr>
+            <w:r>
+              <w:rPr>
+                <w:rFonts w:ascii="Calibri" w:hAnsi="Calibri"/>
+                <w:b w:val="0"/>
+                <w:i w:val="0"/>
+                <w:sz w:val="24"/>
+                <w:noProof/>
+              </w:rPr>
+              <w:t>Locked user login with correct password returns 401 ACCOUNT_LOCKED; locked_until remains set in DB</w:t>
             </w:r>
           </w:p>
         </w:tc>
@@ -3428,89 +3614,89 @@
         </w:trPr>
         <w:tc>
           <w:tcPr>
-            <w:tcW w:w="2279" w:type="dxa"/>
-          </w:tcPr>
-          <w:p>
-            <w:pPr>
-              <w:spacing w:before="0" w:after="0" w:line="240" w:lineRule="auto"/>
-              <w:ind w:left="0" w:firstLine="0"/>
-              <w:suppressAutoHyphens/>
-            </w:pPr>
-            <w:r>
-              <w:rPr>
-                <w:rFonts w:ascii="Calibri" w:hAnsi="Calibri"/>
-                <w:b w:val="0"/>
-                <w:i w:val="0"/>
-                <w:sz w:val="24"/>
-                <w:noProof/>
-              </w:rPr>
-              <w:t>test_2_9_password_stored_as_hash_never_plaintext</w:t>
-            </w:r>
-          </w:p>
-        </w:tc>
-        <w:tc>
-          <w:tcPr>
-            <w:tcW w:w="279" w:type="dxa"/>
-          </w:tcPr>
-          <w:p>
-            <w:pPr>
-              <w:spacing w:before="0" w:after="0" w:line="240" w:lineRule="auto"/>
-              <w:ind w:left="0" w:firstLine="0"/>
-              <w:suppressAutoHyphens/>
-            </w:pPr>
-            <w:r>
-              <w:rPr>
-                <w:rFonts w:ascii="Calibri" w:hAnsi="Calibri"/>
-                <w:b w:val="0"/>
-                <w:i w:val="0"/>
-                <w:sz w:val="24"/>
-                <w:noProof/>
-              </w:rPr>
-              <w:t>2.9</w:t>
-            </w:r>
-          </w:p>
-        </w:tc>
-        <w:tc>
-          <w:tcPr>
-            <w:tcW w:w="651" w:type="dxa"/>
-          </w:tcPr>
-          <w:p>
-            <w:pPr>
-              <w:spacing w:before="0" w:after="0" w:line="240" w:lineRule="auto"/>
-              <w:ind w:left="0" w:firstLine="0"/>
-              <w:suppressAutoHyphens/>
-            </w:pPr>
-            <w:r>
-              <w:rPr>
-                <w:rFonts w:ascii="Calibri" w:hAnsi="Calibri"/>
-                <w:b w:val="0"/>
-                <w:i w:val="0"/>
-                <w:sz w:val="24"/>
-                <w:noProof/>
-              </w:rPr>
-              <w:t>DB</w:t>
-            </w:r>
-          </w:p>
-        </w:tc>
-        <w:tc>
-          <w:tcPr>
-            <w:tcW w:w="5861" w:type="dxa"/>
-          </w:tcPr>
-          <w:p>
-            <w:pPr>
-              <w:spacing w:before="0" w:after="0" w:line="240" w:lineRule="auto"/>
-              <w:ind w:left="0" w:firstLine="0"/>
-              <w:suppressAutoHyphens/>
-            </w:pPr>
-            <w:r>
-              <w:rPr>
-                <w:rFonts w:ascii="Calibri" w:hAnsi="Calibri"/>
-                <w:b w:val="0"/>
-                <w:i w:val="0"/>
-                <w:sz w:val="24"/>
-                <w:noProof/>
-              </w:rPr>
-              <w:t>password_hash column contains only bcrypt/Argon2id pattern; no plaintext string present in any row or audit log</w:t>
+            <w:tcW w:w="2411" w:type="dxa"/>
+          </w:tcPr>
+          <w:p>
+            <w:pPr>
+              <w:spacing w:before="0" w:after="0" w:line="240" w:lineRule="auto"/>
+              <w:ind w:left="0" w:firstLine="0"/>
+              <w:suppressAutoHyphens/>
+            </w:pPr>
+            <w:r>
+              <w:rPr>
+                <w:rFonts w:ascii="Calibri" w:hAnsi="Calibri"/>
+                <w:b w:val="0"/>
+                <w:i w:val="0"/>
+                <w:sz w:val="24"/>
+                <w:noProof/>
+              </w:rPr>
+              <w:t>test_tc_2_9_soft_delete_user_returns_200_status_inactive</w:t>
+            </w:r>
+          </w:p>
+        </w:tc>
+        <w:tc>
+          <w:tcPr>
+            <w:tcW w:w="286" w:type="dxa"/>
+          </w:tcPr>
+          <w:p>
+            <w:pPr>
+              <w:spacing w:before="0" w:after="0" w:line="240" w:lineRule="auto"/>
+              <w:ind w:left="0" w:firstLine="0"/>
+              <w:suppressAutoHyphens/>
+            </w:pPr>
+            <w:r>
+              <w:rPr>
+                <w:rFonts w:ascii="Calibri" w:hAnsi="Calibri"/>
+                <w:b w:val="0"/>
+                <w:i w:val="0"/>
+                <w:sz w:val="24"/>
+                <w:noProof/>
+              </w:rPr>
+              <w:t>TC-2.9</w:t>
+            </w:r>
+          </w:p>
+        </w:tc>
+        <w:tc>
+          <w:tcPr>
+            <w:tcW w:w="572" w:type="dxa"/>
+          </w:tcPr>
+          <w:p>
+            <w:pPr>
+              <w:spacing w:before="0" w:after="0" w:line="240" w:lineRule="auto"/>
+              <w:ind w:left="0" w:firstLine="0"/>
+              <w:suppressAutoHyphens/>
+            </w:pPr>
+            <w:r>
+              <w:rPr>
+                <w:rFonts w:ascii="Calibri" w:hAnsi="Calibri"/>
+                <w:b w:val="0"/>
+                <w:i w:val="0"/>
+                <w:sz w:val="24"/>
+                <w:noProof/>
+              </w:rPr>
+              <w:t>API</w:t>
+            </w:r>
+          </w:p>
+        </w:tc>
+        <w:tc>
+          <w:tcPr>
+            <w:tcW w:w="5802" w:type="dxa"/>
+          </w:tcPr>
+          <w:p>
+            <w:pPr>
+              <w:spacing w:before="0" w:after="0" w:line="240" w:lineRule="auto"/>
+              <w:ind w:left="0" w:firstLine="0"/>
+              <w:suppressAutoHyphens/>
+            </w:pPr>
+            <w:r>
+              <w:rPr>
+                <w:rFonts w:ascii="Calibri" w:hAnsi="Calibri"/>
+                <w:b w:val="0"/>
+                <w:i w:val="0"/>
+                <w:sz w:val="24"/>
+                <w:noProof/>
+              </w:rPr>
+              <w:t>PATCH status=inactive returns 200 with status inactive; deactivated_at set in DB; row persists (no physical removal)</w:t>
             </w:r>
           </w:p>
         </w:tc>
@@ -3521,51 +3707,51 @@
         </w:trPr>
         <w:tc>
           <w:tcPr>
-            <w:tcW w:w="2279" w:type="dxa"/>
-          </w:tcPr>
-          <w:p>
-            <w:pPr>
-              <w:spacing w:before="0" w:after="0" w:line="240" w:lineRule="auto"/>
-              <w:ind w:left="0" w:firstLine="0"/>
-              <w:suppressAutoHyphens/>
-            </w:pPr>
-            <w:r>
-              <w:rPr>
-                <w:rFonts w:ascii="Calibri" w:hAnsi="Calibri"/>
-                <w:b w:val="0"/>
-                <w:i w:val="0"/>
-                <w:sz w:val="24"/>
-                <w:noProof/>
-              </w:rPr>
-              <w:t>test_2_10_90_day_password_rotation_and_reuse_prevention</w:t>
-            </w:r>
-          </w:p>
-        </w:tc>
-        <w:tc>
-          <w:tcPr>
-            <w:tcW w:w="279" w:type="dxa"/>
-          </w:tcPr>
-          <w:p>
-            <w:pPr>
-              <w:spacing w:before="0" w:after="0" w:line="240" w:lineRule="auto"/>
-              <w:ind w:left="0" w:firstLine="0"/>
-              <w:suppressAutoHyphens/>
-            </w:pPr>
-            <w:r>
-              <w:rPr>
-                <w:rFonts w:ascii="Calibri" w:hAnsi="Calibri"/>
-                <w:b w:val="0"/>
-                <w:i w:val="0"/>
-                <w:sz w:val="24"/>
-                <w:noProof/>
-              </w:rPr>
-              <w:t>2.10</w:t>
-            </w:r>
-          </w:p>
-        </w:tc>
-        <w:tc>
-          <w:tcPr>
-            <w:tcW w:w="651" w:type="dxa"/>
+            <w:tcW w:w="2411" w:type="dxa"/>
+          </w:tcPr>
+          <w:p>
+            <w:pPr>
+              <w:spacing w:before="0" w:after="0" w:line="240" w:lineRule="auto"/>
+              <w:ind w:left="0" w:firstLine="0"/>
+              <w:suppressAutoHyphens/>
+            </w:pPr>
+            <w:r>
+              <w:rPr>
+                <w:rFonts w:ascii="Calibri" w:hAnsi="Calibri"/>
+                <w:b w:val="0"/>
+                <w:i w:val="0"/>
+                <w:sz w:val="24"/>
+                <w:noProof/>
+              </w:rPr>
+              <w:t>test_tc_2_10_audit_log_on_user_creation_has_mandatory_fields_no_pii</w:t>
+            </w:r>
+          </w:p>
+        </w:tc>
+        <w:tc>
+          <w:tcPr>
+            <w:tcW w:w="286" w:type="dxa"/>
+          </w:tcPr>
+          <w:p>
+            <w:pPr>
+              <w:spacing w:before="0" w:after="0" w:line="240" w:lineRule="auto"/>
+              <w:ind w:left="0" w:firstLine="0"/>
+              <w:suppressAutoHyphens/>
+            </w:pPr>
+            <w:r>
+              <w:rPr>
+                <w:rFonts w:ascii="Calibri" w:hAnsi="Calibri"/>
+                <w:b w:val="0"/>
+                <w:i w:val="0"/>
+                <w:sz w:val="24"/>
+                <w:noProof/>
+              </w:rPr>
+              <w:t>TC-2.10</w:t>
+            </w:r>
+          </w:p>
+        </w:tc>
+        <w:tc>
+          <w:tcPr>
+            <w:tcW w:w="572" w:type="dxa"/>
           </w:tcPr>
           <w:p>
             <w:pPr>
@@ -3587,23 +3773,23 @@
         </w:tc>
         <w:tc>
           <w:tcPr>
-            <w:tcW w:w="5861" w:type="dxa"/>
-          </w:tcPr>
-          <w:p>
-            <w:pPr>
-              <w:spacing w:before="0" w:after="0" w:line="240" w:lineRule="auto"/>
-              <w:ind w:left="0" w:firstLine="0"/>
-              <w:suppressAutoHyphens/>
-            </w:pPr>
-            <w:r>
-              <w:rPr>
-                <w:rFonts w:ascii="Calibri" w:hAnsi="Calibri"/>
-                <w:b w:val="0"/>
-                <w:i w:val="0"/>
-                <w:sz w:val="24"/>
-                <w:noProof/>
-              </w:rPr>
-              <w:t>Login with password age &gt; 90 days returns 403 PASSWORD_EXPIRED; prior hash reuse returns 422 PASSWORD_REUSE_PROHIBITED</w:t>
+            <w:tcW w:w="5802" w:type="dxa"/>
+          </w:tcPr>
+          <w:p>
+            <w:pPr>
+              <w:spacing w:before="0" w:after="0" w:line="240" w:lineRule="auto"/>
+              <w:ind w:left="0" w:firstLine="0"/>
+              <w:suppressAutoHyphens/>
+            </w:pPr>
+            <w:r>
+              <w:rPr>
+                <w:rFonts w:ascii="Calibri" w:hAnsi="Calibri"/>
+                <w:b w:val="0"/>
+                <w:i w:val="0"/>
+                <w:sz w:val="24"/>
+                <w:noProof/>
+              </w:rPr>
+              <w:t>PHI_WRITE audit event after user creation has all 11 mandatory fields non-null and no PII values in data_affected</w:t>
             </w:r>
           </w:p>
         </w:tc>
@@ -3614,89 +3800,89 @@
         </w:trPr>
         <w:tc>
           <w:tcPr>
-            <w:tcW w:w="2279" w:type="dxa"/>
-          </w:tcPr>
-          <w:p>
-            <w:pPr>
-              <w:spacing w:before="0" w:after="0" w:line="240" w:lineRule="auto"/>
-              <w:ind w:left="0" w:firstLine="0"/>
-              <w:suppressAutoHyphens/>
-            </w:pPr>
-            <w:r>
-              <w:rPr>
-                <w:rFonts w:ascii="Calibri" w:hAnsi="Calibri"/>
-                <w:b w:val="0"/>
-                <w:i w:val="0"/>
-                <w:sz w:val="24"/>
-                <w:noProof/>
-              </w:rPr>
-              <w:t>test_2_11_dormant_account_auto_deactivated_after_90_days</w:t>
-            </w:r>
-          </w:p>
-        </w:tc>
-        <w:tc>
-          <w:tcPr>
-            <w:tcW w:w="279" w:type="dxa"/>
-          </w:tcPr>
-          <w:p>
-            <w:pPr>
-              <w:spacing w:before="0" w:after="0" w:line="240" w:lineRule="auto"/>
-              <w:ind w:left="0" w:firstLine="0"/>
-              <w:suppressAutoHyphens/>
-            </w:pPr>
-            <w:r>
-              <w:rPr>
-                <w:rFonts w:ascii="Calibri" w:hAnsi="Calibri"/>
-                <w:b w:val="0"/>
-                <w:i w:val="0"/>
-                <w:sz w:val="24"/>
-                <w:noProof/>
-              </w:rPr>
-              <w:t>2.11</w:t>
-            </w:r>
-          </w:p>
-        </w:tc>
-        <w:tc>
-          <w:tcPr>
-            <w:tcW w:w="651" w:type="dxa"/>
-          </w:tcPr>
-          <w:p>
-            <w:pPr>
-              <w:spacing w:before="0" w:after="0" w:line="240" w:lineRule="auto"/>
-              <w:ind w:left="0" w:firstLine="0"/>
-              <w:suppressAutoHyphens/>
-            </w:pPr>
-            <w:r>
-              <w:rPr>
-                <w:rFonts w:ascii="Calibri" w:hAnsi="Calibri"/>
-                <w:b w:val="0"/>
-                <w:i w:val="0"/>
-                <w:sz w:val="24"/>
-                <w:noProof/>
-              </w:rPr>
-              <w:t>Business Rules</w:t>
-            </w:r>
-          </w:p>
-        </w:tc>
-        <w:tc>
-          <w:tcPr>
-            <w:tcW w:w="5861" w:type="dxa"/>
-          </w:tcPr>
-          <w:p>
-            <w:pPr>
-              <w:spacing w:before="0" w:after="0" w:line="240" w:lineRule="auto"/>
-              <w:ind w:left="0" w:firstLine="0"/>
-              <w:suppressAutoHyphens/>
-            </w:pPr>
-            <w:r>
-              <w:rPr>
-                <w:rFonts w:ascii="Calibri" w:hAnsi="Calibri"/>
-                <w:b w:val="0"/>
-                <w:i w:val="0"/>
-                <w:sz w:val="24"/>
-                <w:noProof/>
-              </w:rPr>
-              <w:t>Job query identifies accounts with last_login_at &gt; 90 days; each transitions to inactive with ACCOUNT_AUTO_DEACTIVATED audit event</w:t>
+            <w:tcW w:w="2411" w:type="dxa"/>
+          </w:tcPr>
+          <w:p>
+            <w:pPr>
+              <w:spacing w:before="0" w:after="0" w:line="240" w:lineRule="auto"/>
+              <w:ind w:left="0" w:firstLine="0"/>
+              <w:suppressAutoHyphens/>
+            </w:pPr>
+            <w:r>
+              <w:rPr>
+                <w:rFonts w:ascii="Calibri" w:hAnsi="Calibri"/>
+                <w:b w:val="0"/>
+                <w:i w:val="0"/>
+                <w:sz w:val="24"/>
+                <w:noProof/>
+              </w:rPr>
+              <w:t>test_tc_2_11_missing_email_returns_400_or_422_with_field_name</w:t>
+            </w:r>
+          </w:p>
+        </w:tc>
+        <w:tc>
+          <w:tcPr>
+            <w:tcW w:w="286" w:type="dxa"/>
+          </w:tcPr>
+          <w:p>
+            <w:pPr>
+              <w:spacing w:before="0" w:after="0" w:line="240" w:lineRule="auto"/>
+              <w:ind w:left="0" w:firstLine="0"/>
+              <w:suppressAutoHyphens/>
+            </w:pPr>
+            <w:r>
+              <w:rPr>
+                <w:rFonts w:ascii="Calibri" w:hAnsi="Calibri"/>
+                <w:b w:val="0"/>
+                <w:i w:val="0"/>
+                <w:sz w:val="24"/>
+                <w:noProof/>
+              </w:rPr>
+              <w:t>TC-2.11</w:t>
+            </w:r>
+          </w:p>
+        </w:tc>
+        <w:tc>
+          <w:tcPr>
+            <w:tcW w:w="572" w:type="dxa"/>
+          </w:tcPr>
+          <w:p>
+            <w:pPr>
+              <w:spacing w:before="0" w:after="0" w:line="240" w:lineRule="auto"/>
+              <w:ind w:left="0" w:firstLine="0"/>
+              <w:suppressAutoHyphens/>
+            </w:pPr>
+            <w:r>
+              <w:rPr>
+                <w:rFonts w:ascii="Calibri" w:hAnsi="Calibri"/>
+                <w:b w:val="0"/>
+                <w:i w:val="0"/>
+                <w:sz w:val="24"/>
+                <w:noProof/>
+              </w:rPr>
+              <w:t>API</w:t>
+            </w:r>
+          </w:p>
+        </w:tc>
+        <w:tc>
+          <w:tcPr>
+            <w:tcW w:w="5802" w:type="dxa"/>
+          </w:tcPr>
+          <w:p>
+            <w:pPr>
+              <w:spacing w:before="0" w:after="0" w:line="240" w:lineRule="auto"/>
+              <w:ind w:left="0" w:firstLine="0"/>
+              <w:suppressAutoHyphens/>
+            </w:pPr>
+            <w:r>
+              <w:rPr>
+                <w:rFonts w:ascii="Calibri" w:hAnsi="Calibri"/>
+                <w:b w:val="0"/>
+                <w:i w:val="0"/>
+                <w:sz w:val="24"/>
+                <w:noProof/>
+              </w:rPr>
+              <w:t>POST without email returns 400 or 422 identifying email in the error; no user row created in DB</w:t>
             </w:r>
           </w:p>
         </w:tc>
@@ -3707,89 +3893,182 @@
         </w:trPr>
         <w:tc>
           <w:tcPr>
-            <w:tcW w:w="2279" w:type="dxa"/>
-          </w:tcPr>
-          <w:p>
-            <w:pPr>
-              <w:spacing w:before="0" w:after="0" w:line="240" w:lineRule="auto"/>
-              <w:ind w:left="0" w:firstLine="0"/>
-              <w:suppressAutoHyphens/>
-            </w:pPr>
-            <w:r>
-              <w:rPr>
-                <w:rFonts w:ascii="Calibri" w:hAnsi="Calibri"/>
-                <w:b w:val="0"/>
-                <w:i w:val="0"/>
-                <w:sz w:val="24"/>
-                <w:noProof/>
-              </w:rPr>
-              <w:t>test_2_12_optimistic_locking_version_conflict_returns_409</w:t>
-            </w:r>
-          </w:p>
-        </w:tc>
-        <w:tc>
-          <w:tcPr>
-            <w:tcW w:w="279" w:type="dxa"/>
-          </w:tcPr>
-          <w:p>
-            <w:pPr>
-              <w:spacing w:before="0" w:after="0" w:line="240" w:lineRule="auto"/>
-              <w:ind w:left="0" w:firstLine="0"/>
-              <w:suppressAutoHyphens/>
-            </w:pPr>
-            <w:r>
-              <w:rPr>
-                <w:rFonts w:ascii="Calibri" w:hAnsi="Calibri"/>
-                <w:b w:val="0"/>
-                <w:i w:val="0"/>
-                <w:sz w:val="24"/>
-                <w:noProof/>
-              </w:rPr>
-              <w:t>2.12</w:t>
-            </w:r>
-          </w:p>
-        </w:tc>
-        <w:tc>
-          <w:tcPr>
-            <w:tcW w:w="651" w:type="dxa"/>
-          </w:tcPr>
-          <w:p>
-            <w:pPr>
-              <w:spacing w:before="0" w:after="0" w:line="240" w:lineRule="auto"/>
-              <w:ind w:left="0" w:firstLine="0"/>
-              <w:suppressAutoHyphens/>
-            </w:pPr>
-            <w:r>
-              <w:rPr>
-                <w:rFonts w:ascii="Calibri" w:hAnsi="Calibri"/>
-                <w:b w:val="0"/>
-                <w:i w:val="0"/>
-                <w:sz w:val="24"/>
-                <w:noProof/>
-              </w:rPr>
-              <w:t>Business Rules</w:t>
-            </w:r>
-          </w:p>
-        </w:tc>
-        <w:tc>
-          <w:tcPr>
-            <w:tcW w:w="5861" w:type="dxa"/>
-          </w:tcPr>
-          <w:p>
-            <w:pPr>
-              <w:spacing w:before="0" w:after="0" w:line="240" w:lineRule="auto"/>
-              <w:ind w:left="0" w:firstLine="0"/>
-              <w:suppressAutoHyphens/>
-            </w:pPr>
-            <w:r>
-              <w:rPr>
-                <w:rFonts w:ascii="Calibri" w:hAnsi="Calibri"/>
-                <w:b w:val="0"/>
-                <w:i w:val="0"/>
-                <w:sz w:val="24"/>
-                <w:noProof/>
-              </w:rPr>
-              <w:t>PATCH with stale version returns 409 USER_VERSION_CONFLICT; correct version returns 200 with version n+1</w:t>
+            <w:tcW w:w="2411" w:type="dxa"/>
+          </w:tcPr>
+          <w:p>
+            <w:pPr>
+              <w:spacing w:before="0" w:after="0" w:line="240" w:lineRule="auto"/>
+              <w:ind w:left="0" w:firstLine="0"/>
+              <w:suppressAutoHyphens/>
+            </w:pPr>
+            <w:r>
+              <w:rPr>
+                <w:rFonts w:ascii="Calibri" w:hAnsi="Calibri"/>
+                <w:b w:val="0"/>
+                <w:i w:val="0"/>
+                <w:sz w:val="24"/>
+                <w:noProof/>
+              </w:rPr>
+              <w:t>test_tc_2_12_billing_specialist_create_participant_returns_403</w:t>
+            </w:r>
+          </w:p>
+        </w:tc>
+        <w:tc>
+          <w:tcPr>
+            <w:tcW w:w="286" w:type="dxa"/>
+          </w:tcPr>
+          <w:p>
+            <w:pPr>
+              <w:spacing w:before="0" w:after="0" w:line="240" w:lineRule="auto"/>
+              <w:ind w:left="0" w:firstLine="0"/>
+              <w:suppressAutoHyphens/>
+            </w:pPr>
+            <w:r>
+              <w:rPr>
+                <w:rFonts w:ascii="Calibri" w:hAnsi="Calibri"/>
+                <w:b w:val="0"/>
+                <w:i w:val="0"/>
+                <w:sz w:val="24"/>
+                <w:noProof/>
+              </w:rPr>
+              <w:t>TC-2.12</w:t>
+            </w:r>
+          </w:p>
+        </w:tc>
+        <w:tc>
+          <w:tcPr>
+            <w:tcW w:w="572" w:type="dxa"/>
+          </w:tcPr>
+          <w:p>
+            <w:pPr>
+              <w:spacing w:before="0" w:after="0" w:line="240" w:lineRule="auto"/>
+              <w:ind w:left="0" w:firstLine="0"/>
+              <w:suppressAutoHyphens/>
+            </w:pPr>
+            <w:r>
+              <w:rPr>
+                <w:rFonts w:ascii="Calibri" w:hAnsi="Calibri"/>
+                <w:b w:val="0"/>
+                <w:i w:val="0"/>
+                <w:sz w:val="24"/>
+                <w:noProof/>
+              </w:rPr>
+              <w:t>API</w:t>
+            </w:r>
+          </w:p>
+        </w:tc>
+        <w:tc>
+          <w:tcPr>
+            <w:tcW w:w="5802" w:type="dxa"/>
+          </w:tcPr>
+          <w:p>
+            <w:pPr>
+              <w:spacing w:before="0" w:after="0" w:line="240" w:lineRule="auto"/>
+              <w:ind w:left="0" w:firstLine="0"/>
+              <w:suppressAutoHyphens/>
+            </w:pPr>
+            <w:r>
+              <w:rPr>
+                <w:rFonts w:ascii="Calibri" w:hAnsi="Calibri"/>
+                <w:b w:val="0"/>
+                <w:i w:val="0"/>
+                <w:sz w:val="24"/>
+                <w:noProof/>
+              </w:rPr>
+              <w:t>POST /participants by billing_specialist returns 403; no participant row created in DB</w:t>
+            </w:r>
+          </w:p>
+        </w:tc>
+      </w:tr>
+      <w:tr>
+        <w:trPr>
+          <w:cantSplit w:val="true"/>
+        </w:trPr>
+        <w:tc>
+          <w:tcPr>
+            <w:tcW w:w="2411" w:type="dxa"/>
+          </w:tcPr>
+          <w:p>
+            <w:pPr>
+              <w:spacing w:before="0" w:after="0" w:line="240" w:lineRule="auto"/>
+              <w:ind w:left="0" w:firstLine="0"/>
+              <w:suppressAutoHyphens/>
+            </w:pPr>
+            <w:r>
+              <w:rPr>
+                <w:rFonts w:ascii="Calibri" w:hAnsi="Calibri"/>
+                <w:b w:val="0"/>
+                <w:i w:val="0"/>
+                <w:sz w:val="24"/>
+                <w:noProof/>
+              </w:rPr>
+              <w:t>test_tc_2_13_nurse_create_claim_returns_403</w:t>
+            </w:r>
+          </w:p>
+        </w:tc>
+        <w:tc>
+          <w:tcPr>
+            <w:tcW w:w="286" w:type="dxa"/>
+          </w:tcPr>
+          <w:p>
+            <w:pPr>
+              <w:spacing w:before="0" w:after="0" w:line="240" w:lineRule="auto"/>
+              <w:ind w:left="0" w:firstLine="0"/>
+              <w:suppressAutoHyphens/>
+            </w:pPr>
+            <w:r>
+              <w:rPr>
+                <w:rFonts w:ascii="Calibri" w:hAnsi="Calibri"/>
+                <w:b w:val="0"/>
+                <w:i w:val="0"/>
+                <w:sz w:val="24"/>
+                <w:noProof/>
+              </w:rPr>
+              <w:t>TC-2.13</w:t>
+            </w:r>
+          </w:p>
+        </w:tc>
+        <w:tc>
+          <w:tcPr>
+            <w:tcW w:w="572" w:type="dxa"/>
+          </w:tcPr>
+          <w:p>
+            <w:pPr>
+              <w:spacing w:before="0" w:after="0" w:line="240" w:lineRule="auto"/>
+              <w:ind w:left="0" w:firstLine="0"/>
+              <w:suppressAutoHyphens/>
+            </w:pPr>
+            <w:r>
+              <w:rPr>
+                <w:rFonts w:ascii="Calibri" w:hAnsi="Calibri"/>
+                <w:b w:val="0"/>
+                <w:i w:val="0"/>
+                <w:sz w:val="24"/>
+                <w:noProof/>
+              </w:rPr>
+              <w:t>API</w:t>
+            </w:r>
+          </w:p>
+        </w:tc>
+        <w:tc>
+          <w:tcPr>
+            <w:tcW w:w="5802" w:type="dxa"/>
+          </w:tcPr>
+          <w:p>
+            <w:pPr>
+              <w:spacing w:before="0" w:after="0" w:line="240" w:lineRule="auto"/>
+              <w:ind w:left="0" w:firstLine="0"/>
+              <w:suppressAutoHyphens/>
+            </w:pPr>
+            <w:r>
+              <w:rPr>
+                <w:rFonts w:ascii="Calibri" w:hAnsi="Calibri"/>
+                <w:b w:val="0"/>
+                <w:i w:val="0"/>
+                <w:sz w:val="24"/>
+                <w:noProof/>
+              </w:rPr>
+              <w:t>POST /claims by nurse_medication_aide returns 403; claim count for the participant unchanged in DB</w:t>
             </w:r>
           </w:p>
         </w:tc>
@@ -10561,7 +10840,7 @@
           <w:sz w:val="24"/>
           <w:noProof/>
         </w:rPr>
-        <w:t>All 57 Phase 1 requirements have a dedicated test function. The table below shows the count per entity.</w:t>
+        <w:t>All 60 Phase 1 test cases have a dedicated test function. The table below shows the count per entity.</w:t>
       </w:r>
     </w:p>
     <w:tbl>
@@ -10579,10 +10858,10 @@
         </w:tblBorders>
       </w:tblPr>
       <w:tblGrid>
-        <w:gridCol w:w="2268"/>
-        <w:gridCol w:w="2062"/>
-        <w:gridCol w:w="2886"/>
-        <w:gridCol w:w="1855"/>
+        <w:gridCol w:w="1996"/>
+        <w:gridCol w:w="2903"/>
+        <w:gridCol w:w="2540"/>
+        <w:gridCol w:w="1633"/>
       </w:tblGrid>
       <w:tr>
         <w:trPr>
@@ -10590,7 +10869,7 @@
         </w:trPr>
         <w:tc>
           <w:tcPr>
-            <w:tcW w:w="2268" w:type="dxa"/>
+            <w:tcW w:w="1996" w:type="dxa"/>
           </w:tcPr>
           <w:p>
             <w:pPr>
@@ -10612,7 +10891,7 @@
         </w:tc>
         <w:tc>
           <w:tcPr>
-            <w:tcW w:w="2062" w:type="dxa"/>
+            <w:tcW w:w="2903" w:type="dxa"/>
           </w:tcPr>
           <w:p>
             <w:pPr>
@@ -10628,13 +10907,13 @@
                 <w:sz w:val="24"/>
                 <w:noProof/>
               </w:rPr>
-              <w:t>REQ_IDs</w:t>
-            </w:r>
-          </w:p>
-        </w:tc>
-        <w:tc>
-          <w:tcPr>
-            <w:tcW w:w="2886" w:type="dxa"/>
+              <w:t>TCs</w:t>
+            </w:r>
+          </w:p>
+        </w:tc>
+        <w:tc>
+          <w:tcPr>
+            <w:tcW w:w="2540" w:type="dxa"/>
           </w:tcPr>
           <w:p>
             <w:pPr>
@@ -10656,7 +10935,7 @@
         </w:tc>
         <w:tc>
           <w:tcPr>
-            <w:tcW w:w="1855" w:type="dxa"/>
+            <w:tcW w:w="1633" w:type="dxa"/>
           </w:tcPr>
           <w:p>
             <w:pPr>
@@ -10683,7 +10962,7 @@
         </w:trPr>
         <w:tc>
           <w:tcPr>
-            <w:tcW w:w="2268" w:type="dxa"/>
+            <w:tcW w:w="1996" w:type="dxa"/>
           </w:tcPr>
           <w:p>
             <w:pPr>
@@ -10705,51 +10984,51 @@
         </w:tc>
         <w:tc>
           <w:tcPr>
-            <w:tcW w:w="2062" w:type="dxa"/>
-          </w:tcPr>
-          <w:p>
-            <w:pPr>
-              <w:spacing w:before="0" w:after="0" w:line="240" w:lineRule="auto"/>
-              <w:ind w:left="0" w:firstLine="0"/>
-              <w:suppressAutoHyphens/>
-            </w:pPr>
-            <w:r>
-              <w:rPr>
-                <w:rFonts w:ascii="Calibri" w:hAnsi="Calibri"/>
-                <w:b w:val="0"/>
-                <w:i w:val="0"/>
-                <w:sz w:val="24"/>
-                <w:noProof/>
-              </w:rPr>
-              <w:t>1.1 - 1.10</w:t>
-            </w:r>
-          </w:p>
-        </w:tc>
-        <w:tc>
-          <w:tcPr>
-            <w:tcW w:w="2886" w:type="dxa"/>
-          </w:tcPr>
-          <w:p>
-            <w:pPr>
-              <w:spacing w:before="0" w:after="0" w:line="240" w:lineRule="auto"/>
-              <w:ind w:left="0" w:firstLine="0"/>
-              <w:suppressAutoHyphens/>
-            </w:pPr>
-            <w:r>
-              <w:rPr>
-                <w:rFonts w:ascii="Calibri" w:hAnsi="Calibri"/>
-                <w:b w:val="0"/>
-                <w:i w:val="0"/>
-                <w:sz w:val="24"/>
-                <w:noProof/>
-              </w:rPr>
-              <w:t>10</w:t>
-            </w:r>
-          </w:p>
-        </w:tc>
-        <w:tc>
-          <w:tcPr>
-            <w:tcW w:w="1855" w:type="dxa"/>
+            <w:tcW w:w="2903" w:type="dxa"/>
+          </w:tcPr>
+          <w:p>
+            <w:pPr>
+              <w:spacing w:before="0" w:after="0" w:line="240" w:lineRule="auto"/>
+              <w:ind w:left="0" w:firstLine="0"/>
+              <w:suppressAutoHyphens/>
+            </w:pPr>
+            <w:r>
+              <w:rPr>
+                <w:rFonts w:ascii="Calibri" w:hAnsi="Calibri"/>
+                <w:b w:val="0"/>
+                <w:i w:val="0"/>
+                <w:sz w:val="24"/>
+                <w:noProof/>
+              </w:rPr>
+              <w:t>TC-1.1 - TC-1.12</w:t>
+            </w:r>
+          </w:p>
+        </w:tc>
+        <w:tc>
+          <w:tcPr>
+            <w:tcW w:w="2540" w:type="dxa"/>
+          </w:tcPr>
+          <w:p>
+            <w:pPr>
+              <w:spacing w:before="0" w:after="0" w:line="240" w:lineRule="auto"/>
+              <w:ind w:left="0" w:firstLine="0"/>
+              <w:suppressAutoHyphens/>
+            </w:pPr>
+            <w:r>
+              <w:rPr>
+                <w:rFonts w:ascii="Calibri" w:hAnsi="Calibri"/>
+                <w:b w:val="0"/>
+                <w:i w:val="0"/>
+                <w:sz w:val="24"/>
+                <w:noProof/>
+              </w:rPr>
+              <w:t>12</w:t>
+            </w:r>
+          </w:p>
+        </w:tc>
+        <w:tc>
+          <w:tcPr>
+            <w:tcW w:w="1633" w:type="dxa"/>
           </w:tcPr>
           <w:p>
             <w:pPr>
@@ -10776,7 +11055,7 @@
         </w:trPr>
         <w:tc>
           <w:tcPr>
-            <w:tcW w:w="2268" w:type="dxa"/>
+            <w:tcW w:w="1996" w:type="dxa"/>
           </w:tcPr>
           <w:p>
             <w:pPr>
@@ -10798,51 +11077,51 @@
         </w:tc>
         <w:tc>
           <w:tcPr>
-            <w:tcW w:w="2062" w:type="dxa"/>
-          </w:tcPr>
-          <w:p>
-            <w:pPr>
-              <w:spacing w:before="0" w:after="0" w:line="240" w:lineRule="auto"/>
-              <w:ind w:left="0" w:firstLine="0"/>
-              <w:suppressAutoHyphens/>
-            </w:pPr>
-            <w:r>
-              <w:rPr>
-                <w:rFonts w:ascii="Calibri" w:hAnsi="Calibri"/>
-                <w:b w:val="0"/>
-                <w:i w:val="0"/>
-                <w:sz w:val="24"/>
-                <w:noProof/>
-              </w:rPr>
-              <w:t>2.1 - 2.12</w:t>
-            </w:r>
-          </w:p>
-        </w:tc>
-        <w:tc>
-          <w:tcPr>
-            <w:tcW w:w="2886" w:type="dxa"/>
-          </w:tcPr>
-          <w:p>
-            <w:pPr>
-              <w:spacing w:before="0" w:after="0" w:line="240" w:lineRule="auto"/>
-              <w:ind w:left="0" w:firstLine="0"/>
-              <w:suppressAutoHyphens/>
-            </w:pPr>
-            <w:r>
-              <w:rPr>
-                <w:rFonts w:ascii="Calibri" w:hAnsi="Calibri"/>
-                <w:b w:val="0"/>
-                <w:i w:val="0"/>
-                <w:sz w:val="24"/>
-                <w:noProof/>
-              </w:rPr>
-              <w:t>12</w:t>
-            </w:r>
-          </w:p>
-        </w:tc>
-        <w:tc>
-          <w:tcPr>
-            <w:tcW w:w="1855" w:type="dxa"/>
+            <w:tcW w:w="2903" w:type="dxa"/>
+          </w:tcPr>
+          <w:p>
+            <w:pPr>
+              <w:spacing w:before="0" w:after="0" w:line="240" w:lineRule="auto"/>
+              <w:ind w:left="0" w:firstLine="0"/>
+              <w:suppressAutoHyphens/>
+            </w:pPr>
+            <w:r>
+              <w:rPr>
+                <w:rFonts w:ascii="Calibri" w:hAnsi="Calibri"/>
+                <w:b w:val="0"/>
+                <w:i w:val="0"/>
+                <w:sz w:val="24"/>
+                <w:noProof/>
+              </w:rPr>
+              <w:t>TC-2.1 - TC-2.13</w:t>
+            </w:r>
+          </w:p>
+        </w:tc>
+        <w:tc>
+          <w:tcPr>
+            <w:tcW w:w="2540" w:type="dxa"/>
+          </w:tcPr>
+          <w:p>
+            <w:pPr>
+              <w:spacing w:before="0" w:after="0" w:line="240" w:lineRule="auto"/>
+              <w:ind w:left="0" w:firstLine="0"/>
+              <w:suppressAutoHyphens/>
+            </w:pPr>
+            <w:r>
+              <w:rPr>
+                <w:rFonts w:ascii="Calibri" w:hAnsi="Calibri"/>
+                <w:b w:val="0"/>
+                <w:i w:val="0"/>
+                <w:sz w:val="24"/>
+                <w:noProof/>
+              </w:rPr>
+              <w:t>13</w:t>
+            </w:r>
+          </w:p>
+        </w:tc>
+        <w:tc>
+          <w:tcPr>
+            <w:tcW w:w="1633" w:type="dxa"/>
           </w:tcPr>
           <w:p>
             <w:pPr>
@@ -10869,7 +11148,7 @@
         </w:trPr>
         <w:tc>
           <w:tcPr>
-            <w:tcW w:w="2268" w:type="dxa"/>
+            <w:tcW w:w="1996" w:type="dxa"/>
           </w:tcPr>
           <w:p>
             <w:pPr>
@@ -10891,7 +11170,7 @@
         </w:tc>
         <w:tc>
           <w:tcPr>
-            <w:tcW w:w="2062" w:type="dxa"/>
+            <w:tcW w:w="2903" w:type="dxa"/>
           </w:tcPr>
           <w:p>
             <w:pPr>
@@ -10913,7 +11192,7 @@
         </w:tc>
         <w:tc>
           <w:tcPr>
-            <w:tcW w:w="2886" w:type="dxa"/>
+            <w:tcW w:w="2540" w:type="dxa"/>
           </w:tcPr>
           <w:p>
             <w:pPr>
@@ -10935,7 +11214,7 @@
         </w:tc>
         <w:tc>
           <w:tcPr>
-            <w:tcW w:w="1855" w:type="dxa"/>
+            <w:tcW w:w="1633" w:type="dxa"/>
           </w:tcPr>
           <w:p>
             <w:pPr>
@@ -10962,7 +11241,7 @@
         </w:trPr>
         <w:tc>
           <w:tcPr>
-            <w:tcW w:w="2268" w:type="dxa"/>
+            <w:tcW w:w="1996" w:type="dxa"/>
           </w:tcPr>
           <w:p>
             <w:pPr>
@@ -10984,7 +11263,7 @@
         </w:tc>
         <w:tc>
           <w:tcPr>
-            <w:tcW w:w="2062" w:type="dxa"/>
+            <w:tcW w:w="2903" w:type="dxa"/>
           </w:tcPr>
           <w:p>
             <w:pPr>
@@ -11006,7 +11285,7 @@
         </w:tc>
         <w:tc>
           <w:tcPr>
-            <w:tcW w:w="2886" w:type="dxa"/>
+            <w:tcW w:w="2540" w:type="dxa"/>
           </w:tcPr>
           <w:p>
             <w:pPr>
@@ -11028,7 +11307,7 @@
         </w:tc>
         <w:tc>
           <w:tcPr>
-            <w:tcW w:w="1855" w:type="dxa"/>
+            <w:tcW w:w="1633" w:type="dxa"/>
           </w:tcPr>
           <w:p>
             <w:pPr>
@@ -11055,7 +11334,7 @@
         </w:trPr>
         <w:tc>
           <w:tcPr>
-            <w:tcW w:w="2268" w:type="dxa"/>
+            <w:tcW w:w="1996" w:type="dxa"/>
           </w:tcPr>
           <w:p>
             <w:pPr>
@@ -11077,7 +11356,7 @@
         </w:tc>
         <w:tc>
           <w:tcPr>
-            <w:tcW w:w="2062" w:type="dxa"/>
+            <w:tcW w:w="2903" w:type="dxa"/>
           </w:tcPr>
           <w:p>
             <w:pPr>
@@ -11099,7 +11378,7 @@
         </w:tc>
         <w:tc>
           <w:tcPr>
-            <w:tcW w:w="2886" w:type="dxa"/>
+            <w:tcW w:w="2540" w:type="dxa"/>
           </w:tcPr>
           <w:p>
             <w:pPr>
@@ -11121,7 +11400,7 @@
         </w:tc>
         <w:tc>
           <w:tcPr>
-            <w:tcW w:w="1855" w:type="dxa"/>
+            <w:tcW w:w="1633" w:type="dxa"/>
           </w:tcPr>
           <w:p>
             <w:pPr>
@@ -11148,7 +11427,7 @@
         </w:trPr>
         <w:tc>
           <w:tcPr>
-            <w:tcW w:w="2268" w:type="dxa"/>
+            <w:tcW w:w="1996" w:type="dxa"/>
           </w:tcPr>
           <w:p>
             <w:pPr>
@@ -11170,7 +11449,7 @@
         </w:tc>
         <w:tc>
           <w:tcPr>
-            <w:tcW w:w="2062" w:type="dxa"/>
+            <w:tcW w:w="2903" w:type="dxa"/>
           </w:tcPr>
           <w:p>
             <w:pPr>
@@ -11192,7 +11471,7 @@
         </w:tc>
         <w:tc>
           <w:tcPr>
-            <w:tcW w:w="2886" w:type="dxa"/>
+            <w:tcW w:w="2540" w:type="dxa"/>
           </w:tcPr>
           <w:p>
             <w:pPr>
@@ -11214,7 +11493,7 @@
         </w:tc>
         <w:tc>
           <w:tcPr>
-            <w:tcW w:w="1855" w:type="dxa"/>
+            <w:tcW w:w="1633" w:type="dxa"/>
           </w:tcPr>
           <w:p>
             <w:pPr>
@@ -11241,7 +11520,7 @@
         </w:trPr>
         <w:tc>
           <w:tcPr>
-            <w:tcW w:w="2268" w:type="dxa"/>
+            <w:tcW w:w="1996" w:type="dxa"/>
           </w:tcPr>
           <w:p>
             <w:pPr>
@@ -11263,7 +11542,7 @@
         </w:tc>
         <w:tc>
           <w:tcPr>
-            <w:tcW w:w="2062" w:type="dxa"/>
+            <w:tcW w:w="2903" w:type="dxa"/>
           </w:tcPr>
           <w:p>
             <w:pPr>
@@ -11279,13 +11558,13 @@
                 <w:sz w:val="24"/>
                 <w:noProof/>
               </w:rPr>
-              <w:t>57</w:t>
-            </w:r>
-          </w:p>
-        </w:tc>
-        <w:tc>
-          <w:tcPr>
-            <w:tcW w:w="2886" w:type="dxa"/>
+              <w:t>60</w:t>
+            </w:r>
+          </w:p>
+        </w:tc>
+        <w:tc>
+          <w:tcPr>
+            <w:tcW w:w="2540" w:type="dxa"/>
           </w:tcPr>
           <w:p>
             <w:pPr>
@@ -11301,13 +11580,13 @@
                 <w:sz w:val="24"/>
                 <w:noProof/>
               </w:rPr>
-              <w:t>57</w:t>
-            </w:r>
-          </w:p>
-        </w:tc>
-        <w:tc>
-          <w:tcPr>
-            <w:tcW w:w="1855" w:type="dxa"/>
+              <w:t>60</w:t>
+            </w:r>
+          </w:p>
+        </w:tc>
+        <w:tc>
+          <w:tcPr>
+            <w:tcW w:w="1633" w:type="dxa"/>
           </w:tcPr>
           <w:p>
             <w:pPr>
@@ -11481,7 +11760,7 @@
                 <w:sz w:val="24"/>
                 <w:noProof/>
               </w:rPr>
-              <w:t>35</w:t>
+              <w:t>45</w:t>
             </w:r>
           </w:p>
         </w:tc>
@@ -11552,7 +11831,7 @@
                 <w:sz w:val="24"/>
                 <w:noProof/>
               </w:rPr>
-              <w:t>44</w:t>
+              <w:t>39</w:t>
             </w:r>
           </w:p>
         </w:tc>
@@ -11623,7 +11902,7 @@
                 <w:sz w:val="24"/>
                 <w:noProof/>
               </w:rPr>
-              <w:t>11</w:t>
+              <w:t>9</w:t>
             </w:r>
           </w:p>
         </w:tc>
@@ -11694,7 +11973,7 @@
                 <w:sz w:val="24"/>
                 <w:noProof/>
               </w:rPr>
-              <w:t>90</w:t>
+              <w:t>93</w:t>
             </w:r>
           </w:p>
         </w:tc>

</xml_diff>

<commit_message>
add attendance tests 12 passing, update docs and README
</commit_message>
<xml_diff>
--- a/test_plan_phase1.docx
+++ b/test_plan_phase1.docx
@@ -495,7 +495,7 @@
                 <w:sz w:val="24"/>
                 <w:noProof/>
               </w:rPr>
-              <w:t>8</w:t>
+              <w:t>12</w:t>
             </w:r>
           </w:p>
         </w:tc>
@@ -517,7 +517,7 @@
                 <w:sz w:val="24"/>
                 <w:noProof/>
               </w:rPr>
-              <w:t>3.1 - 3.8</w:t>
+              <w:t>TC-3.1 - TC-3.12</w:t>
             </w:r>
           </w:p>
         </w:tc>
@@ -561,7 +561,7 @@
                 <w:sz w:val="24"/>
                 <w:noProof/>
               </w:rPr>
-              <w:t>Unique constraints, RBAC, State machine, Optimistic locking</w:t>
+              <w:t>Unique constraints, RBAC, State machine, Billing units, Audit log, Billed immutability</w:t>
             </w:r>
           </w:p>
         </w:tc>
@@ -1415,7 +1415,7 @@
                 <w:sz w:val="24"/>
                 <w:noProof/>
               </w:rPr>
-              <w:t>93</w:t>
+              <w:t>97</w:t>
             </w:r>
           </w:p>
         </w:tc>
@@ -1437,7 +1437,7 @@
                 <w:sz w:val="24"/>
                 <w:noProof/>
               </w:rPr>
-              <w:t>60 entity TCs</w:t>
+              <w:t>64 entity TCs</w:t>
             </w:r>
           </w:p>
         </w:tc>
@@ -4089,7 +4089,7 @@
           <w:sz w:val="26"/>
           <w:noProof/>
         </w:rPr>
-        <w:t>2.3 test_attendance.py - Attendance (8 tests)</w:t>
+        <w:t>2.3 test_attendance.py - Attendance (12 tests)</w:t>
       </w:r>
     </w:p>
     <w:tbl>
@@ -4107,10 +4107,10 @@
         </w:tblBorders>
       </w:tblPr>
       <w:tblGrid>
-        <w:gridCol w:w="2978"/>
-        <w:gridCol w:w="271"/>
+        <w:gridCol w:w="2572"/>
+        <w:gridCol w:w="316"/>
         <w:gridCol w:w="632"/>
-        <w:gridCol w:w="5190"/>
+        <w:gridCol w:w="5551"/>
       </w:tblGrid>
       <w:tr>
         <w:trPr>
@@ -4118,7 +4118,7 @@
         </w:trPr>
         <w:tc>
           <w:tcPr>
-            <w:tcW w:w="2978" w:type="dxa"/>
+            <w:tcW w:w="2572" w:type="dxa"/>
           </w:tcPr>
           <w:p>
             <w:pPr>
@@ -4140,7 +4140,7 @@
         </w:tc>
         <w:tc>
           <w:tcPr>
-            <w:tcW w:w="271" w:type="dxa"/>
+            <w:tcW w:w="316" w:type="dxa"/>
           </w:tcPr>
           <w:p>
             <w:pPr>
@@ -4156,7 +4156,7 @@
                 <w:sz w:val="24"/>
                 <w:noProof/>
               </w:rPr>
-              <w:t>REQ_ID</w:t>
+              <w:t>TC</w:t>
             </w:r>
           </w:p>
         </w:tc>
@@ -4184,7 +4184,7 @@
         </w:tc>
         <w:tc>
           <w:tcPr>
-            <w:tcW w:w="5190" w:type="dxa"/>
+            <w:tcW w:w="5551" w:type="dxa"/>
           </w:tcPr>
           <w:p>
             <w:pPr>
@@ -4211,45 +4211,45 @@
         </w:trPr>
         <w:tc>
           <w:tcPr>
-            <w:tcW w:w="2978" w:type="dxa"/>
-          </w:tcPr>
-          <w:p>
-            <w:pPr>
-              <w:spacing w:before="0" w:after="0" w:line="240" w:lineRule="auto"/>
-              <w:ind w:left="0" w:firstLine="0"/>
-              <w:suppressAutoHyphens/>
-            </w:pPr>
-            <w:r>
-              <w:rPr>
-                <w:rFonts w:ascii="Calibri" w:hAnsi="Calibri"/>
-                <w:b w:val="0"/>
-                <w:i w:val="0"/>
-                <w:sz w:val="24"/>
-                <w:noProof/>
-              </w:rPr>
-              <w:t>test_3_1_unique_attendance_per_participant_per_date</w:t>
-            </w:r>
-          </w:p>
-        </w:tc>
-        <w:tc>
-          <w:tcPr>
-            <w:tcW w:w="271" w:type="dxa"/>
-          </w:tcPr>
-          <w:p>
-            <w:pPr>
-              <w:spacing w:before="0" w:after="0" w:line="240" w:lineRule="auto"/>
-              <w:ind w:left="0" w:firstLine="0"/>
-              <w:suppressAutoHyphens/>
-            </w:pPr>
-            <w:r>
-              <w:rPr>
-                <w:rFonts w:ascii="Calibri" w:hAnsi="Calibri"/>
-                <w:b w:val="0"/>
-                <w:i w:val="0"/>
-                <w:sz w:val="24"/>
-                <w:noProof/>
-              </w:rPr>
-              <w:t>3.1</w:t>
+            <w:tcW w:w="2572" w:type="dxa"/>
+          </w:tcPr>
+          <w:p>
+            <w:pPr>
+              <w:spacing w:before="0" w:after="0" w:line="240" w:lineRule="auto"/>
+              <w:ind w:left="0" w:firstLine="0"/>
+              <w:suppressAutoHyphens/>
+            </w:pPr>
+            <w:r>
+              <w:rPr>
+                <w:rFonts w:ascii="Calibri" w:hAnsi="Calibri"/>
+                <w:b w:val="0"/>
+                <w:i w:val="0"/>
+                <w:sz w:val="24"/>
+                <w:noProof/>
+              </w:rPr>
+              <w:t>test_tc_3_1_positive_attendance_creation_by_program_administrator</w:t>
+            </w:r>
+          </w:p>
+        </w:tc>
+        <w:tc>
+          <w:tcPr>
+            <w:tcW w:w="316" w:type="dxa"/>
+          </w:tcPr>
+          <w:p>
+            <w:pPr>
+              <w:spacing w:before="0" w:after="0" w:line="240" w:lineRule="auto"/>
+              <w:ind w:left="0" w:firstLine="0"/>
+              <w:suppressAutoHyphens/>
+            </w:pPr>
+            <w:r>
+              <w:rPr>
+                <w:rFonts w:ascii="Calibri" w:hAnsi="Calibri"/>
+                <w:b w:val="0"/>
+                <w:i w:val="0"/>
+                <w:sz w:val="24"/>
+                <w:noProof/>
+              </w:rPr>
+              <w:t>TC-3.1</w:t>
             </w:r>
           </w:p>
         </w:tc>
@@ -4277,23 +4277,23 @@
         </w:tc>
         <w:tc>
           <w:tcPr>
-            <w:tcW w:w="5190" w:type="dxa"/>
-          </w:tcPr>
-          <w:p>
-            <w:pPr>
-              <w:spacing w:before="0" w:after="0" w:line="240" w:lineRule="auto"/>
-              <w:ind w:left="0" w:firstLine="0"/>
-              <w:suppressAutoHyphens/>
-            </w:pPr>
-            <w:r>
-              <w:rPr>
-                <w:rFonts w:ascii="Calibri" w:hAnsi="Calibri"/>
-                <w:b w:val="0"/>
-                <w:i w:val="0"/>
-                <w:sz w:val="24"/>
-                <w:noProof/>
-              </w:rPr>
-              <w:t>POST second Attendance for same participant_id and date_of_service in same tenant returns 409 ATTENDANCE_DUPLICATE_DATE</w:t>
+            <w:tcW w:w="5551" w:type="dxa"/>
+          </w:tcPr>
+          <w:p>
+            <w:pPr>
+              <w:spacing w:before="0" w:after="0" w:line="240" w:lineRule="auto"/>
+              <w:ind w:left="0" w:firstLine="0"/>
+              <w:suppressAutoHyphens/>
+            </w:pPr>
+            <w:r>
+              <w:rPr>
+                <w:rFonts w:ascii="Calibri" w:hAnsi="Calibri"/>
+                <w:b w:val="0"/>
+                <w:i w:val="0"/>
+                <w:sz w:val="24"/>
+                <w:noProof/>
+              </w:rPr>
+              <w:t>POST /attendance by program_administrator returns 201 with status pending and all required fields</w:t>
             </w:r>
           </w:p>
         </w:tc>
@@ -4304,45 +4304,45 @@
         </w:trPr>
         <w:tc>
           <w:tcPr>
-            <w:tcW w:w="2978" w:type="dxa"/>
-          </w:tcPr>
-          <w:p>
-            <w:pPr>
-              <w:spacing w:before="0" w:after="0" w:line="240" w:lineRule="auto"/>
-              <w:ind w:left="0" w:firstLine="0"/>
-              <w:suppressAutoHyphens/>
-            </w:pPr>
-            <w:r>
-              <w:rPr>
-                <w:rFonts w:ascii="Calibri" w:hAnsi="Calibri"/>
-                <w:b w:val="0"/>
-                <w:i w:val="0"/>
-                <w:sz w:val="24"/>
-                <w:noProof/>
-              </w:rPr>
-              <w:t>test_3_2_rbac_write_restricted_to_program_administrator_and_care_coordinator</w:t>
-            </w:r>
-          </w:p>
-        </w:tc>
-        <w:tc>
-          <w:tcPr>
-            <w:tcW w:w="271" w:type="dxa"/>
-          </w:tcPr>
-          <w:p>
-            <w:pPr>
-              <w:spacing w:before="0" w:after="0" w:line="240" w:lineRule="auto"/>
-              <w:ind w:left="0" w:firstLine="0"/>
-              <w:suppressAutoHyphens/>
-            </w:pPr>
-            <w:r>
-              <w:rPr>
-                <w:rFonts w:ascii="Calibri" w:hAnsi="Calibri"/>
-                <w:b w:val="0"/>
-                <w:i w:val="0"/>
-                <w:sz w:val="24"/>
-                <w:noProof/>
-              </w:rPr>
-              <w:t>3.2</w:t>
+            <w:tcW w:w="2572" w:type="dxa"/>
+          </w:tcPr>
+          <w:p>
+            <w:pPr>
+              <w:spacing w:before="0" w:after="0" w:line="240" w:lineRule="auto"/>
+              <w:ind w:left="0" w:firstLine="0"/>
+              <w:suppressAutoHyphens/>
+            </w:pPr>
+            <w:r>
+              <w:rPr>
+                <w:rFonts w:ascii="Calibri" w:hAnsi="Calibri"/>
+                <w:b w:val="0"/>
+                <w:i w:val="0"/>
+                <w:sz w:val="24"/>
+                <w:noProof/>
+              </w:rPr>
+              <w:t>test_tc_3_2_positive_attendance_creation_by_care_coordinator</w:t>
+            </w:r>
+          </w:p>
+        </w:tc>
+        <w:tc>
+          <w:tcPr>
+            <w:tcW w:w="316" w:type="dxa"/>
+          </w:tcPr>
+          <w:p>
+            <w:pPr>
+              <w:spacing w:before="0" w:after="0" w:line="240" w:lineRule="auto"/>
+              <w:ind w:left="0" w:firstLine="0"/>
+              <w:suppressAutoHyphens/>
+            </w:pPr>
+            <w:r>
+              <w:rPr>
+                <w:rFonts w:ascii="Calibri" w:hAnsi="Calibri"/>
+                <w:b w:val="0"/>
+                <w:i w:val="0"/>
+                <w:sz w:val="24"/>
+                <w:noProof/>
+              </w:rPr>
+              <w:t>TC-3.2</w:t>
             </w:r>
           </w:p>
         </w:tc>
@@ -4370,23 +4370,23 @@
         </w:tc>
         <w:tc>
           <w:tcPr>
-            <w:tcW w:w="5190" w:type="dxa"/>
-          </w:tcPr>
-          <w:p>
-            <w:pPr>
-              <w:spacing w:before="0" w:after="0" w:line="240" w:lineRule="auto"/>
-              <w:ind w:left="0" w:firstLine="0"/>
-              <w:suppressAutoHyphens/>
-            </w:pPr>
-            <w:r>
-              <w:rPr>
-                <w:rFonts w:ascii="Calibri" w:hAnsi="Calibri"/>
-                <w:b w:val="0"/>
-                <w:i w:val="0"/>
-                <w:sz w:val="24"/>
-                <w:noProof/>
-              </w:rPr>
-              <w:t>POST or PATCH from billing_specialist, physician, or participant_family returns 403; authorized roles succeed</w:t>
+            <w:tcW w:w="5551" w:type="dxa"/>
+          </w:tcPr>
+          <w:p>
+            <w:pPr>
+              <w:spacing w:before="0" w:after="0" w:line="240" w:lineRule="auto"/>
+              <w:ind w:left="0" w:firstLine="0"/>
+              <w:suppressAutoHyphens/>
+            </w:pPr>
+            <w:r>
+              <w:rPr>
+                <w:rFonts w:ascii="Calibri" w:hAnsi="Calibri"/>
+                <w:b w:val="0"/>
+                <w:i w:val="0"/>
+                <w:sz w:val="24"/>
+                <w:noProof/>
+              </w:rPr>
+              <w:t>POST /attendance by care_coordinator returns 201 with status pending; row persisted in DB</w:t>
             </w:r>
           </w:p>
         </w:tc>
@@ -4397,45 +4397,45 @@
         </w:trPr>
         <w:tc>
           <w:tcPr>
-            <w:tcW w:w="2978" w:type="dxa"/>
-          </w:tcPr>
-          <w:p>
-            <w:pPr>
-              <w:spacing w:before="0" w:after="0" w:line="240" w:lineRule="auto"/>
-              <w:ind w:left="0" w:firstLine="0"/>
-              <w:suppressAutoHyphens/>
-            </w:pPr>
-            <w:r>
-              <w:rPr>
-                <w:rFonts w:ascii="Calibri" w:hAnsi="Calibri"/>
-                <w:b w:val="0"/>
-                <w:i w:val="0"/>
-                <w:sz w:val="24"/>
-                <w:noProof/>
-              </w:rPr>
-              <w:t>test_3_3_attendance_status_state_machine_transitions</w:t>
-            </w:r>
-          </w:p>
-        </w:tc>
-        <w:tc>
-          <w:tcPr>
-            <w:tcW w:w="271" w:type="dxa"/>
-          </w:tcPr>
-          <w:p>
-            <w:pPr>
-              <w:spacing w:before="0" w:after="0" w:line="240" w:lineRule="auto"/>
-              <w:ind w:left="0" w:firstLine="0"/>
-              <w:suppressAutoHyphens/>
-            </w:pPr>
-            <w:r>
-              <w:rPr>
-                <w:rFonts w:ascii="Calibri" w:hAnsi="Calibri"/>
-                <w:b w:val="0"/>
-                <w:i w:val="0"/>
-                <w:sz w:val="24"/>
-                <w:noProof/>
-              </w:rPr>
-              <w:t>3.3</w:t>
+            <w:tcW w:w="2572" w:type="dxa"/>
+          </w:tcPr>
+          <w:p>
+            <w:pPr>
+              <w:spacing w:before="0" w:after="0" w:line="240" w:lineRule="auto"/>
+              <w:ind w:left="0" w:firstLine="0"/>
+              <w:suppressAutoHyphens/>
+            </w:pPr>
+            <w:r>
+              <w:rPr>
+                <w:rFonts w:ascii="Calibri" w:hAnsi="Calibri"/>
+                <w:b w:val="0"/>
+                <w:i w:val="0"/>
+                <w:sz w:val="24"/>
+                <w:noProof/>
+              </w:rPr>
+              <w:t>test_tc_3_3_missing_date_of_service_returns_400</w:t>
+            </w:r>
+          </w:p>
+        </w:tc>
+        <w:tc>
+          <w:tcPr>
+            <w:tcW w:w="316" w:type="dxa"/>
+          </w:tcPr>
+          <w:p>
+            <w:pPr>
+              <w:spacing w:before="0" w:after="0" w:line="240" w:lineRule="auto"/>
+              <w:ind w:left="0" w:firstLine="0"/>
+              <w:suppressAutoHyphens/>
+            </w:pPr>
+            <w:r>
+              <w:rPr>
+                <w:rFonts w:ascii="Calibri" w:hAnsi="Calibri"/>
+                <w:b w:val="0"/>
+                <w:i w:val="0"/>
+                <w:sz w:val="24"/>
+                <w:noProof/>
+              </w:rPr>
+              <w:t>TC-3.3</w:t>
             </w:r>
           </w:p>
         </w:tc>
@@ -4457,29 +4457,29 @@
                 <w:sz w:val="24"/>
                 <w:noProof/>
               </w:rPr>
-              <w:t>Business Rules</w:t>
-            </w:r>
-          </w:p>
-        </w:tc>
-        <w:tc>
-          <w:tcPr>
-            <w:tcW w:w="5190" w:type="dxa"/>
-          </w:tcPr>
-          <w:p>
-            <w:pPr>
-              <w:spacing w:before="0" w:after="0" w:line="240" w:lineRule="auto"/>
-              <w:ind w:left="0" w:firstLine="0"/>
-              <w:suppressAutoHyphens/>
-            </w:pPr>
-            <w:r>
-              <w:rPr>
-                <w:rFonts w:ascii="Calibri" w:hAnsi="Calibri"/>
-                <w:b w:val="0"/>
-                <w:i w:val="0"/>
-                <w:sz w:val="24"/>
-                <w:noProof/>
-              </w:rPr>
-              <w:t>Edit to confirmed record resets status to pending; pending Attendance referenced in Claim returns 422</w:t>
+              <w:t>API</w:t>
+            </w:r>
+          </w:p>
+        </w:tc>
+        <w:tc>
+          <w:tcPr>
+            <w:tcW w:w="5551" w:type="dxa"/>
+          </w:tcPr>
+          <w:p>
+            <w:pPr>
+              <w:spacing w:before="0" w:after="0" w:line="240" w:lineRule="auto"/>
+              <w:ind w:left="0" w:firstLine="0"/>
+              <w:suppressAutoHyphens/>
+            </w:pPr>
+            <w:r>
+              <w:rPr>
+                <w:rFonts w:ascii="Calibri" w:hAnsi="Calibri"/>
+                <w:b w:val="0"/>
+                <w:i w:val="0"/>
+                <w:sz w:val="24"/>
+                <w:noProof/>
+              </w:rPr>
+              <w:t>POST /attendance without date_of_service returns 400 or 422 identifying date_of_service; no row created</w:t>
             </w:r>
           </w:p>
         </w:tc>
@@ -4490,45 +4490,45 @@
         </w:trPr>
         <w:tc>
           <w:tcPr>
-            <w:tcW w:w="2978" w:type="dxa"/>
-          </w:tcPr>
-          <w:p>
-            <w:pPr>
-              <w:spacing w:before="0" w:after="0" w:line="240" w:lineRule="auto"/>
-              <w:ind w:left="0" w:firstLine="0"/>
-              <w:suppressAutoHyphens/>
-            </w:pPr>
-            <w:r>
-              <w:rPr>
-                <w:rFonts w:ascii="Calibri" w:hAnsi="Calibri"/>
-                <w:b w:val="0"/>
-                <w:i w:val="0"/>
-                <w:sz w:val="24"/>
-                <w:noProof/>
-              </w:rPr>
-              <w:t>test_3_4_void_reason_required_when_status_is_voided</w:t>
-            </w:r>
-          </w:p>
-        </w:tc>
-        <w:tc>
-          <w:tcPr>
-            <w:tcW w:w="271" w:type="dxa"/>
-          </w:tcPr>
-          <w:p>
-            <w:pPr>
-              <w:spacing w:before="0" w:after="0" w:line="240" w:lineRule="auto"/>
-              <w:ind w:left="0" w:firstLine="0"/>
-              <w:suppressAutoHyphens/>
-            </w:pPr>
-            <w:r>
-              <w:rPr>
-                <w:rFonts w:ascii="Calibri" w:hAnsi="Calibri"/>
-                <w:b w:val="0"/>
-                <w:i w:val="0"/>
-                <w:sz w:val="24"/>
-                <w:noProof/>
-              </w:rPr>
-              <w:t>3.4</w:t>
+            <w:tcW w:w="2572" w:type="dxa"/>
+          </w:tcPr>
+          <w:p>
+            <w:pPr>
+              <w:spacing w:before="0" w:after="0" w:line="240" w:lineRule="auto"/>
+              <w:ind w:left="0" w:firstLine="0"/>
+              <w:suppressAutoHyphens/>
+            </w:pPr>
+            <w:r>
+              <w:rPr>
+                <w:rFonts w:ascii="Calibri" w:hAnsi="Calibri"/>
+                <w:b w:val="0"/>
+                <w:i w:val="0"/>
+                <w:sz w:val="24"/>
+                <w:noProof/>
+              </w:rPr>
+              <w:t>test_tc_3_4_missing_participant_id_returns_400</w:t>
+            </w:r>
+          </w:p>
+        </w:tc>
+        <w:tc>
+          <w:tcPr>
+            <w:tcW w:w="316" w:type="dxa"/>
+          </w:tcPr>
+          <w:p>
+            <w:pPr>
+              <w:spacing w:before="0" w:after="0" w:line="240" w:lineRule="auto"/>
+              <w:ind w:left="0" w:firstLine="0"/>
+              <w:suppressAutoHyphens/>
+            </w:pPr>
+            <w:r>
+              <w:rPr>
+                <w:rFonts w:ascii="Calibri" w:hAnsi="Calibri"/>
+                <w:b w:val="0"/>
+                <w:i w:val="0"/>
+                <w:sz w:val="24"/>
+                <w:noProof/>
+              </w:rPr>
+              <w:t>TC-3.4</w:t>
             </w:r>
           </w:p>
         </w:tc>
@@ -4556,23 +4556,23 @@
         </w:tc>
         <w:tc>
           <w:tcPr>
-            <w:tcW w:w="5190" w:type="dxa"/>
-          </w:tcPr>
-          <w:p>
-            <w:pPr>
-              <w:spacing w:before="0" w:after="0" w:line="240" w:lineRule="auto"/>
-              <w:ind w:left="0" w:firstLine="0"/>
-              <w:suppressAutoHyphens/>
-            </w:pPr>
-            <w:r>
-              <w:rPr>
-                <w:rFonts w:ascii="Calibri" w:hAnsi="Calibri"/>
-                <w:b w:val="0"/>
-                <w:i w:val="0"/>
-                <w:sz w:val="24"/>
-                <w:noProof/>
-              </w:rPr>
-              <w:t>PATCH to voided without void_reason returns 422 Unprocessable Entity; with void_reason returns 200</w:t>
+            <w:tcW w:w="5551" w:type="dxa"/>
+          </w:tcPr>
+          <w:p>
+            <w:pPr>
+              <w:spacing w:before="0" w:after="0" w:line="240" w:lineRule="auto"/>
+              <w:ind w:left="0" w:firstLine="0"/>
+              <w:suppressAutoHyphens/>
+            </w:pPr>
+            <w:r>
+              <w:rPr>
+                <w:rFonts w:ascii="Calibri" w:hAnsi="Calibri"/>
+                <w:b w:val="0"/>
+                <w:i w:val="0"/>
+                <w:sz w:val="24"/>
+                <w:noProof/>
+              </w:rPr>
+              <w:t>POST /attendance without participant_id returns 400 or 422 identifying participant_id; no row created</w:t>
             </w:r>
           </w:p>
         </w:tc>
@@ -4583,45 +4583,45 @@
         </w:trPr>
         <w:tc>
           <w:tcPr>
-            <w:tcW w:w="2978" w:type="dxa"/>
-          </w:tcPr>
-          <w:p>
-            <w:pPr>
-              <w:spacing w:before="0" w:after="0" w:line="240" w:lineRule="auto"/>
-              <w:ind w:left="0" w:firstLine="0"/>
-              <w:suppressAutoHyphens/>
-            </w:pPr>
-            <w:r>
-              <w:rPr>
-                <w:rFonts w:ascii="Calibri" w:hAnsi="Calibri"/>
-                <w:b w:val="0"/>
-                <w:i w:val="0"/>
-                <w:sz w:val="24"/>
-                <w:noProof/>
-              </w:rPr>
-              <w:t>test_3_5_audit_log_on_attendance_write_operations</w:t>
-            </w:r>
-          </w:p>
-        </w:tc>
-        <w:tc>
-          <w:tcPr>
-            <w:tcW w:w="271" w:type="dxa"/>
-          </w:tcPr>
-          <w:p>
-            <w:pPr>
-              <w:spacing w:before="0" w:after="0" w:line="240" w:lineRule="auto"/>
-              <w:ind w:left="0" w:firstLine="0"/>
-              <w:suppressAutoHyphens/>
-            </w:pPr>
-            <w:r>
-              <w:rPr>
-                <w:rFonts w:ascii="Calibri" w:hAnsi="Calibri"/>
-                <w:b w:val="0"/>
-                <w:i w:val="0"/>
-                <w:sz w:val="24"/>
-                <w:noProof/>
-              </w:rPr>
-              <w:t>3.5</w:t>
+            <w:tcW w:w="2572" w:type="dxa"/>
+          </w:tcPr>
+          <w:p>
+            <w:pPr>
+              <w:spacing w:before="0" w:after="0" w:line="240" w:lineRule="auto"/>
+              <w:ind w:left="0" w:firstLine="0"/>
+              <w:suppressAutoHyphens/>
+            </w:pPr>
+            <w:r>
+              <w:rPr>
+                <w:rFonts w:ascii="Calibri" w:hAnsi="Calibri"/>
+                <w:b w:val="0"/>
+                <w:i w:val="0"/>
+                <w:sz w:val="24"/>
+                <w:noProof/>
+              </w:rPr>
+              <w:t>test_tc_3_5_duplicate_participant_date_returns_409</w:t>
+            </w:r>
+          </w:p>
+        </w:tc>
+        <w:tc>
+          <w:tcPr>
+            <w:tcW w:w="316" w:type="dxa"/>
+          </w:tcPr>
+          <w:p>
+            <w:pPr>
+              <w:spacing w:before="0" w:after="0" w:line="240" w:lineRule="auto"/>
+              <w:ind w:left="0" w:firstLine="0"/>
+              <w:suppressAutoHyphens/>
+            </w:pPr>
+            <w:r>
+              <w:rPr>
+                <w:rFonts w:ascii="Calibri" w:hAnsi="Calibri"/>
+                <w:b w:val="0"/>
+                <w:i w:val="0"/>
+                <w:sz w:val="24"/>
+                <w:noProof/>
+              </w:rPr>
+              <w:t>TC-3.5</w:t>
             </w:r>
           </w:p>
         </w:tc>
@@ -4643,29 +4643,29 @@
                 <w:sz w:val="24"/>
                 <w:noProof/>
               </w:rPr>
-              <w:t>Business Rules</w:t>
-            </w:r>
-          </w:p>
-        </w:tc>
-        <w:tc>
-          <w:tcPr>
-            <w:tcW w:w="5190" w:type="dxa"/>
-          </w:tcPr>
-          <w:p>
-            <w:pPr>
-              <w:spacing w:before="0" w:after="0" w:line="240" w:lineRule="auto"/>
-              <w:ind w:left="0" w:firstLine="0"/>
-              <w:suppressAutoHyphens/>
-            </w:pPr>
-            <w:r>
-              <w:rPr>
-                <w:rFonts w:ascii="Calibri" w:hAnsi="Calibri"/>
-                <w:b w:val="0"/>
-                <w:i w:val="0"/>
-                <w:sz w:val="24"/>
-                <w:noProof/>
-              </w:rPr>
-              <w:t>Any Attendance write produces audit event with all mandatory fields; data_affected lists field names only</w:t>
+              <w:t>API</w:t>
+            </w:r>
+          </w:p>
+        </w:tc>
+        <w:tc>
+          <w:tcPr>
+            <w:tcW w:w="5551" w:type="dxa"/>
+          </w:tcPr>
+          <w:p>
+            <w:pPr>
+              <w:spacing w:before="0" w:after="0" w:line="240" w:lineRule="auto"/>
+              <w:ind w:left="0" w:firstLine="0"/>
+              <w:suppressAutoHyphens/>
+            </w:pPr>
+            <w:r>
+              <w:rPr>
+                <w:rFonts w:ascii="Calibri" w:hAnsi="Calibri"/>
+                <w:b w:val="0"/>
+                <w:i w:val="0"/>
+                <w:sz w:val="24"/>
+                <w:noProof/>
+              </w:rPr>
+              <w:t>POST second Attendance for same participant_id and date_of_service returns 409 ATTENDANCE_DUPLICATE_DATE; exactly one row in DB</w:t>
             </w:r>
           </w:p>
         </w:tc>
@@ -4676,45 +4676,45 @@
         </w:trPr>
         <w:tc>
           <w:tcPr>
-            <w:tcW w:w="2978" w:type="dxa"/>
-          </w:tcPr>
-          <w:p>
-            <w:pPr>
-              <w:spacing w:before="0" w:after="0" w:line="240" w:lineRule="auto"/>
-              <w:ind w:left="0" w:firstLine="0"/>
-              <w:suppressAutoHyphens/>
-            </w:pPr>
-            <w:r>
-              <w:rPr>
-                <w:rFonts w:ascii="Calibri" w:hAnsi="Calibri"/>
-                <w:b w:val="0"/>
-                <w:i w:val="0"/>
-                <w:sz w:val="24"/>
-                <w:noProof/>
-              </w:rPr>
-              <w:t>test_3_6_authorized_units_consumed_derived_from_total_hours</w:t>
-            </w:r>
-          </w:p>
-        </w:tc>
-        <w:tc>
-          <w:tcPr>
-            <w:tcW w:w="271" w:type="dxa"/>
-          </w:tcPr>
-          <w:p>
-            <w:pPr>
-              <w:spacing w:before="0" w:after="0" w:line="240" w:lineRule="auto"/>
-              <w:ind w:left="0" w:firstLine="0"/>
-              <w:suppressAutoHyphens/>
-            </w:pPr>
-            <w:r>
-              <w:rPr>
-                <w:rFonts w:ascii="Calibri" w:hAnsi="Calibri"/>
-                <w:b w:val="0"/>
-                <w:i w:val="0"/>
-                <w:sz w:val="24"/>
-                <w:noProof/>
-              </w:rPr>
-              <w:t>3.6</w:t>
+            <w:tcW w:w="2572" w:type="dxa"/>
+          </w:tcPr>
+          <w:p>
+            <w:pPr>
+              <w:spacing w:before="0" w:after="0" w:line="240" w:lineRule="auto"/>
+              <w:ind w:left="0" w:firstLine="0"/>
+              <w:suppressAutoHyphens/>
+            </w:pPr>
+            <w:r>
+              <w:rPr>
+                <w:rFonts w:ascii="Calibri" w:hAnsi="Calibri"/>
+                <w:b w:val="0"/>
+                <w:i w:val="0"/>
+                <w:sz w:val="24"/>
+                <w:noProof/>
+              </w:rPr>
+              <w:t>test_tc_3_6_status_transition_pending_to_confirmed</w:t>
+            </w:r>
+          </w:p>
+        </w:tc>
+        <w:tc>
+          <w:tcPr>
+            <w:tcW w:w="316" w:type="dxa"/>
+          </w:tcPr>
+          <w:p>
+            <w:pPr>
+              <w:spacing w:before="0" w:after="0" w:line="240" w:lineRule="auto"/>
+              <w:ind w:left="0" w:firstLine="0"/>
+              <w:suppressAutoHyphens/>
+            </w:pPr>
+            <w:r>
+              <w:rPr>
+                <w:rFonts w:ascii="Calibri" w:hAnsi="Calibri"/>
+                <w:b w:val="0"/>
+                <w:i w:val="0"/>
+                <w:sz w:val="24"/>
+                <w:noProof/>
+              </w:rPr>
+              <w:t>TC-3.6</w:t>
             </w:r>
           </w:p>
         </w:tc>
@@ -4742,23 +4742,23 @@
         </w:tc>
         <w:tc>
           <w:tcPr>
-            <w:tcW w:w="5190" w:type="dxa"/>
-          </w:tcPr>
-          <w:p>
-            <w:pPr>
-              <w:spacing w:before="0" w:after="0" w:line="240" w:lineRule="auto"/>
-              <w:ind w:left="0" w:firstLine="0"/>
-              <w:suppressAutoHyphens/>
-            </w:pPr>
-            <w:r>
-              <w:rPr>
-                <w:rFonts w:ascii="Calibri" w:hAnsi="Calibri"/>
-                <w:b w:val="0"/>
-                <w:i w:val="0"/>
-                <w:sz w:val="24"/>
-                <w:noProof/>
-              </w:rPr>
-              <w:t>Medicaid sign-out of 6 h sets authorized_units_consumed=24; Medicare daily-rate sign-out sets value=1.00</w:t>
+            <w:tcW w:w="5551" w:type="dxa"/>
+          </w:tcPr>
+          <w:p>
+            <w:pPr>
+              <w:spacing w:before="0" w:after="0" w:line="240" w:lineRule="auto"/>
+              <w:ind w:left="0" w:firstLine="0"/>
+              <w:suppressAutoHyphens/>
+            </w:pPr>
+            <w:r>
+              <w:rPr>
+                <w:rFonts w:ascii="Calibri" w:hAnsi="Calibri"/>
+                <w:b w:val="0"/>
+                <w:i w:val="0"/>
+                <w:sz w:val="24"/>
+                <w:noProof/>
+              </w:rPr>
+              <w:t>PATCH status from pending to confirmed returns 200; DB shows confirmed and version n+1</w:t>
             </w:r>
           </w:p>
         </w:tc>
@@ -4769,45 +4769,45 @@
         </w:trPr>
         <w:tc>
           <w:tcPr>
-            <w:tcW w:w="2978" w:type="dxa"/>
-          </w:tcPr>
-          <w:p>
-            <w:pPr>
-              <w:spacing w:before="0" w:after="0" w:line="240" w:lineRule="auto"/>
-              <w:ind w:left="0" w:firstLine="0"/>
-              <w:suppressAutoHyphens/>
-            </w:pPr>
-            <w:r>
-              <w:rPr>
-                <w:rFonts w:ascii="Calibri" w:hAnsi="Calibri"/>
-                <w:b w:val="0"/>
-                <w:i w:val="0"/>
-                <w:sz w:val="24"/>
-                <w:noProof/>
-              </w:rPr>
-              <w:t>test_3_7_void_blocked_when_referencing_claim_is_active</w:t>
-            </w:r>
-          </w:p>
-        </w:tc>
-        <w:tc>
-          <w:tcPr>
-            <w:tcW w:w="271" w:type="dxa"/>
-          </w:tcPr>
-          <w:p>
-            <w:pPr>
-              <w:spacing w:before="0" w:after="0" w:line="240" w:lineRule="auto"/>
-              <w:ind w:left="0" w:firstLine="0"/>
-              <w:suppressAutoHyphens/>
-            </w:pPr>
-            <w:r>
-              <w:rPr>
-                <w:rFonts w:ascii="Calibri" w:hAnsi="Calibri"/>
-                <w:b w:val="0"/>
-                <w:i w:val="0"/>
-                <w:sz w:val="24"/>
-                <w:noProof/>
-              </w:rPr>
-              <w:t>3.7</w:t>
+            <w:tcW w:w="2572" w:type="dxa"/>
+          </w:tcPr>
+          <w:p>
+            <w:pPr>
+              <w:spacing w:before="0" w:after="0" w:line="240" w:lineRule="auto"/>
+              <w:ind w:left="0" w:firstLine="0"/>
+              <w:suppressAutoHyphens/>
+            </w:pPr>
+            <w:r>
+              <w:rPr>
+                <w:rFonts w:ascii="Calibri" w:hAnsi="Calibri"/>
+                <w:b w:val="0"/>
+                <w:i w:val="0"/>
+                <w:sz w:val="24"/>
+                <w:noProof/>
+              </w:rPr>
+              <w:t>test_tc_3_7_void_with_void_reason_returns_200</w:t>
+            </w:r>
+          </w:p>
+        </w:tc>
+        <w:tc>
+          <w:tcPr>
+            <w:tcW w:w="316" w:type="dxa"/>
+          </w:tcPr>
+          <w:p>
+            <w:pPr>
+              <w:spacing w:before="0" w:after="0" w:line="240" w:lineRule="auto"/>
+              <w:ind w:left="0" w:firstLine="0"/>
+              <w:suppressAutoHyphens/>
+            </w:pPr>
+            <w:r>
+              <w:rPr>
+                <w:rFonts w:ascii="Calibri" w:hAnsi="Calibri"/>
+                <w:b w:val="0"/>
+                <w:i w:val="0"/>
+                <w:sz w:val="24"/>
+                <w:noProof/>
+              </w:rPr>
+              <w:t>TC-3.7</w:t>
             </w:r>
           </w:p>
         </w:tc>
@@ -4835,23 +4835,23 @@
         </w:tc>
         <w:tc>
           <w:tcPr>
-            <w:tcW w:w="5190" w:type="dxa"/>
-          </w:tcPr>
-          <w:p>
-            <w:pPr>
-              <w:spacing w:before="0" w:after="0" w:line="240" w:lineRule="auto"/>
-              <w:ind w:left="0" w:firstLine="0"/>
-              <w:suppressAutoHyphens/>
-            </w:pPr>
-            <w:r>
-              <w:rPr>
-                <w:rFonts w:ascii="Calibri" w:hAnsi="Calibri"/>
-                <w:b w:val="0"/>
-                <w:i w:val="0"/>
-                <w:sz w:val="24"/>
-                <w:noProof/>
-              </w:rPr>
-              <w:t>Void on billed Attendance with active Claim returns 422; void attempt by care_coordinator returns 403</w:t>
+            <w:tcW w:w="5551" w:type="dxa"/>
+          </w:tcPr>
+          <w:p>
+            <w:pPr>
+              <w:spacing w:before="0" w:after="0" w:line="240" w:lineRule="auto"/>
+              <w:ind w:left="0" w:firstLine="0"/>
+              <w:suppressAutoHyphens/>
+            </w:pPr>
+            <w:r>
+              <w:rPr>
+                <w:rFonts w:ascii="Calibri" w:hAnsi="Calibri"/>
+                <w:b w:val="0"/>
+                <w:i w:val="0"/>
+                <w:sz w:val="24"/>
+                <w:noProof/>
+              </w:rPr>
+              <w:t>PATCH with status=voided and void_reason returns 200; DB shows voided and void_reason persisted</w:t>
             </w:r>
           </w:p>
         </w:tc>
@@ -4862,45 +4862,45 @@
         </w:trPr>
         <w:tc>
           <w:tcPr>
-            <w:tcW w:w="2978" w:type="dxa"/>
-          </w:tcPr>
-          <w:p>
-            <w:pPr>
-              <w:spacing w:before="0" w:after="0" w:line="240" w:lineRule="auto"/>
-              <w:ind w:left="0" w:firstLine="0"/>
-              <w:suppressAutoHyphens/>
-            </w:pPr>
-            <w:r>
-              <w:rPr>
-                <w:rFonts w:ascii="Calibri" w:hAnsi="Calibri"/>
-                <w:b w:val="0"/>
-                <w:i w:val="0"/>
-                <w:sz w:val="24"/>
-                <w:noProof/>
-              </w:rPr>
-              <w:t>test_3_8_optimistic_locking_version_conflict_returns_409</w:t>
-            </w:r>
-          </w:p>
-        </w:tc>
-        <w:tc>
-          <w:tcPr>
-            <w:tcW w:w="271" w:type="dxa"/>
-          </w:tcPr>
-          <w:p>
-            <w:pPr>
-              <w:spacing w:before="0" w:after="0" w:line="240" w:lineRule="auto"/>
-              <w:ind w:left="0" w:firstLine="0"/>
-              <w:suppressAutoHyphens/>
-            </w:pPr>
-            <w:r>
-              <w:rPr>
-                <w:rFonts w:ascii="Calibri" w:hAnsi="Calibri"/>
-                <w:b w:val="0"/>
-                <w:i w:val="0"/>
-                <w:sz w:val="24"/>
-                <w:noProof/>
-              </w:rPr>
-              <w:t>3.8</w:t>
+            <w:tcW w:w="2572" w:type="dxa"/>
+          </w:tcPr>
+          <w:p>
+            <w:pPr>
+              <w:spacing w:before="0" w:after="0" w:line="240" w:lineRule="auto"/>
+              <w:ind w:left="0" w:firstLine="0"/>
+              <w:suppressAutoHyphens/>
+            </w:pPr>
+            <w:r>
+              <w:rPr>
+                <w:rFonts w:ascii="Calibri" w:hAnsi="Calibri"/>
+                <w:b w:val="0"/>
+                <w:i w:val="0"/>
+                <w:sz w:val="24"/>
+                <w:noProof/>
+              </w:rPr>
+              <w:t>test_tc_3_8_void_without_void_reason_returns_422</w:t>
+            </w:r>
+          </w:p>
+        </w:tc>
+        <w:tc>
+          <w:tcPr>
+            <w:tcW w:w="316" w:type="dxa"/>
+          </w:tcPr>
+          <w:p>
+            <w:pPr>
+              <w:spacing w:before="0" w:after="0" w:line="240" w:lineRule="auto"/>
+              <w:ind w:left="0" w:firstLine="0"/>
+              <w:suppressAutoHyphens/>
+            </w:pPr>
+            <w:r>
+              <w:rPr>
+                <w:rFonts w:ascii="Calibri" w:hAnsi="Calibri"/>
+                <w:b w:val="0"/>
+                <w:i w:val="0"/>
+                <w:sz w:val="24"/>
+                <w:noProof/>
+              </w:rPr>
+              <w:t>TC-3.8</w:t>
             </w:r>
           </w:p>
         </w:tc>
@@ -4928,23 +4928,395 @@
         </w:tc>
         <w:tc>
           <w:tcPr>
-            <w:tcW w:w="5190" w:type="dxa"/>
-          </w:tcPr>
-          <w:p>
-            <w:pPr>
-              <w:spacing w:before="0" w:after="0" w:line="240" w:lineRule="auto"/>
-              <w:ind w:left="0" w:firstLine="0"/>
-              <w:suppressAutoHyphens/>
-            </w:pPr>
-            <w:r>
-              <w:rPr>
-                <w:rFonts w:ascii="Calibri" w:hAnsi="Calibri"/>
-                <w:b w:val="0"/>
-                <w:i w:val="0"/>
-                <w:sz w:val="24"/>
-                <w:noProof/>
-              </w:rPr>
-              <w:t>PATCH with stale version returns 409 ATTENDANCE_VERSION_CONFLICT; correct version returns 200 with version n+1</w:t>
+            <w:tcW w:w="5551" w:type="dxa"/>
+          </w:tcPr>
+          <w:p>
+            <w:pPr>
+              <w:spacing w:before="0" w:after="0" w:line="240" w:lineRule="auto"/>
+              <w:ind w:left="0" w:firstLine="0"/>
+              <w:suppressAutoHyphens/>
+            </w:pPr>
+            <w:r>
+              <w:rPr>
+                <w:rFonts w:ascii="Calibri" w:hAnsi="Calibri"/>
+                <w:b w:val="0"/>
+                <w:i w:val="0"/>
+                <w:sz w:val="24"/>
+                <w:noProof/>
+              </w:rPr>
+              <w:t>PATCH with status=voided but no void_reason returns 422 VOID_REASON_REQUIRED; DB status unchanged</w:t>
+            </w:r>
+          </w:p>
+        </w:tc>
+      </w:tr>
+      <w:tr>
+        <w:trPr>
+          <w:cantSplit w:val="true"/>
+        </w:trPr>
+        <w:tc>
+          <w:tcPr>
+            <w:tcW w:w="2572" w:type="dxa"/>
+          </w:tcPr>
+          <w:p>
+            <w:pPr>
+              <w:spacing w:before="0" w:after="0" w:line="240" w:lineRule="auto"/>
+              <w:ind w:left="0" w:firstLine="0"/>
+              <w:suppressAutoHyphens/>
+            </w:pPr>
+            <w:r>
+              <w:rPr>
+                <w:rFonts w:ascii="Calibri" w:hAnsi="Calibri"/>
+                <w:b w:val="0"/>
+                <w:i w:val="0"/>
+                <w:sz w:val="24"/>
+                <w:noProof/>
+              </w:rPr>
+              <w:t>test_tc_3_9_billing_units_total_hours_to_authorized_units_consumed</w:t>
+            </w:r>
+          </w:p>
+        </w:tc>
+        <w:tc>
+          <w:tcPr>
+            <w:tcW w:w="316" w:type="dxa"/>
+          </w:tcPr>
+          <w:p>
+            <w:pPr>
+              <w:spacing w:before="0" w:after="0" w:line="240" w:lineRule="auto"/>
+              <w:ind w:left="0" w:firstLine="0"/>
+              <w:suppressAutoHyphens/>
+            </w:pPr>
+            <w:r>
+              <w:rPr>
+                <w:rFonts w:ascii="Calibri" w:hAnsi="Calibri"/>
+                <w:b w:val="0"/>
+                <w:i w:val="0"/>
+                <w:sz w:val="24"/>
+                <w:noProof/>
+              </w:rPr>
+              <w:t>TC-3.9</w:t>
+            </w:r>
+          </w:p>
+        </w:tc>
+        <w:tc>
+          <w:tcPr>
+            <w:tcW w:w="632" w:type="dxa"/>
+          </w:tcPr>
+          <w:p>
+            <w:pPr>
+              <w:spacing w:before="0" w:after="0" w:line="240" w:lineRule="auto"/>
+              <w:ind w:left="0" w:firstLine="0"/>
+              <w:suppressAutoHyphens/>
+            </w:pPr>
+            <w:r>
+              <w:rPr>
+                <w:rFonts w:ascii="Calibri" w:hAnsi="Calibri"/>
+                <w:b w:val="0"/>
+                <w:i w:val="0"/>
+                <w:sz w:val="24"/>
+                <w:noProof/>
+              </w:rPr>
+              <w:t>Business Rules</w:t>
+            </w:r>
+          </w:p>
+        </w:tc>
+        <w:tc>
+          <w:tcPr>
+            <w:tcW w:w="5551" w:type="dxa"/>
+          </w:tcPr>
+          <w:p>
+            <w:pPr>
+              <w:spacing w:before="0" w:after="0" w:line="240" w:lineRule="auto"/>
+              <w:ind w:left="0" w:firstLine="0"/>
+              <w:suppressAutoHyphens/>
+            </w:pPr>
+            <w:r>
+              <w:rPr>
+                <w:rFonts w:ascii="Calibri" w:hAnsi="Calibri"/>
+                <w:b w:val="0"/>
+                <w:i w:val="0"/>
+                <w:sz w:val="24"/>
+                <w:noProof/>
+              </w:rPr>
+              <w:t>total_hours converted server-side at Medicaid rate (1 h = 4 units); 6 h → 24, 8 h → 32; verified in DB</w:t>
+            </w:r>
+          </w:p>
+        </w:tc>
+      </w:tr>
+      <w:tr>
+        <w:trPr>
+          <w:cantSplit w:val="true"/>
+        </w:trPr>
+        <w:tc>
+          <w:tcPr>
+            <w:tcW w:w="2572" w:type="dxa"/>
+          </w:tcPr>
+          <w:p>
+            <w:pPr>
+              <w:spacing w:before="0" w:after="0" w:line="240" w:lineRule="auto"/>
+              <w:ind w:left="0" w:firstLine="0"/>
+              <w:suppressAutoHyphens/>
+            </w:pPr>
+            <w:r>
+              <w:rPr>
+                <w:rFonts w:ascii="Calibri" w:hAnsi="Calibri"/>
+                <w:b w:val="0"/>
+                <w:i w:val="0"/>
+                <w:sz w:val="24"/>
+                <w:noProof/>
+              </w:rPr>
+              <w:t>test_tc_3_10_billed_attendance_cannot_be_modified</w:t>
+            </w:r>
+          </w:p>
+        </w:tc>
+        <w:tc>
+          <w:tcPr>
+            <w:tcW w:w="316" w:type="dxa"/>
+          </w:tcPr>
+          <w:p>
+            <w:pPr>
+              <w:spacing w:before="0" w:after="0" w:line="240" w:lineRule="auto"/>
+              <w:ind w:left="0" w:firstLine="0"/>
+              <w:suppressAutoHyphens/>
+            </w:pPr>
+            <w:r>
+              <w:rPr>
+                <w:rFonts w:ascii="Calibri" w:hAnsi="Calibri"/>
+                <w:b w:val="0"/>
+                <w:i w:val="0"/>
+                <w:sz w:val="24"/>
+                <w:noProof/>
+              </w:rPr>
+              <w:t>TC-3.10</w:t>
+            </w:r>
+          </w:p>
+        </w:tc>
+        <w:tc>
+          <w:tcPr>
+            <w:tcW w:w="632" w:type="dxa"/>
+          </w:tcPr>
+          <w:p>
+            <w:pPr>
+              <w:spacing w:before="0" w:after="0" w:line="240" w:lineRule="auto"/>
+              <w:ind w:left="0" w:firstLine="0"/>
+              <w:suppressAutoHyphens/>
+            </w:pPr>
+            <w:r>
+              <w:rPr>
+                <w:rFonts w:ascii="Calibri" w:hAnsi="Calibri"/>
+                <w:b w:val="0"/>
+                <w:i w:val="0"/>
+                <w:sz w:val="24"/>
+                <w:noProof/>
+              </w:rPr>
+              <w:t>Business Rules</w:t>
+            </w:r>
+          </w:p>
+        </w:tc>
+        <w:tc>
+          <w:tcPr>
+            <w:tcW w:w="5551" w:type="dxa"/>
+          </w:tcPr>
+          <w:p>
+            <w:pPr>
+              <w:spacing w:before="0" w:after="0" w:line="240" w:lineRule="auto"/>
+              <w:ind w:left="0" w:firstLine="0"/>
+              <w:suppressAutoHyphens/>
+            </w:pPr>
+            <w:r>
+              <w:rPr>
+                <w:rFonts w:ascii="Calibri" w:hAnsi="Calibri"/>
+                <w:b w:val="0"/>
+                <w:i w:val="0"/>
+                <w:sz w:val="24"/>
+                <w:noProof/>
+              </w:rPr>
+              <w:t>PATCH on billed attendance returns 422 ATTENDANCE_BILLED_IMMUTABLE; DB status remains billed</w:t>
+            </w:r>
+          </w:p>
+        </w:tc>
+      </w:tr>
+      <w:tr>
+        <w:trPr>
+          <w:cantSplit w:val="true"/>
+        </w:trPr>
+        <w:tc>
+          <w:tcPr>
+            <w:tcW w:w="2572" w:type="dxa"/>
+          </w:tcPr>
+          <w:p>
+            <w:pPr>
+              <w:spacing w:before="0" w:after="0" w:line="240" w:lineRule="auto"/>
+              <w:ind w:left="0" w:firstLine="0"/>
+              <w:suppressAutoHyphens/>
+            </w:pPr>
+            <w:r>
+              <w:rPr>
+                <w:rFonts w:ascii="Calibri" w:hAnsi="Calibri"/>
+                <w:b w:val="0"/>
+                <w:i w:val="0"/>
+                <w:sz w:val="24"/>
+                <w:noProof/>
+              </w:rPr>
+              <w:t>test_tc_3_11_audit_log_on_creation_has_mandatory_fields_no_phi</w:t>
+            </w:r>
+          </w:p>
+        </w:tc>
+        <w:tc>
+          <w:tcPr>
+            <w:tcW w:w="316" w:type="dxa"/>
+          </w:tcPr>
+          <w:p>
+            <w:pPr>
+              <w:spacing w:before="0" w:after="0" w:line="240" w:lineRule="auto"/>
+              <w:ind w:left="0" w:firstLine="0"/>
+              <w:suppressAutoHyphens/>
+            </w:pPr>
+            <w:r>
+              <w:rPr>
+                <w:rFonts w:ascii="Calibri" w:hAnsi="Calibri"/>
+                <w:b w:val="0"/>
+                <w:i w:val="0"/>
+                <w:sz w:val="24"/>
+                <w:noProof/>
+              </w:rPr>
+              <w:t>TC-3.11</w:t>
+            </w:r>
+          </w:p>
+        </w:tc>
+        <w:tc>
+          <w:tcPr>
+            <w:tcW w:w="632" w:type="dxa"/>
+          </w:tcPr>
+          <w:p>
+            <w:pPr>
+              <w:spacing w:before="0" w:after="0" w:line="240" w:lineRule="auto"/>
+              <w:ind w:left="0" w:firstLine="0"/>
+              <w:suppressAutoHyphens/>
+            </w:pPr>
+            <w:r>
+              <w:rPr>
+                <w:rFonts w:ascii="Calibri" w:hAnsi="Calibri"/>
+                <w:b w:val="0"/>
+                <w:i w:val="0"/>
+                <w:sz w:val="24"/>
+                <w:noProof/>
+              </w:rPr>
+              <w:t>Business Rules</w:t>
+            </w:r>
+          </w:p>
+        </w:tc>
+        <w:tc>
+          <w:tcPr>
+            <w:tcW w:w="5551" w:type="dxa"/>
+          </w:tcPr>
+          <w:p>
+            <w:pPr>
+              <w:spacing w:before="0" w:after="0" w:line="240" w:lineRule="auto"/>
+              <w:ind w:left="0" w:firstLine="0"/>
+              <w:suppressAutoHyphens/>
+            </w:pPr>
+            <w:r>
+              <w:rPr>
+                <w:rFonts w:ascii="Calibri" w:hAnsi="Calibri"/>
+                <w:b w:val="0"/>
+                <w:i w:val="0"/>
+                <w:sz w:val="24"/>
+                <w:noProof/>
+              </w:rPr>
+              <w:t>PHI_WRITE audit event after POST /attendance has all 11 mandatory fields non-null and no PHI values in data_affected</w:t>
+            </w:r>
+          </w:p>
+        </w:tc>
+      </w:tr>
+      <w:tr>
+        <w:trPr>
+          <w:cantSplit w:val="true"/>
+        </w:trPr>
+        <w:tc>
+          <w:tcPr>
+            <w:tcW w:w="2572" w:type="dxa"/>
+          </w:tcPr>
+          <w:p>
+            <w:pPr>
+              <w:spacing w:before="0" w:after="0" w:line="240" w:lineRule="auto"/>
+              <w:ind w:left="0" w:firstLine="0"/>
+              <w:suppressAutoHyphens/>
+            </w:pPr>
+            <w:r>
+              <w:rPr>
+                <w:rFonts w:ascii="Calibri" w:hAnsi="Calibri"/>
+                <w:b w:val="0"/>
+                <w:i w:val="0"/>
+                <w:sz w:val="24"/>
+                <w:noProof/>
+              </w:rPr>
+              <w:t>test_tc_3_12_billing_specialist_create_attendance_returns_403</w:t>
+            </w:r>
+          </w:p>
+        </w:tc>
+        <w:tc>
+          <w:tcPr>
+            <w:tcW w:w="316" w:type="dxa"/>
+          </w:tcPr>
+          <w:p>
+            <w:pPr>
+              <w:spacing w:before="0" w:after="0" w:line="240" w:lineRule="auto"/>
+              <w:ind w:left="0" w:firstLine="0"/>
+              <w:suppressAutoHyphens/>
+            </w:pPr>
+            <w:r>
+              <w:rPr>
+                <w:rFonts w:ascii="Calibri" w:hAnsi="Calibri"/>
+                <w:b w:val="0"/>
+                <w:i w:val="0"/>
+                <w:sz w:val="24"/>
+                <w:noProof/>
+              </w:rPr>
+              <w:t>TC-3.12</w:t>
+            </w:r>
+          </w:p>
+        </w:tc>
+        <w:tc>
+          <w:tcPr>
+            <w:tcW w:w="632" w:type="dxa"/>
+          </w:tcPr>
+          <w:p>
+            <w:pPr>
+              <w:spacing w:before="0" w:after="0" w:line="240" w:lineRule="auto"/>
+              <w:ind w:left="0" w:firstLine="0"/>
+              <w:suppressAutoHyphens/>
+            </w:pPr>
+            <w:r>
+              <w:rPr>
+                <w:rFonts w:ascii="Calibri" w:hAnsi="Calibri"/>
+                <w:b w:val="0"/>
+                <w:i w:val="0"/>
+                <w:sz w:val="24"/>
+                <w:noProof/>
+              </w:rPr>
+              <w:t>API</w:t>
+            </w:r>
+          </w:p>
+        </w:tc>
+        <w:tc>
+          <w:tcPr>
+            <w:tcW w:w="5551" w:type="dxa"/>
+          </w:tcPr>
+          <w:p>
+            <w:pPr>
+              <w:spacing w:before="0" w:after="0" w:line="240" w:lineRule="auto"/>
+              <w:ind w:left="0" w:firstLine="0"/>
+              <w:suppressAutoHyphens/>
+            </w:pPr>
+            <w:r>
+              <w:rPr>
+                <w:rFonts w:ascii="Calibri" w:hAnsi="Calibri"/>
+                <w:b w:val="0"/>
+                <w:i w:val="0"/>
+                <w:sz w:val="24"/>
+                <w:noProof/>
+              </w:rPr>
+              <w:t>POST /attendance by billing_specialist returns 403; attendance count for participant unchanged in DB</w:t>
             </w:r>
           </w:p>
         </w:tc>
@@ -11186,7 +11558,7 @@
                 <w:sz w:val="24"/>
                 <w:noProof/>
               </w:rPr>
-              <w:t>3.1 - 3.8</w:t>
+              <w:t>TC-3.1 - TC-3.12</w:t>
             </w:r>
           </w:p>
         </w:tc>
@@ -11208,7 +11580,7 @@
                 <w:sz w:val="24"/>
                 <w:noProof/>
               </w:rPr>
-              <w:t>8</w:t>
+              <w:t>12</w:t>
             </w:r>
           </w:p>
         </w:tc>
@@ -11558,7 +11930,7 @@
                 <w:sz w:val="24"/>
                 <w:noProof/>
               </w:rPr>
-              <w:t>60</w:t>
+              <w:t>64</w:t>
             </w:r>
           </w:p>
         </w:tc>
@@ -11580,7 +11952,7 @@
                 <w:sz w:val="24"/>
                 <w:noProof/>
               </w:rPr>
-              <w:t>60</w:t>
+              <w:t>64</w:t>
             </w:r>
           </w:p>
         </w:tc>
@@ -11760,7 +12132,7 @@
                 <w:sz w:val="24"/>
                 <w:noProof/>
               </w:rPr>
-              <w:t>45</w:t>
+              <w:t>48</w:t>
             </w:r>
           </w:p>
         </w:tc>
@@ -11831,7 +12203,7 @@
                 <w:sz w:val="24"/>
                 <w:noProof/>
               </w:rPr>
-              <w:t>39</w:t>
+              <w:t>40</w:t>
             </w:r>
           </w:p>
         </w:tc>
@@ -11973,7 +12345,7 @@
                 <w:sz w:val="24"/>
                 <w:noProof/>
               </w:rPr>
-              <w:t>93</w:t>
+              <w:t>97</w:t>
             </w:r>
           </w:p>
         </w:tc>

</xml_diff>

<commit_message>
feat: add test_claim.py TC-4.1 through TC-4.15, fix mock backend compliance, update README
</commit_message>
<xml_diff>
--- a/test_plan_phase1.docx
+++ b/test_plan_phase1.docx
@@ -588,6 +588,8 @@
                 <w:sz w:val="24"/>
                 <w:noProof/>
               </w:rPr>
+            </w:r>
+            <w:r>
               <w:t>test_claim.py</w:t>
             </w:r>
           </w:p>
@@ -610,7 +612,9 @@
                 <w:sz w:val="24"/>
                 <w:noProof/>
               </w:rPr>
-              <w:t>9</w:t>
+            </w:r>
+            <w:r>
+              <w:t>15</w:t>
             </w:r>
           </w:p>
         </w:tc>
@@ -632,7 +636,9 @@
                 <w:sz w:val="24"/>
                 <w:noProof/>
               </w:rPr>
-              <w:t>4.1 - 4.9</w:t>
+            </w:r>
+            <w:r>
+              <w:t>TC-4.1 - TC-4.15</w:t>
             </w:r>
           </w:p>
         </w:tc>
@@ -654,6 +660,8 @@
                 <w:sz w:val="24"/>
                 <w:noProof/>
               </w:rPr>
+            </w:r>
+            <w:r>
               <w:t>API, Business Rules</w:t>
             </w:r>
           </w:p>
@@ -676,7 +684,9 @@
                 <w:sz w:val="24"/>
                 <w:noProof/>
               </w:rPr>
-              <w:t>Unique constraints, RBAC, State machine, Optimistic locking</w:t>
+            </w:r>
+            <w:r>
+              <w:t>Unique constraints, RBAC, State machine, Attendance integrity, Mandatory fields, Audit log, Billing units server-calculated, Phase 2 field rejection, Optimistic locking, Tenant isolation, Not found</w:t>
             </w:r>
           </w:p>
         </w:tc>
@@ -1415,7 +1425,12 @@
                 <w:sz w:val="24"/>
                 <w:noProof/>
               </w:rPr>
-              <w:t>97</w:t>
+            </w:r>
+            <w:r>
+              <w:rPr>
+                <w:b/>
+              </w:rPr>
+              <w:t>103</w:t>
             </w:r>
           </w:p>
         </w:tc>
@@ -1437,7 +1452,12 @@
                 <w:sz w:val="24"/>
                 <w:noProof/>
               </w:rPr>
-              <w:t>64 entity TCs</w:t>
+            </w:r>
+            <w:r>
+              <w:rPr>
+                <w:b/>
+              </w:rPr>
+              <w:t>70 entity TCs</w:t>
             </w:r>
           </w:p>
         </w:tc>
@@ -5337,7 +5357,7 @@
           <w:sz w:val="26"/>
           <w:noProof/>
         </w:rPr>
-        <w:t>2.4 test_claim.py - Claim (9 tests)</w:t>
+        <w:t>2.4 test_claim.py - Claim (15 tests)</w:t>
       </w:r>
     </w:p>
     <w:tbl>
@@ -5404,7 +5424,12 @@
                 <w:sz w:val="24"/>
                 <w:noProof/>
               </w:rPr>
-              <w:t>REQ_ID</w:t>
+            </w:r>
+            <w:r>
+              <w:rPr>
+                <w:b/>
+              </w:rPr>
+              <w:t>TC</w:t>
             </w:r>
           </w:p>
         </w:tc>
@@ -5454,838 +5479,631 @@
         </w:tc>
       </w:tr>
       <w:tr>
-        <w:trPr>
-          <w:cantSplit w:val="true"/>
-        </w:trPr>
-        <w:tc>
-          <w:tcPr>
-            <w:tcW w:w="2856" w:type="dxa"/>
-          </w:tcPr>
-          <w:p>
-            <w:pPr>
-              <w:spacing w:before="0" w:after="0" w:line="240" w:lineRule="auto"/>
-              <w:ind w:left="0" w:firstLine="0"/>
-              <w:suppressAutoHyphens/>
-            </w:pPr>
-            <w:r>
-              <w:rPr>
-                <w:rFonts w:ascii="Calibri" w:hAnsi="Calibri"/>
-                <w:b w:val="0"/>
-                <w:i w:val="0"/>
-                <w:sz w:val="24"/>
-                <w:noProof/>
-              </w:rPr>
-              <w:t>test_4_1_unique_claim_reference_number_globally</w:t>
-            </w:r>
-          </w:p>
-        </w:tc>
-        <w:tc>
-          <w:tcPr>
-            <w:tcW w:w="252" w:type="dxa"/>
-          </w:tcPr>
-          <w:p>
-            <w:pPr>
-              <w:spacing w:before="0" w:after="0" w:line="240" w:lineRule="auto"/>
-              <w:ind w:left="0" w:firstLine="0"/>
-              <w:suppressAutoHyphens/>
-            </w:pPr>
-            <w:r>
-              <w:rPr>
-                <w:rFonts w:ascii="Calibri" w:hAnsi="Calibri"/>
-                <w:b w:val="0"/>
-                <w:i w:val="0"/>
-                <w:sz w:val="24"/>
-                <w:noProof/>
-              </w:rPr>
-              <w:t>4.1</w:t>
-            </w:r>
-          </w:p>
-        </w:tc>
-        <w:tc>
-          <w:tcPr>
-            <w:tcW w:w="588" w:type="dxa"/>
-          </w:tcPr>
-          <w:p>
-            <w:pPr>
-              <w:spacing w:before="0" w:after="0" w:line="240" w:lineRule="auto"/>
-              <w:ind w:left="0" w:firstLine="0"/>
-              <w:suppressAutoHyphens/>
-            </w:pPr>
-            <w:r>
-              <w:rPr>
-                <w:rFonts w:ascii="Calibri" w:hAnsi="Calibri"/>
-                <w:b w:val="0"/>
-                <w:i w:val="0"/>
-                <w:sz w:val="24"/>
-                <w:noProof/>
-              </w:rPr>
+        <w:tc>
+          <w:tcPr>
+            <w:tcW w:type="dxa" w:w="2856"/>
+          </w:tcPr>
+          <w:p>
+            <w:r>
+              <w:t>test_tc_4_1_duplicate_claim_reference_number_returns_409</w:t>
+            </w:r>
+          </w:p>
+        </w:tc>
+        <w:tc>
+          <w:tcPr>
+            <w:tcW w:type="dxa" w:w="252"/>
+          </w:tcPr>
+          <w:p>
+            <w:r>
+              <w:t>TC-4.1</w:t>
+            </w:r>
+          </w:p>
+        </w:tc>
+        <w:tc>
+          <w:tcPr>
+            <w:tcW w:type="dxa" w:w="588"/>
+          </w:tcPr>
+          <w:p>
+            <w:r>
               <w:t>API</w:t>
             </w:r>
           </w:p>
         </w:tc>
         <w:tc>
           <w:tcPr>
-            <w:tcW w:w="5375" w:type="dxa"/>
-          </w:tcPr>
-          <w:p>
-            <w:pPr>
-              <w:spacing w:before="0" w:after="0" w:line="240" w:lineRule="auto"/>
-              <w:ind w:left="0" w:firstLine="0"/>
-              <w:suppressAutoHyphens/>
-            </w:pPr>
-            <w:r>
-              <w:rPr>
-                <w:rFonts w:ascii="Calibri" w:hAnsi="Calibri"/>
-                <w:b w:val="0"/>
-                <w:i w:val="0"/>
-                <w:sz w:val="24"/>
-                <w:noProof/>
-              </w:rPr>
-              <w:t>POST with manually supplied duplicate claim_reference_number returns 409 CLAIM_DUPLICATE_REFERENCE</w:t>
+            <w:tcW w:type="dxa" w:w="5375"/>
+          </w:tcPr>
+          <w:p>
+            <w:r>
+              <w:t>POST with duplicate claim_reference_number returns 409 CLAIM_DUPLICATE_REFERENCE; DB confirms exactly one claim with that reference</w:t>
             </w:r>
           </w:p>
         </w:tc>
       </w:tr>
       <w:tr>
-        <w:trPr>
-          <w:cantSplit w:val="true"/>
-        </w:trPr>
-        <w:tc>
-          <w:tcPr>
-            <w:tcW w:w="2856" w:type="dxa"/>
-          </w:tcPr>
-          <w:p>
-            <w:pPr>
-              <w:spacing w:before="0" w:after="0" w:line="240" w:lineRule="auto"/>
-              <w:ind w:left="0" w:firstLine="0"/>
-              <w:suppressAutoHyphens/>
-            </w:pPr>
-            <w:r>
-              <w:rPr>
-                <w:rFonts w:ascii="Calibri" w:hAnsi="Calibri"/>
-                <w:b w:val="0"/>
-                <w:i w:val="0"/>
-                <w:sz w:val="24"/>
-                <w:noProof/>
-              </w:rPr>
-              <w:t>test_4_2_composite_unique_key_prevents_duplicate_billing</w:t>
-            </w:r>
-          </w:p>
-        </w:tc>
-        <w:tc>
-          <w:tcPr>
-            <w:tcW w:w="252" w:type="dxa"/>
-          </w:tcPr>
-          <w:p>
-            <w:pPr>
-              <w:spacing w:before="0" w:after="0" w:line="240" w:lineRule="auto"/>
-              <w:ind w:left="0" w:firstLine="0"/>
-              <w:suppressAutoHyphens/>
-            </w:pPr>
-            <w:r>
-              <w:rPr>
-                <w:rFonts w:ascii="Calibri" w:hAnsi="Calibri"/>
-                <w:b w:val="0"/>
-                <w:i w:val="0"/>
-                <w:sz w:val="24"/>
-                <w:noProof/>
-              </w:rPr>
-              <w:t>4.2</w:t>
-            </w:r>
-          </w:p>
-        </w:tc>
-        <w:tc>
-          <w:tcPr>
-            <w:tcW w:w="588" w:type="dxa"/>
-          </w:tcPr>
-          <w:p>
-            <w:pPr>
-              <w:spacing w:before="0" w:after="0" w:line="240" w:lineRule="auto"/>
-              <w:ind w:left="0" w:firstLine="0"/>
-              <w:suppressAutoHyphens/>
-            </w:pPr>
-            <w:r>
-              <w:rPr>
-                <w:rFonts w:ascii="Calibri" w:hAnsi="Calibri"/>
-                <w:b w:val="0"/>
-                <w:i w:val="0"/>
-                <w:sz w:val="24"/>
-                <w:noProof/>
-              </w:rPr>
+        <w:tc>
+          <w:tcPr>
+            <w:tcW w:type="dxa" w:w="2856"/>
+          </w:tcPr>
+          <w:p>
+            <w:r>
+              <w:t>test_tc_4_2_composite_unique_key_prevents_duplicate_billing</w:t>
+            </w:r>
+          </w:p>
+        </w:tc>
+        <w:tc>
+          <w:tcPr>
+            <w:tcW w:type="dxa" w:w="252"/>
+          </w:tcPr>
+          <w:p>
+            <w:r>
+              <w:t>TC-4.2</w:t>
+            </w:r>
+          </w:p>
+        </w:tc>
+        <w:tc>
+          <w:tcPr>
+            <w:tcW w:type="dxa" w:w="588"/>
+          </w:tcPr>
+          <w:p>
+            <w:r>
               <w:t>API</w:t>
             </w:r>
           </w:p>
         </w:tc>
         <w:tc>
           <w:tcPr>
-            <w:tcW w:w="5375" w:type="dxa"/>
-          </w:tcPr>
-          <w:p>
-            <w:pPr>
-              <w:spacing w:before="0" w:after="0" w:line="240" w:lineRule="auto"/>
-              <w:ind w:left="0" w:firstLine="0"/>
-              <w:suppressAutoHyphens/>
-            </w:pPr>
-            <w:r>
-              <w:rPr>
-                <w:rFonts w:ascii="Calibri" w:hAnsi="Calibri"/>
-                <w:b w:val="0"/>
-                <w:i w:val="0"/>
-                <w:sz w:val="24"/>
-                <w:noProof/>
-              </w:rPr>
-              <w:t>POST with duplicate participant_id+date_of_service_start+procedure_code+payer_type returns 409 CLAIM_DUPLICATE</w:t>
+            <w:tcW w:type="dxa" w:w="5375"/>
+          </w:tcPr>
+          <w:p>
+            <w:r>
+              <w:t>POST with duplicate participant_id+date_of_service_start+procedure_code+payer_type returns 409 CLAIM_DUPLICATE; DB confirms one claim</w:t>
             </w:r>
           </w:p>
         </w:tc>
       </w:tr>
       <w:tr>
-        <w:trPr>
-          <w:cantSplit w:val="true"/>
-        </w:trPr>
-        <w:tc>
-          <w:tcPr>
-            <w:tcW w:w="2856" w:type="dxa"/>
-          </w:tcPr>
-          <w:p>
-            <w:pPr>
-              <w:spacing w:before="0" w:after="0" w:line="240" w:lineRule="auto"/>
-              <w:ind w:left="0" w:firstLine="0"/>
-              <w:suppressAutoHyphens/>
-            </w:pPr>
-            <w:r>
-              <w:rPr>
-                <w:rFonts w:ascii="Calibri" w:hAnsi="Calibri"/>
-                <w:b w:val="0"/>
-                <w:i w:val="0"/>
-                <w:sz w:val="24"/>
-                <w:noProof/>
-              </w:rPr>
-              <w:t>test_4_3_rbac_write_restricted_to_billing_specialist_and_program_administrator</w:t>
-            </w:r>
-          </w:p>
-        </w:tc>
-        <w:tc>
-          <w:tcPr>
-            <w:tcW w:w="252" w:type="dxa"/>
-          </w:tcPr>
-          <w:p>
-            <w:pPr>
-              <w:spacing w:before="0" w:after="0" w:line="240" w:lineRule="auto"/>
-              <w:ind w:left="0" w:firstLine="0"/>
-              <w:suppressAutoHyphens/>
-            </w:pPr>
-            <w:r>
-              <w:rPr>
-                <w:rFonts w:ascii="Calibri" w:hAnsi="Calibri"/>
-                <w:b w:val="0"/>
-                <w:i w:val="0"/>
-                <w:sz w:val="24"/>
-                <w:noProof/>
-              </w:rPr>
-              <w:t>4.3</w:t>
-            </w:r>
-          </w:p>
-        </w:tc>
-        <w:tc>
-          <w:tcPr>
-            <w:tcW w:w="588" w:type="dxa"/>
-          </w:tcPr>
-          <w:p>
-            <w:pPr>
-              <w:spacing w:before="0" w:after="0" w:line="240" w:lineRule="auto"/>
-              <w:ind w:left="0" w:firstLine="0"/>
-              <w:suppressAutoHyphens/>
-            </w:pPr>
-            <w:r>
-              <w:rPr>
-                <w:rFonts w:ascii="Calibri" w:hAnsi="Calibri"/>
-                <w:b w:val="0"/>
-                <w:i w:val="0"/>
-                <w:sz w:val="24"/>
-                <w:noProof/>
-              </w:rPr>
+        <w:tc>
+          <w:tcPr>
+            <w:tcW w:type="dxa" w:w="2856"/>
+          </w:tcPr>
+          <w:p>
+            <w:r>
+              <w:t>test_tc_4_3_rbac_unauthorized_roles_return_403_db_count_unchanged</w:t>
+            </w:r>
+          </w:p>
+        </w:tc>
+        <w:tc>
+          <w:tcPr>
+            <w:tcW w:type="dxa" w:w="252"/>
+          </w:tcPr>
+          <w:p>
+            <w:r>
+              <w:t>TC-4.3</w:t>
+            </w:r>
+          </w:p>
+        </w:tc>
+        <w:tc>
+          <w:tcPr>
+            <w:tcW w:type="dxa" w:w="588"/>
+          </w:tcPr>
+          <w:p>
+            <w:r>
               <w:t>API</w:t>
             </w:r>
           </w:p>
         </w:tc>
         <w:tc>
           <w:tcPr>
-            <w:tcW w:w="5375" w:type="dxa"/>
-          </w:tcPr>
-          <w:p>
-            <w:pPr>
-              <w:spacing w:before="0" w:after="0" w:line="240" w:lineRule="auto"/>
-              <w:ind w:left="0" w:firstLine="0"/>
-              <w:suppressAutoHyphens/>
-            </w:pPr>
-            <w:r>
-              <w:rPr>
-                <w:rFonts w:ascii="Calibri" w:hAnsi="Calibri"/>
-                <w:b w:val="0"/>
-                <w:i w:val="0"/>
-                <w:sz w:val="24"/>
-                <w:noProof/>
-              </w:rPr>
-              <w:t>POST or PATCH from care_coordinator, nurse_medication_aide, physician, or participant_family returns 403</w:t>
+            <w:tcW w:type="dxa" w:w="5375"/>
+          </w:tcPr>
+          <w:p>
+            <w:r>
+              <w:t>POST from care_coordinator, nurse_medication_aide, physician, participant_family each returns 403 RBAC_DENIED; DB claim count unchanged</w:t>
             </w:r>
           </w:p>
         </w:tc>
       </w:tr>
       <w:tr>
-        <w:trPr>
-          <w:cantSplit w:val="true"/>
-        </w:trPr>
-        <w:tc>
-          <w:tcPr>
-            <w:tcW w:w="2856" w:type="dxa"/>
-          </w:tcPr>
-          <w:p>
-            <w:pPr>
-              <w:spacing w:before="0" w:after="0" w:line="240" w:lineRule="auto"/>
-              <w:ind w:left="0" w:firstLine="0"/>
-              <w:suppressAutoHyphens/>
-            </w:pPr>
-            <w:r>
-              <w:rPr>
-                <w:rFonts w:ascii="Calibri" w:hAnsi="Calibri"/>
-                <w:b w:val="0"/>
-                <w:i w:val="0"/>
-                <w:sz w:val="24"/>
-                <w:noProof/>
-              </w:rPr>
-              <w:t>test_4_4_claim_status_state_machine_transitions</w:t>
-            </w:r>
-          </w:p>
-        </w:tc>
-        <w:tc>
-          <w:tcPr>
-            <w:tcW w:w="252" w:type="dxa"/>
-          </w:tcPr>
-          <w:p>
-            <w:pPr>
-              <w:spacing w:before="0" w:after="0" w:line="240" w:lineRule="auto"/>
-              <w:ind w:left="0" w:firstLine="0"/>
-              <w:suppressAutoHyphens/>
-            </w:pPr>
-            <w:r>
-              <w:rPr>
-                <w:rFonts w:ascii="Calibri" w:hAnsi="Calibri"/>
-                <w:b w:val="0"/>
-                <w:i w:val="0"/>
-                <w:sz w:val="24"/>
-                <w:noProof/>
-              </w:rPr>
-              <w:t>4.4</w:t>
-            </w:r>
-          </w:p>
-        </w:tc>
-        <w:tc>
-          <w:tcPr>
-            <w:tcW w:w="588" w:type="dxa"/>
-          </w:tcPr>
-          <w:p>
-            <w:pPr>
-              <w:spacing w:before="0" w:after="0" w:line="240" w:lineRule="auto"/>
-              <w:ind w:left="0" w:firstLine="0"/>
-              <w:suppressAutoHyphens/>
-            </w:pPr>
-            <w:r>
-              <w:rPr>
-                <w:rFonts w:ascii="Calibri" w:hAnsi="Calibri"/>
-                <w:b w:val="0"/>
-                <w:i w:val="0"/>
-                <w:sz w:val="24"/>
-                <w:noProof/>
-              </w:rPr>
+        <w:tc>
+          <w:tcPr>
+            <w:tcW w:type="dxa" w:w="2856"/>
+          </w:tcPr>
+          <w:p>
+            <w:r>
+              <w:t>test_tc_4_4_claim_status_immutability_and_transitions</w:t>
+            </w:r>
+          </w:p>
+        </w:tc>
+        <w:tc>
+          <w:tcPr>
+            <w:tcW w:type="dxa" w:w="252"/>
+          </w:tcPr>
+          <w:p>
+            <w:r>
+              <w:t>TC-4.4</w:t>
+            </w:r>
+          </w:p>
+        </w:tc>
+        <w:tc>
+          <w:tcPr>
+            <w:tcW w:type="dxa" w:w="588"/>
+          </w:tcPr>
+          <w:p>
+            <w:r>
               <w:t>Business Rules</w:t>
             </w:r>
           </w:p>
         </w:tc>
         <w:tc>
           <w:tcPr>
-            <w:tcW w:w="5375" w:type="dxa"/>
-          </w:tcPr>
-          <w:p>
-            <w:pPr>
-              <w:spacing w:before="0" w:after="0" w:line="240" w:lineRule="auto"/>
-              <w:ind w:left="0" w:firstLine="0"/>
-              <w:suppressAutoHyphens/>
-            </w:pPr>
-            <w:r>
-              <w:rPr>
-                <w:rFonts w:ascii="Calibri" w:hAnsi="Calibri"/>
-                <w:b w:val="0"/>
-                <w:i w:val="0"/>
-                <w:sz w:val="24"/>
-                <w:noProof/>
-              </w:rPr>
-              <w:t>PATCH any field on submitted or paid Claim returns 422; valid draft-to-submitted transition returns 200</w:t>
+            <w:tcW w:type="dxa" w:w="5375"/>
+          </w:tcPr>
+          <w:p>
+            <w:r>
+              <w:t>PATCH non-status field on submitted returns 422 CLAIM_STATUS_IMMUTABLE; PATCH status returns 200; PATCH paid returns 422; DB status unchanged after rejected edits</w:t>
             </w:r>
           </w:p>
         </w:tc>
       </w:tr>
       <w:tr>
-        <w:trPr>
-          <w:cantSplit w:val="true"/>
-        </w:trPr>
-        <w:tc>
-          <w:tcPr>
-            <w:tcW w:w="2856" w:type="dxa"/>
-          </w:tcPr>
-          <w:p>
-            <w:pPr>
-              <w:spacing w:before="0" w:after="0" w:line="240" w:lineRule="auto"/>
-              <w:ind w:left="0" w:firstLine="0"/>
-              <w:suppressAutoHyphens/>
-            </w:pPr>
-            <w:r>
-              <w:rPr>
-                <w:rFonts w:ascii="Calibri" w:hAnsi="Calibri"/>
-                <w:b w:val="0"/>
-                <w:i w:val="0"/>
-                <w:sz w:val="24"/>
-                <w:noProof/>
-              </w:rPr>
-              <w:t>test_4_5_claim_requires_confirmed_attendance_records</w:t>
-            </w:r>
-          </w:p>
-        </w:tc>
-        <w:tc>
-          <w:tcPr>
-            <w:tcW w:w="252" w:type="dxa"/>
-          </w:tcPr>
-          <w:p>
-            <w:pPr>
-              <w:spacing w:before="0" w:after="0" w:line="240" w:lineRule="auto"/>
-              <w:ind w:left="0" w:firstLine="0"/>
-              <w:suppressAutoHyphens/>
-            </w:pPr>
-            <w:r>
-              <w:rPr>
-                <w:rFonts w:ascii="Calibri" w:hAnsi="Calibri"/>
-                <w:b w:val="0"/>
-                <w:i w:val="0"/>
-                <w:sz w:val="24"/>
-                <w:noProof/>
-              </w:rPr>
-              <w:t>4.5</w:t>
-            </w:r>
-          </w:p>
-        </w:tc>
-        <w:tc>
-          <w:tcPr>
-            <w:tcW w:w="588" w:type="dxa"/>
-          </w:tcPr>
-          <w:p>
-            <w:pPr>
-              <w:spacing w:before="0" w:after="0" w:line="240" w:lineRule="auto"/>
-              <w:ind w:left="0" w:firstLine="0"/>
-              <w:suppressAutoHyphens/>
-            </w:pPr>
-            <w:r>
-              <w:rPr>
-                <w:rFonts w:ascii="Calibri" w:hAnsi="Calibri"/>
-                <w:b w:val="0"/>
-                <w:i w:val="0"/>
-                <w:sz w:val="24"/>
-                <w:noProof/>
-              </w:rPr>
+        <w:tc>
+          <w:tcPr>
+            <w:tcW w:type="dxa" w:w="2856"/>
+          </w:tcPr>
+          <w:p>
+            <w:r>
+              <w:t>test_tc_4_5_claim_requires_confirmed_attendance_records</w:t>
+            </w:r>
+          </w:p>
+        </w:tc>
+        <w:tc>
+          <w:tcPr>
+            <w:tcW w:type="dxa" w:w="252"/>
+          </w:tcPr>
+          <w:p>
+            <w:r>
+              <w:t>TC-4.5</w:t>
+            </w:r>
+          </w:p>
+        </w:tc>
+        <w:tc>
+          <w:tcPr>
+            <w:tcW w:type="dxa" w:w="588"/>
+          </w:tcPr>
+          <w:p>
+            <w:r>
               <w:t>Business Rules</w:t>
             </w:r>
           </w:p>
         </w:tc>
         <w:tc>
           <w:tcPr>
-            <w:tcW w:w="5375" w:type="dxa"/>
-          </w:tcPr>
-          <w:p>
-            <w:pPr>
-              <w:spacing w:before="0" w:after="0" w:line="240" w:lineRule="auto"/>
-              <w:ind w:left="0" w:firstLine="0"/>
-              <w:suppressAutoHyphens/>
-            </w:pPr>
-            <w:r>
-              <w:rPr>
-                <w:rFonts w:ascii="Calibri" w:hAnsi="Calibri"/>
-                <w:b w:val="0"/>
-                <w:i w:val="0"/>
-                <w:sz w:val="24"/>
-                <w:noProof/>
-              </w:rPr>
-              <w:t>POST referencing pending or voided attendance returns 422; confirmed attendance returns 201 and sets attendance to billed</w:t>
+            <w:tcW w:type="dxa" w:w="5375"/>
+          </w:tcPr>
+          <w:p>
+            <w:r>
+              <w:t>POST referencing pending or voided attendance returns 422; cross-tenant returns 422/404; confirmed attendance returns 201 and sets attendance status to billed</w:t>
             </w:r>
           </w:p>
         </w:tc>
       </w:tr>
       <w:tr>
-        <w:trPr>
-          <w:cantSplit w:val="true"/>
-        </w:trPr>
-        <w:tc>
-          <w:tcPr>
-            <w:tcW w:w="2856" w:type="dxa"/>
-          </w:tcPr>
-          <w:p>
-            <w:pPr>
-              <w:spacing w:before="0" w:after="0" w:line="240" w:lineRule="auto"/>
-              <w:ind w:left="0" w:firstLine="0"/>
-              <w:suppressAutoHyphens/>
-            </w:pPr>
-            <w:r>
-              <w:rPr>
-                <w:rFonts w:ascii="Calibri" w:hAnsi="Calibri"/>
-                <w:b w:val="0"/>
-                <w:i w:val="0"/>
-                <w:sz w:val="24"/>
-                <w:noProof/>
-              </w:rPr>
-              <w:t>test_4_6_audit_log_on_claim_creation_and_submission</w:t>
-            </w:r>
-          </w:p>
-        </w:tc>
-        <w:tc>
-          <w:tcPr>
-            <w:tcW w:w="252" w:type="dxa"/>
-          </w:tcPr>
-          <w:p>
-            <w:pPr>
-              <w:spacing w:before="0" w:after="0" w:line="240" w:lineRule="auto"/>
-              <w:ind w:left="0" w:firstLine="0"/>
-              <w:suppressAutoHyphens/>
-            </w:pPr>
-            <w:r>
-              <w:rPr>
-                <w:rFonts w:ascii="Calibri" w:hAnsi="Calibri"/>
-                <w:b w:val="0"/>
-                <w:i w:val="0"/>
-                <w:sz w:val="24"/>
-                <w:noProof/>
-              </w:rPr>
-              <w:t>4.6</w:t>
-            </w:r>
-          </w:p>
-        </w:tc>
-        <w:tc>
-          <w:tcPr>
-            <w:tcW w:w="588" w:type="dxa"/>
-          </w:tcPr>
-          <w:p>
-            <w:pPr>
-              <w:spacing w:before="0" w:after="0" w:line="240" w:lineRule="auto"/>
-              <w:ind w:left="0" w:firstLine="0"/>
-              <w:suppressAutoHyphens/>
-            </w:pPr>
-            <w:r>
-              <w:rPr>
-                <w:rFonts w:ascii="Calibri" w:hAnsi="Calibri"/>
-                <w:b w:val="0"/>
-                <w:i w:val="0"/>
-                <w:sz w:val="24"/>
-                <w:noProof/>
-              </w:rPr>
+        <w:tc>
+          <w:tcPr>
+            <w:tcW w:type="dxa" w:w="2856"/>
+          </w:tcPr>
+          <w:p>
+            <w:r>
+              <w:t>test_tc_4_6_multi_attendance_units_billed_server_calculated</w:t>
+            </w:r>
+          </w:p>
+        </w:tc>
+        <w:tc>
+          <w:tcPr>
+            <w:tcW w:type="dxa" w:w="252"/>
+          </w:tcPr>
+          <w:p>
+            <w:r>
+              <w:t>TC-4.6</w:t>
+            </w:r>
+          </w:p>
+        </w:tc>
+        <w:tc>
+          <w:tcPr>
+            <w:tcW w:type="dxa" w:w="588"/>
+          </w:tcPr>
+          <w:p>
+            <w:r>
               <w:t>Business Rules</w:t>
             </w:r>
           </w:p>
         </w:tc>
         <w:tc>
           <w:tcPr>
-            <w:tcW w:w="5375" w:type="dxa"/>
-          </w:tcPr>
-          <w:p>
-            <w:pPr>
-              <w:spacing w:before="0" w:after="0" w:line="240" w:lineRule="auto"/>
-              <w:ind w:left="0" w:firstLine="0"/>
-              <w:suppressAutoHyphens/>
-            </w:pPr>
-            <w:r>
-              <w:rPr>
-                <w:rFonts w:ascii="Calibri" w:hAnsi="Calibri"/>
-                <w:b w:val="0"/>
-                <w:i w:val="0"/>
-                <w:sz w:val="24"/>
-                <w:noProof/>
-              </w:rPr>
-              <w:t>Claim write produces audit event with all mandatory fields; clearinghouse submission produces PHI_DISCLOSE event</w:t>
+            <w:tcW w:type="dxa" w:w="5375"/>
+          </w:tcPr>
+          <w:p>
+            <w:r>
+              <w:t>POST with multiple confirmed attendance returns 201; DB units_billed equals server-calculated sum of authorized_units_consumed; non-existent UUID returns 422 CLAIM_ATTENDANCE_NOT_FOUND</w:t>
             </w:r>
           </w:p>
         </w:tc>
       </w:tr>
       <w:tr>
-        <w:trPr>
-          <w:cantSplit w:val="true"/>
-        </w:trPr>
-        <w:tc>
-          <w:tcPr>
-            <w:tcW w:w="2856" w:type="dxa"/>
-          </w:tcPr>
-          <w:p>
-            <w:pPr>
-              <w:spacing w:before="0" w:after="0" w:line="240" w:lineRule="auto"/>
-              <w:ind w:left="0" w:firstLine="0"/>
-              <w:suppressAutoHyphens/>
-            </w:pPr>
-            <w:r>
-              <w:rPr>
-                <w:rFonts w:ascii="Calibri" w:hAnsi="Calibri"/>
-                <w:b w:val="0"/>
-                <w:i w:val="0"/>
-                <w:sz w:val="24"/>
-                <w:noProof/>
-              </w:rPr>
-              <w:t>test_4_7_claim_generated_from_attendance_units_not_blank</w:t>
-            </w:r>
-          </w:p>
-        </w:tc>
-        <w:tc>
-          <w:tcPr>
-            <w:tcW w:w="252" w:type="dxa"/>
-          </w:tcPr>
-          <w:p>
-            <w:pPr>
-              <w:spacing w:before="0" w:after="0" w:line="240" w:lineRule="auto"/>
-              <w:ind w:left="0" w:firstLine="0"/>
-              <w:suppressAutoHyphens/>
-            </w:pPr>
-            <w:r>
-              <w:rPr>
-                <w:rFonts w:ascii="Calibri" w:hAnsi="Calibri"/>
-                <w:b w:val="0"/>
-                <w:i w:val="0"/>
-                <w:sz w:val="24"/>
-                <w:noProof/>
-              </w:rPr>
-              <w:t>4.7</w:t>
-            </w:r>
-          </w:p>
-        </w:tc>
-        <w:tc>
-          <w:tcPr>
-            <w:tcW w:w="588" w:type="dxa"/>
-          </w:tcPr>
-          <w:p>
-            <w:pPr>
-              <w:spacing w:before="0" w:after="0" w:line="240" w:lineRule="auto"/>
-              <w:ind w:left="0" w:firstLine="0"/>
-              <w:suppressAutoHyphens/>
-            </w:pPr>
-            <w:r>
-              <w:rPr>
-                <w:rFonts w:ascii="Calibri" w:hAnsi="Calibri"/>
-                <w:b w:val="0"/>
-                <w:i w:val="0"/>
-                <w:sz w:val="24"/>
-                <w:noProof/>
-              </w:rPr>
+        <w:tc>
+          <w:tcPr>
+            <w:tcW w:type="dxa" w:w="2856"/>
+          </w:tcPr>
+          <w:p>
+            <w:r>
+              <w:t>test_tc_4_7_missing_required_fields_return_400_with_field_name</w:t>
+            </w:r>
+          </w:p>
+        </w:tc>
+        <w:tc>
+          <w:tcPr>
+            <w:tcW w:type="dxa" w:w="252"/>
+          </w:tcPr>
+          <w:p>
+            <w:r>
+              <w:t>TC-4.7</w:t>
+            </w:r>
+          </w:p>
+        </w:tc>
+        <w:tc>
+          <w:tcPr>
+            <w:tcW w:type="dxa" w:w="588"/>
+          </w:tcPr>
+          <w:p>
+            <w:r>
               <w:t>API</w:t>
             </w:r>
           </w:p>
         </w:tc>
         <w:tc>
           <w:tcPr>
-            <w:tcW w:w="5375" w:type="dxa"/>
-          </w:tcPr>
-          <w:p>
-            <w:pPr>
-              <w:spacing w:before="0" w:after="0" w:line="240" w:lineRule="auto"/>
-              <w:ind w:left="0" w:firstLine="0"/>
-              <w:suppressAutoHyphens/>
-            </w:pPr>
-            <w:r>
-              <w:rPr>
-                <w:rFonts w:ascii="Calibri" w:hAnsi="Calibri"/>
-                <w:b w:val="0"/>
-                <w:i w:val="0"/>
-                <w:sz w:val="24"/>
-                <w:noProof/>
-              </w:rPr>
-              <w:t>POST with empty attendance_ids returns 422 CLAIM_NO_ATTENDANCE_RECORDS; caller-supplied units_billed is overridden by calculated sum</w:t>
+            <w:tcW w:type="dxa" w:w="5375"/>
+          </w:tcPr>
+          <w:p>
+            <w:r>
+              <w:t>POST without participant_id returns 400 identifying field; POST without procedure_code returns 400; POST without payer_type returns 400; no claim created in DB</w:t>
             </w:r>
           </w:p>
         </w:tc>
       </w:tr>
       <w:tr>
-        <w:trPr>
-          <w:cantSplit w:val="true"/>
-        </w:trPr>
-        <w:tc>
-          <w:tcPr>
-            <w:tcW w:w="2856" w:type="dxa"/>
-          </w:tcPr>
-          <w:p>
-            <w:pPr>
-              <w:spacing w:before="0" w:after="0" w:line="240" w:lineRule="auto"/>
-              <w:ind w:left="0" w:firstLine="0"/>
-              <w:suppressAutoHyphens/>
-            </w:pPr>
-            <w:r>
-              <w:rPr>
-                <w:rFonts w:ascii="Calibri" w:hAnsi="Calibri"/>
-                <w:b w:val="0"/>
-                <w:i w:val="0"/>
-                <w:sz w:val="24"/>
-                <w:noProof/>
-              </w:rPr>
-              <w:t>test_4_8_phase2_deferred_fields_rejected_with_400</w:t>
-            </w:r>
-          </w:p>
-        </w:tc>
-        <w:tc>
-          <w:tcPr>
-            <w:tcW w:w="252" w:type="dxa"/>
-          </w:tcPr>
-          <w:p>
-            <w:pPr>
-              <w:spacing w:before="0" w:after="0" w:line="240" w:lineRule="auto"/>
-              <w:ind w:left="0" w:firstLine="0"/>
-              <w:suppressAutoHyphens/>
-            </w:pPr>
-            <w:r>
-              <w:rPr>
-                <w:rFonts w:ascii="Calibri" w:hAnsi="Calibri"/>
-                <w:b w:val="0"/>
-                <w:i w:val="0"/>
-                <w:sz w:val="24"/>
-                <w:noProof/>
-              </w:rPr>
-              <w:t>4.8</w:t>
-            </w:r>
-          </w:p>
-        </w:tc>
-        <w:tc>
-          <w:tcPr>
-            <w:tcW w:w="588" w:type="dxa"/>
-          </w:tcPr>
-          <w:p>
-            <w:pPr>
-              <w:spacing w:before="0" w:after="0" w:line="240" w:lineRule="auto"/>
-              <w:ind w:left="0" w:firstLine="0"/>
-              <w:suppressAutoHyphens/>
-            </w:pPr>
-            <w:r>
-              <w:rPr>
-                <w:rFonts w:ascii="Calibri" w:hAnsi="Calibri"/>
-                <w:b w:val="0"/>
-                <w:i w:val="0"/>
-                <w:sz w:val="24"/>
-                <w:noProof/>
-              </w:rPr>
-              <w:t>API</w:t>
-            </w:r>
-          </w:p>
-        </w:tc>
-        <w:tc>
-          <w:tcPr>
-            <w:tcW w:w="5375" w:type="dxa"/>
-          </w:tcPr>
-          <w:p>
-            <w:pPr>
-              <w:spacing w:before="0" w:after="0" w:line="240" w:lineRule="auto"/>
-              <w:ind w:left="0" w:firstLine="0"/>
-              <w:suppressAutoHyphens/>
-            </w:pPr>
-            <w:r>
-              <w:rPr>
-                <w:rFonts w:ascii="Calibri" w:hAnsi="Calibri"/>
-                <w:b w:val="0"/>
-                <w:i w:val="0"/>
-                <w:sz w:val="24"/>
-                <w:noProof/>
-              </w:rPr>
-              <w:t>POST with secondary_payer_id or any Phase 2 deferred field returns 400 identifying the unsupported field name</w:t>
+        <w:tc>
+          <w:tcPr>
+            <w:tcW w:type="dxa" w:w="2856"/>
+          </w:tcPr>
+          <w:p>
+            <w:r>
+              <w:t>test_tc_4_8_audit_log_phi_write_and_phi_disclose_events</w:t>
+            </w:r>
+          </w:p>
+        </w:tc>
+        <w:tc>
+          <w:tcPr>
+            <w:tcW w:type="dxa" w:w="252"/>
+          </w:tcPr>
+          <w:p>
+            <w:r>
+              <w:t>TC-4.8</w:t>
+            </w:r>
+          </w:p>
+        </w:tc>
+        <w:tc>
+          <w:tcPr>
+            <w:tcW w:type="dxa" w:w="588"/>
+          </w:tcPr>
+          <w:p>
+            <w:r>
+              <w:t>Business Rules</w:t>
+            </w:r>
+          </w:p>
+        </w:tc>
+        <w:tc>
+          <w:tcPr>
+            <w:tcW w:type="dxa" w:w="5375"/>
+          </w:tcPr>
+          <w:p>
+            <w:r>
+              <w:t>POST produces PHI_WRITE audit event with all 11 mandatory fields non-null and no PHI values; PATCH draft-to-submitted produces PHI_DISCLOSE; GET /audit-logs returns both events</w:t>
             </w:r>
           </w:p>
         </w:tc>
       </w:tr>
       <w:tr>
-        <w:trPr>
-          <w:cantSplit w:val="true"/>
-        </w:trPr>
-        <w:tc>
-          <w:tcPr>
-            <w:tcW w:w="2856" w:type="dxa"/>
-          </w:tcPr>
-          <w:p>
-            <w:pPr>
-              <w:spacing w:before="0" w:after="0" w:line="240" w:lineRule="auto"/>
-              <w:ind w:left="0" w:firstLine="0"/>
-              <w:suppressAutoHyphens/>
-            </w:pPr>
-            <w:r>
-              <w:rPr>
-                <w:rFonts w:ascii="Calibri" w:hAnsi="Calibri"/>
-                <w:b w:val="0"/>
-                <w:i w:val="0"/>
-                <w:sz w:val="24"/>
-                <w:noProof/>
-              </w:rPr>
-              <w:t>test_4_9_optimistic_locking_version_conflict_returns_409</w:t>
-            </w:r>
-          </w:p>
-        </w:tc>
-        <w:tc>
-          <w:tcPr>
-            <w:tcW w:w="252" w:type="dxa"/>
-          </w:tcPr>
-          <w:p>
-            <w:pPr>
-              <w:spacing w:before="0" w:after="0" w:line="240" w:lineRule="auto"/>
-              <w:ind w:left="0" w:firstLine="0"/>
-              <w:suppressAutoHyphens/>
-            </w:pPr>
-            <w:r>
-              <w:rPr>
-                <w:rFonts w:ascii="Calibri" w:hAnsi="Calibri"/>
-                <w:b w:val="0"/>
-                <w:i w:val="0"/>
-                <w:sz w:val="24"/>
-                <w:noProof/>
-              </w:rPr>
-              <w:t>4.9</w:t>
-            </w:r>
-          </w:p>
-        </w:tc>
-        <w:tc>
-          <w:tcPr>
-            <w:tcW w:w="588" w:type="dxa"/>
-          </w:tcPr>
-          <w:p>
-            <w:pPr>
-              <w:spacing w:before="0" w:after="0" w:line="240" w:lineRule="auto"/>
-              <w:ind w:left="0" w:firstLine="0"/>
-              <w:suppressAutoHyphens/>
-            </w:pPr>
-            <w:r>
-              <w:rPr>
-                <w:rFonts w:ascii="Calibri" w:hAnsi="Calibri"/>
-                <w:b w:val="0"/>
-                <w:i w:val="0"/>
-                <w:sz w:val="24"/>
-                <w:noProof/>
-              </w:rPr>
+        <w:tc>
+          <w:tcPr>
+            <w:tcW w:type="dxa" w:w="2856"/>
+          </w:tcPr>
+          <w:p>
+            <w:r>
+              <w:t>test_tc_4_9_empty_attendance_ids_and_server_calculates_units_billed</w:t>
+            </w:r>
+          </w:p>
+        </w:tc>
+        <w:tc>
+          <w:tcPr>
+            <w:tcW w:type="dxa" w:w="252"/>
+          </w:tcPr>
+          <w:p>
+            <w:r>
+              <w:t>TC-4.9</w:t>
+            </w:r>
+          </w:p>
+        </w:tc>
+        <w:tc>
+          <w:tcPr>
+            <w:tcW w:type="dxa" w:w="588"/>
+          </w:tcPr>
+          <w:p>
+            <w:r>
               <w:t>Business Rules</w:t>
             </w:r>
           </w:p>
         </w:tc>
         <w:tc>
           <w:tcPr>
-            <w:tcW w:w="5375" w:type="dxa"/>
-          </w:tcPr>
-          <w:p>
-            <w:pPr>
-              <w:spacing w:before="0" w:after="0" w:line="240" w:lineRule="auto"/>
-              <w:ind w:left="0" w:firstLine="0"/>
-              <w:suppressAutoHyphens/>
-            </w:pPr>
-            <w:r>
-              <w:rPr>
-                <w:rFonts w:ascii="Calibri" w:hAnsi="Calibri"/>
-                <w:b w:val="0"/>
-                <w:i w:val="0"/>
-                <w:sz w:val="24"/>
-                <w:noProof/>
-              </w:rPr>
-              <w:t>PATCH draft with stale version returns 409 CLAIM_VERSION_CONFLICT; PATCH submitted returns 422 before version check</w:t>
+            <w:tcW w:type="dxa" w:w="5375"/>
+          </w:tcPr>
+          <w:p>
+            <w:r>
+              <w:t>POST with empty attendance_ids returns 422 CLAIM_NO_ATTENDANCE_RECORDS; server calculates units_billed from authorized_units_consumed; caller-supplied value ignored</w:t>
+            </w:r>
+          </w:p>
+        </w:tc>
+      </w:tr>
+      <w:tr>
+        <w:tc>
+          <w:tcPr>
+            <w:tcW w:type="dxa" w:w="2856"/>
+          </w:tcPr>
+          <w:p>
+            <w:r>
+              <w:t>test_tc_4_10_phase2_fields_rejected_with_400</w:t>
+            </w:r>
+          </w:p>
+        </w:tc>
+        <w:tc>
+          <w:tcPr>
+            <w:tcW w:type="dxa" w:w="252"/>
+          </w:tcPr>
+          <w:p>
+            <w:r>
+              <w:t>TC-4.10</w:t>
+            </w:r>
+          </w:p>
+        </w:tc>
+        <w:tc>
+          <w:tcPr>
+            <w:tcW w:type="dxa" w:w="588"/>
+          </w:tcPr>
+          <w:p>
+            <w:r>
+              <w:t>API</w:t>
+            </w:r>
+          </w:p>
+        </w:tc>
+        <w:tc>
+          <w:tcPr>
+            <w:tcW w:type="dxa" w:w="5375"/>
+          </w:tcPr>
+          <w:p>
+            <w:r>
+              <w:t>POST with secondary_payer_id, mco_id, or prior_authorization_number each returns 400; DB no claim created in any case</w:t>
+            </w:r>
+          </w:p>
+        </w:tc>
+      </w:tr>
+      <w:tr>
+        <w:tc>
+          <w:tcPr>
+            <w:tcW w:type="dxa" w:w="2856"/>
+          </w:tcPr>
+          <w:p>
+            <w:r>
+              <w:t>test_tc_4_11_optimistic_locking_version_conflict_returns_409</w:t>
+            </w:r>
+          </w:p>
+        </w:tc>
+        <w:tc>
+          <w:tcPr>
+            <w:tcW w:type="dxa" w:w="252"/>
+          </w:tcPr>
+          <w:p>
+            <w:r>
+              <w:t>TC-4.11</w:t>
+            </w:r>
+          </w:p>
+        </w:tc>
+        <w:tc>
+          <w:tcPr>
+            <w:tcW w:type="dxa" w:w="588"/>
+          </w:tcPr>
+          <w:p>
+            <w:r>
+              <w:t>Business Rules</w:t>
+            </w:r>
+          </w:p>
+        </w:tc>
+        <w:tc>
+          <w:tcPr>
+            <w:tcW w:type="dxa" w:w="5375"/>
+          </w:tcPr>
+          <w:p>
+            <w:r>
+              <w:t>PATCH draft with stale version returns 409 CLAIM_VERSION_CONFLICT; submitted returns 422 before version check; correct version returns 200; DB version incremented</w:t>
+            </w:r>
+          </w:p>
+        </w:tc>
+      </w:tr>
+      <w:tr>
+        <w:tc>
+          <w:tcPr>
+            <w:tcW w:type="dxa" w:w="2856"/>
+          </w:tcPr>
+          <w:p>
+            <w:r>
+              <w:t>test_tc_4_12_cross_tenant_attendance_reference_rejected</w:t>
+            </w:r>
+          </w:p>
+        </w:tc>
+        <w:tc>
+          <w:tcPr>
+            <w:tcW w:type="dxa" w:w="252"/>
+          </w:tcPr>
+          <w:p>
+            <w:r>
+              <w:t>TC-4.12</w:t>
+            </w:r>
+          </w:p>
+        </w:tc>
+        <w:tc>
+          <w:tcPr>
+            <w:tcW w:type="dxa" w:w="588"/>
+          </w:tcPr>
+          <w:p>
+            <w:r>
+              <w:t>API</w:t>
+            </w:r>
+          </w:p>
+        </w:tc>
+        <w:tc>
+          <w:tcPr>
+            <w:tcW w:type="dxa" w:w="5375"/>
+          </w:tcPr>
+          <w:p>
+            <w:r>
+              <w:t>POST referencing attendance from different tenant returns 422 or 404; DB no cross-tenant claim created</w:t>
+            </w:r>
+          </w:p>
+        </w:tc>
+      </w:tr>
+      <w:tr>
+        <w:tc>
+          <w:tcPr>
+            <w:tcW w:type="dxa" w:w="2856"/>
+          </w:tcPr>
+          <w:p>
+            <w:r>
+              <w:t>test_tc_4_13_already_billed_attendance_cannot_be_reclaimed</w:t>
+            </w:r>
+          </w:p>
+        </w:tc>
+        <w:tc>
+          <w:tcPr>
+            <w:tcW w:type="dxa" w:w="252"/>
+          </w:tcPr>
+          <w:p>
+            <w:r>
+              <w:t>TC-4.13</w:t>
+            </w:r>
+          </w:p>
+        </w:tc>
+        <w:tc>
+          <w:tcPr>
+            <w:tcW w:type="dxa" w:w="588"/>
+          </w:tcPr>
+          <w:p>
+            <w:r>
+              <w:t>API</w:t>
+            </w:r>
+          </w:p>
+        </w:tc>
+        <w:tc>
+          <w:tcPr>
+            <w:tcW w:type="dxa" w:w="5375"/>
+          </w:tcPr>
+          <w:p>
+            <w:r>
+              <w:t>POST referencing attendance with status=billed returns 422 ATTENDANCE_NOT_CONFIRMED; DB no duplicate claim created</w:t>
+            </w:r>
+          </w:p>
+        </w:tc>
+      </w:tr>
+      <w:tr>
+        <w:tc>
+          <w:tcPr>
+            <w:tcW w:type="dxa" w:w="2856"/>
+          </w:tcPr>
+          <w:p>
+            <w:r>
+              <w:t>test_tc_4_14_get_nonexistent_claim_returns_404</w:t>
+            </w:r>
+          </w:p>
+        </w:tc>
+        <w:tc>
+          <w:tcPr>
+            <w:tcW w:type="dxa" w:w="252"/>
+          </w:tcPr>
+          <w:p>
+            <w:r>
+              <w:t>TC-4.14</w:t>
+            </w:r>
+          </w:p>
+        </w:tc>
+        <w:tc>
+          <w:tcPr>
+            <w:tcW w:type="dxa" w:w="588"/>
+          </w:tcPr>
+          <w:p>
+            <w:r>
+              <w:t>API</w:t>
+            </w:r>
+          </w:p>
+        </w:tc>
+        <w:tc>
+          <w:tcPr>
+            <w:tcW w:type="dxa" w:w="5375"/>
+          </w:tcPr>
+          <w:p>
+            <w:r>
+              <w:t>GET /claims with non-existent claim_id returns 404 NOT_FOUND; response body contains error_code and claim_id</w:t>
+            </w:r>
+          </w:p>
+        </w:tc>
+      </w:tr>
+      <w:tr>
+        <w:tc>
+          <w:tcPr>
+            <w:tcW w:type="dxa" w:w="2856"/>
+          </w:tcPr>
+          <w:p>
+            <w:r>
+              <w:t>test_tc_4_15_paid_claim_fully_immutable</w:t>
+            </w:r>
+          </w:p>
+        </w:tc>
+        <w:tc>
+          <w:tcPr>
+            <w:tcW w:type="dxa" w:w="252"/>
+          </w:tcPr>
+          <w:p>
+            <w:r>
+              <w:t>TC-4.15</w:t>
+            </w:r>
+          </w:p>
+        </w:tc>
+        <w:tc>
+          <w:tcPr>
+            <w:tcW w:type="dxa" w:w="588"/>
+          </w:tcPr>
+          <w:p>
+            <w:r>
+              <w:t>Business Rules</w:t>
+            </w:r>
+          </w:p>
+        </w:tc>
+        <w:tc>
+          <w:tcPr>
+            <w:tcW w:type="dxa" w:w="5375"/>
+          </w:tcPr>
+          <w:p>
+            <w:r>
+              <w:t>PATCH paid claim any field returns 422 CLAIM_STATUS_IMMUTABLE; DB claim_status, version, and all fields unchanged after all rejected attempts</w:t>
             </w:r>
           </w:p>
         </w:tc>
@@ -11629,6 +11447,8 @@
                 <w:sz w:val="24"/>
                 <w:noProof/>
               </w:rPr>
+            </w:r>
+            <w:r>
               <w:t>Claim</w:t>
             </w:r>
           </w:p>
@@ -11651,7 +11471,9 @@
                 <w:sz w:val="24"/>
                 <w:noProof/>
               </w:rPr>
-              <w:t>4.1 - 4.9</w:t>
+            </w:r>
+            <w:r>
+              <w:t>TC-4.1 - TC-4.15</w:t>
             </w:r>
           </w:p>
         </w:tc>
@@ -11673,7 +11495,9 @@
                 <w:sz w:val="24"/>
                 <w:noProof/>
               </w:rPr>
-              <w:t>9</w:t>
+            </w:r>
+            <w:r>
+              <w:t>15</w:t>
             </w:r>
           </w:p>
         </w:tc>
@@ -11695,6 +11519,8 @@
                 <w:sz w:val="24"/>
                 <w:noProof/>
               </w:rPr>
+            </w:r>
+            <w:r>
               <w:t>0</w:t>
             </w:r>
           </w:p>
@@ -11930,7 +11756,12 @@
                 <w:sz w:val="24"/>
                 <w:noProof/>
               </w:rPr>
-              <w:t>64</w:t>
+            </w:r>
+            <w:r>
+              <w:rPr>
+                <w:b/>
+              </w:rPr>
+              <w:t>70</w:t>
             </w:r>
           </w:p>
         </w:tc>
@@ -11952,7 +11783,12 @@
                 <w:sz w:val="24"/>
                 <w:noProof/>
               </w:rPr>
-              <w:t>64</w:t>
+            </w:r>
+            <w:r>
+              <w:rPr>
+                <w:b/>
+              </w:rPr>
+              <w:t>70</w:t>
             </w:r>
           </w:p>
         </w:tc>
@@ -12132,7 +11968,9 @@
                 <w:sz w:val="24"/>
                 <w:noProof/>
               </w:rPr>
-              <w:t>48</w:t>
+            </w:r>
+            <w:r>
+              <w:t>51</w:t>
             </w:r>
           </w:p>
         </w:tc>
@@ -12203,7 +12041,9 @@
                 <w:sz w:val="24"/>
                 <w:noProof/>
               </w:rPr>
-              <w:t>40</w:t>
+            </w:r>
+            <w:r>
+              <w:t>43</w:t>
             </w:r>
           </w:p>
         </w:tc>
@@ -12345,7 +12185,12 @@
                 <w:sz w:val="24"/>
                 <w:noProof/>
               </w:rPr>
-              <w:t>97</w:t>
+            </w:r>
+            <w:r>
+              <w:rPr>
+                <w:b/>
+              </w:rPr>
+              <w:t>103</w:t>
             </w:r>
           </w:p>
         </w:tc>
@@ -12821,7 +12666,9 @@
                 <w:sz w:val="24"/>
                 <w:noProof/>
               </w:rPr>
-              <w:t>6</w:t>
+            </w:r>
+            <w:r>
+              <w:t>8</w:t>
             </w:r>
           </w:p>
         </w:tc>
@@ -12941,7 +12788,9 @@
                 <w:sz w:val="24"/>
                 <w:noProof/>
               </w:rPr>
-              <w:t>test_tenant_isolation.py</w:t>
+            </w:r>
+            <w:r>
+              <w:t>test_tenant_isolation.py, test_claim.py</w:t>
             </w:r>
           </w:p>
         </w:tc>
@@ -12963,7 +12812,9 @@
                 <w:sz w:val="24"/>
                 <w:noProof/>
               </w:rPr>
-              <w:t>7</w:t>
+            </w:r>
+            <w:r>
+              <w:t>8</w:t>
             </w:r>
           </w:p>
         </w:tc>
@@ -13034,6 +12885,134 @@
                 <w:sz w:val="24"/>
                 <w:noProof/>
               </w:rPr>
+              <w:t>1</w:t>
+            </w:r>
+          </w:p>
+        </w:tc>
+      </w:tr>
+      <w:tr>
+        <w:tc>
+          <w:tcPr>
+            <w:tcW w:type="dxa" w:w="1988"/>
+          </w:tcPr>
+          <w:p>
+            <w:r>
+              <w:t>Attendance integrity</w:t>
+            </w:r>
+          </w:p>
+        </w:tc>
+        <w:tc>
+          <w:tcPr>
+            <w:tcW w:type="dxa" w:w="6516"/>
+          </w:tcPr>
+          <w:p>
+            <w:r>
+              <w:t>test_claim.py</w:t>
+            </w:r>
+          </w:p>
+        </w:tc>
+        <w:tc>
+          <w:tcPr>
+            <w:tcW w:type="dxa" w:w="567"/>
+          </w:tcPr>
+          <w:p>
+            <w:r>
+              <w:t>3</w:t>
+            </w:r>
+          </w:p>
+        </w:tc>
+      </w:tr>
+      <w:tr>
+        <w:tc>
+          <w:tcPr>
+            <w:tcW w:type="dxa" w:w="1988"/>
+          </w:tcPr>
+          <w:p>
+            <w:r>
+              <w:t>Mandatory fields</w:t>
+            </w:r>
+          </w:p>
+        </w:tc>
+        <w:tc>
+          <w:tcPr>
+            <w:tcW w:type="dxa" w:w="6516"/>
+          </w:tcPr>
+          <w:p>
+            <w:r>
+              <w:t>test_claim.py</w:t>
+            </w:r>
+          </w:p>
+        </w:tc>
+        <w:tc>
+          <w:tcPr>
+            <w:tcW w:type="dxa" w:w="567"/>
+          </w:tcPr>
+          <w:p>
+            <w:r>
+              <w:t>1</w:t>
+            </w:r>
+          </w:p>
+        </w:tc>
+      </w:tr>
+      <w:tr>
+        <w:tc>
+          <w:tcPr>
+            <w:tcW w:type="dxa" w:w="1988"/>
+          </w:tcPr>
+          <w:p>
+            <w:r>
+              <w:t>Billing units server-calculated</w:t>
+            </w:r>
+          </w:p>
+        </w:tc>
+        <w:tc>
+          <w:tcPr>
+            <w:tcW w:type="dxa" w:w="6516"/>
+          </w:tcPr>
+          <w:p>
+            <w:r>
+              <w:t>test_claim.py</w:t>
+            </w:r>
+          </w:p>
+        </w:tc>
+        <w:tc>
+          <w:tcPr>
+            <w:tcW w:type="dxa" w:w="567"/>
+          </w:tcPr>
+          <w:p>
+            <w:r>
+              <w:t>1</w:t>
+            </w:r>
+          </w:p>
+        </w:tc>
+      </w:tr>
+      <w:tr>
+        <w:tc>
+          <w:tcPr>
+            <w:tcW w:type="dxa" w:w="1988"/>
+          </w:tcPr>
+          <w:p>
+            <w:r>
+              <w:t>Not found</w:t>
+            </w:r>
+          </w:p>
+        </w:tc>
+        <w:tc>
+          <w:tcPr>
+            <w:tcW w:type="dxa" w:w="6516"/>
+          </w:tcPr>
+          <w:p>
+            <w:r>
+              <w:t>test_claim.py</w:t>
+            </w:r>
+          </w:p>
+        </w:tc>
+        <w:tc>
+          <w:tcPr>
+            <w:tcW w:type="dxa" w:w="567"/>
+          </w:tcPr>
+          <w:p>
+            <w:r>
               <w:t>1</w:t>
             </w:r>
           </w:p>

</xml_diff>